<commit_message>
Simplificamos Grano a sus cuatro secciones principales
</commit_message>
<xml_diff>
--- a/docs/Anexo 4 - ERS Grano.docx
+++ b/docs/Anexo 4 - ERS Grano.docx
@@ -3500,7 +3500,7 @@
               </w:rPr>
             </w:pPr>
             <w:r>
-              <w:t>Brian Bravo y Matías Guerra</w:t>
+              <w:t>Equipo del proyecto</w:t>
             </w:r>
           </w:p>
         </w:tc>
@@ -3519,7 +3519,7 @@
               </w:rPr>
             </w:pPr>
             <w:r>
-              <w:t>Propuesta inicial de Grano. Maqueta con HTML, CSS y Bootstrap.</w:t>
+              <w:t>Propuesta inicial de Grano y su catálogo de productos.</w:t>
             </w:r>
           </w:p>
         </w:tc>
@@ -3581,7 +3581,7 @@
               </w:rPr>
             </w:pPr>
             <w:r>
-              <w:t>Brian Bravo y Matías Guerra</w:t>
+              <w:t>Equipo del proyecto</w:t>
             </w:r>
           </w:p>
         </w:tc>
@@ -4005,7 +4005,7 @@
               </w:rPr>
             </w:pPr>
             <w:r>
-              <w:t>Brian Bravo y Matías Guerra</w:t>
+              <w:t>Equipo del proyecto</w:t>
             </w:r>
           </w:p>
         </w:tc>
@@ -4099,7 +4099,7 @@
         <w:spacing w:after="100"/>
       </w:pPr>
       <w:r>
-        <w:t>Grano es una tienda de café de especialidad que estamos desarrollando para FullStack II. En esta versión nos concentramos en las pantallas y en que se pueda recorrer el sitio de principio a fin. Este documento explica qué incluye la maqueta y qué dejamos para las siguientes entregas.</w:t>
+        <w:t>Grano es una tienda de café de especialidad pensada para quienes disfrutan preparar una buena taza en casa. Esta especificación ordena la idea, el alcance y las características principales del sitio.</w:t>
       </w:r>
     </w:p>
     <w:p>
@@ -4132,7 +4132,7 @@
         <w:spacing w:after="100"/>
       </w:pPr>
       <w:r>
-        <w:t>Preparamos esta ERS para ordenar lo que vamos a construir y tener una misma referencia al revisar el proyecto. Está dirigida a nosotros, Brian Bravo y Matías Guerra, y al docente que revisará la propuesta. La acompañamos con dos planillas que contienen 10 requisitos funcionales y 10 no funcionales.</w:t>
+        <w:t>El propósito de esta ERS es explicar cómo funcionará Grano y qué debe considerar el sitio para entregar una experiencia clara a sus visitantes. El documento sirve como guía para diseñar, revisar y ampliar la solución.</w:t>
       </w:r>
     </w:p>
     <w:p>
@@ -4165,7 +4165,7 @@
         <w:spacing w:after="100"/>
       </w:pPr>
       <w:r>
-        <w:t>El sistema se llama Grano. La propuesta reúne café en grano, métodos de preparación y accesorios para quienes disfrutan preparar café en casa. Conservamos la idea visual del proyecto anterior, pero simplificamos su implementación.</w:t>
+        <w:t>El sistema se llama Grano. La propuesta reúne café en grano, métodos de preparación y accesorios para quienes disfrutan preparar una taza en casa. La primera versión se enfoca en presentar la tienda y permitir un recorrido simple por sus secciones.</w:t>
       </w:r>
     </w:p>
     <w:p>
@@ -4174,7 +4174,7 @@
         <w:spacing w:after="100"/>
       </w:pPr>
       <w:r>
-        <w:t>El alcance de esta versión es una maqueta navegable con HTML, CSS y Bootstrap. Incluye catálogo, fichas, bolsa vacía, pantallas de cuenta, contacto, diario y administración. Los enlaces funcionan y los campos se pueden completar como muestra, pero no se realizan compras, inicios de sesión ni cambios de información.</w:t>
+        <w:t>El alcance considera una tienda con inicio, catálogo, fichas de productos, sección Nosotros y contacto. También se contempla una bolsa y pantallas de cuenta como parte de la estructura general. Las operaciones de compra, autenticación y administración se incorporarán en una etapa posterior.</w:t>
       </w:r>
     </w:p>
     <w:p>
@@ -4207,7 +4207,7 @@
         <w:spacing w:after="100"/>
       </w:pPr>
       <w:r>
-        <w:t>ERS significa Especificación de Requisitos de Software. RF identifica un requisito funcional y RNF uno no funcional. HTML define la estructura de las páginas y CSS su presentación. Bootstrap es la biblioteca de estilos que usamos para ordenar los componentes.</w:t>
+        <w:t>ERS significa Especificación de Requisitos de Software. RF identifica un requisito funcional y RNF uno no funcional. Un producto corresponde a un café, método o accesorio disponible en la tienda. CLP corresponde a pesos chilenos.</w:t>
       </w:r>
     </w:p>
     <w:p>
@@ -4216,7 +4216,7 @@
         <w:spacing w:after="100"/>
       </w:pPr>
       <w:r>
-        <w:t>Una maqueta navegable permite visitar las pantallas sin ejecutar las operaciones de una tienda real. CLP corresponde a pesos chilenos. En este documento, administrador y cliente describen las vistas previstas, no permisos implementados.</w:t>
+        <w:t>Una tienda de especialidad reúne productos seleccionados y los presenta con información de origen, preparación y precio. En este documento, visitante y administrador describen los perfiles que se considerarán para el crecimiento del sistema.</w:t>
       </w:r>
     </w:p>
     <w:p>
@@ -4249,7 +4249,7 @@
         <w:spacing w:after="100"/>
       </w:pPr>
       <w:r>
-        <w:t>Usamos como referencia los anexos 1 y 4 y la pauta DSY1104 Evaluación Parcial 1 EE EP Estudiante. Los anexos 2 y 3 sirven de base para las planillas de requisitos.</w:t>
+        <w:t>La propuesta se inspira en el funcionamiento habitual de una tienda de café de especialidad: catálogo organizado, información clara de cada producto y un canal de contacto para orientar al visitante.</w:t>
       </w:r>
     </w:p>
     <w:p>
@@ -4258,7 +4258,7 @@
         <w:spacing w:after="100"/>
       </w:pPr>
       <w:r>
-        <w:t>La pauta original solicita JavaScript, validaciones y carrito funcional. Esta versión tiene un alcance más acotado por decisión de la propuesta actual: solo HTML, CSS y Bootstrap. Por eso no presentamos esas funciones como terminadas ni afirmamos que la maqueta cubra toda la rúbrica.</w:t>
+        <w:t>Las funciones de compra, autenticación y gestión de información se consideran parte de una etapa posterior. Esta primera propuesta prioriza la organización del contenido y la navegación para validar la idea de la tienda.</w:t>
       </w:r>
     </w:p>
     <w:p>
@@ -4267,7 +4267,7 @@
         <w:spacing w:after="100"/>
       </w:pPr>
       <w:r>
-        <w:t>Consultamos la documentación oficial de Bootstrap 5.3: https://getbootstrap.com/docs/5.3/getting-started/introduction/. El código se guarda en https://github.com/PelaoKratos/Grano-FullStack2.</w:t>
+        <w:t>La propuesta toma como referencia la presentación de tiendas de café, la información habitual de productos y las necesidades de una persona que busca preparar café en casa.</w:t>
       </w:r>
     </w:p>
     <w:p>
@@ -4300,7 +4300,7 @@
         <w:spacing w:after="100"/>
       </w:pPr>
       <w:r>
-        <w:t>Primero describimos la idea de Grano y sus límites. Luego explicamos cómo se organiza la tienda, quiénes la usarían y qué herramientas necesita. Finalmente detallamos los requisitos con los mismos códigos de las planillas para poder relacionar el documento con las pantallas.</w:t>
+        <w:t>Primero se presenta la idea general y el alcance. Luego se describen los usuarios, las secciones de la tienda, las interfaces y los requisitos que debe considerar el sistema.</w:t>
       </w:r>
     </w:p>
     <w:p>
@@ -4334,7 +4334,7 @@
         <w:spacing w:after="100"/>
       </w:pPr>
       <w:r>
-        <w:t>La maqueta presenta una tienda pequeña, con seis productos de ejemplo. Mantuvimos los tonos verde y crema y las ilustraciones del proyecto anterior. La navegación se divide en una parte pública y un panel administrativo de demostración.</w:t>
+        <w:t>Grano presenta una colección de cafés, métodos y accesorios con una identidad cálida y sencilla. La navegación principal se organiza en Inicio, Nuestro café, Nosotros y Contacto, para que el visitante encuentre rápidamente la información que busca.</w:t>
       </w:r>
     </w:p>
     <w:p>
@@ -4367,7 +4367,7 @@
         <w:spacing w:after="100"/>
       </w:pPr>
       <w:r>
-        <w:t>Grano funciona de manera independiente como un conjunto de archivos HTML. No necesita conectarse a otra aplicación ni a una base de datos. Los estilos de Bootstrap están guardados en el proyecto, junto con las imágenes y el video, para que la presentación no dependa de internet.</w:t>
+        <w:t>Grano funciona como una tienda independiente. La información de productos, sus imágenes y el contenido de cada sección deben mantenerse disponibles para el visitante.</w:t>
       </w:r>
     </w:p>
     <w:p>
@@ -4400,7 +4400,7 @@
         <w:spacing w:after="100"/>
       </w:pPr>
       <w:r>
-        <w:t>La tienda permite mirar la colección, consultar cada ficha, leer dos artículos y conocer el proyecto. También presenta cómo se verían el registro, el ingreso, el contacto y la bolsa. El panel administrativo muestra listados, formularios y una orden de ejemplo.</w:t>
+        <w:t>La tienda permite conocer la propuesta, revisar el catálogo, consultar la ficha de cada producto y comunicarse mediante el formulario de contacto. En futuras etapas se podrán añadir cuentas, compras y herramientas para administrar el catálogo.</w:t>
       </w:r>
     </w:p>
     <w:p>
@@ -4409,7 +4409,7 @@
         <w:spacing w:after="100"/>
       </w:pPr>
       <w:r>
-        <w:t>El recorrido principal es Inicio → Colección → Detalle → Colección. Desde el pie se entra a Administración, donde se puede ir a Productos, Usuarios, Órdenes y Mensajes. Los formularios regresan a sus respectivos listados mediante enlaces.</w:t>
+        <w:t>El recorrido principal comienza en Inicio, continúa en Nuestro café y permite abrir el detalle de cada producto. Nosotros explica la propuesta y Contacto ofrece un canal para realizar consultas.</w:t>
       </w:r>
     </w:p>
     <w:p>
@@ -4442,7 +4442,7 @@
         <w:spacing w:after="100"/>
       </w:pPr>
       <w:r>
-        <w:t>El visitante necesita conocimientos básicos de navegación: abrir enlaces, desplazarse por una página y reconocer campos de formulario. Puede revisar todo el catálogo sin crear una cuenta.</w:t>
+        <w:t>El visitante necesita conocimientos básicos de navegación para recorrer el catálogo, leer las fichas y enviar una consulta. La información debe entenderse sin conocimientos técnicos.</w:t>
       </w:r>
     </w:p>
     <w:p>
@@ -4451,7 +4451,7 @@
         <w:spacing w:after="100"/>
       </w:pPr>
       <w:r>
-        <w:t>En una versión futura, el cliente usaría la tienda y el administrador gestionaría productos y usuarios. También se contempla un vendedor que consulte productos y órdenes. En esta entrega no hay autenticación ni control de roles: el panel tiene acceso libre porque solo contiene datos de muestra.</w:t>
+        <w:t>El cliente podrá consultar productos y realizar compras cuando se habiliten esas funciones. El administrador podrá mantener el catálogo y revisar las solicitudes recibidas. Cada perfil tendrá permisos definidos cuando se implemente la lógica del sistema.</w:t>
       </w:r>
     </w:p>
     <w:p>
@@ -4484,7 +4484,7 @@
         <w:spacing w:after="100"/>
       </w:pPr>
       <w:r>
-        <w:t>Trabajamos únicamente con HTML, CSS y el CSS de Bootstrap 5.3.8. No usamos JavaScript, ni siquiera el paquete de componentes de Bootstrap. Por eso dejamos los menús visibles y usamos enlaces normales en lugar de menús desplegables.</w:t>
+        <w:t>La propuesta debe conservar una estructura clara, una navegación sencilla y una presentación que funcione en pantallas de escritorio y teléfonos. El contenido de los productos debe mantenerse ordenado para facilitar futuras actualizaciones.</w:t>
       </w:r>
     </w:p>
     <w:p>
@@ -4493,7 +4493,7 @@
         <w:spacing w:after="100"/>
       </w:pPr>
       <w:r>
-        <w:t>Los botones para comprar, enviar, guardar o iniciar sesión están deshabilitados. Los precios, productos y registros sirven para explicar el diseño. No se deben interpretar como stock real, pedidos recibidos o usuarios registrados.</w:t>
+        <w:t>Las acciones de compra, inicio de sesión y gestión de datos se habilitarán cuando se implemente la lógica correspondiente. La primera versión se concentra en validar la distribución y el contenido de las páginas.</w:t>
       </w:r>
     </w:p>
     <w:p>
@@ -4526,7 +4526,7 @@
         <w:spacing w:after="100"/>
       </w:pPr>
       <w:r>
-        <w:t>Suponemos que la revisión se hará con un navegador actualizado y que se mantendrá la estructura de carpetas. El sitio puede abrirse directamente desde index.html. Git y la conexión a internet solo son necesarios para subir cambios al repositorio.</w:t>
+        <w:t>Se supone que el visitante utilizará un navegador actualizado y que la información de productos será revisada antes de publicarse. También se considera que la tienda crecerá por etapas y que sus requisitos podrán ajustarse según las necesidades del negocio.</w:t>
       </w:r>
     </w:p>
     <w:p>
@@ -4535,7 +4535,7 @@
         <w:spacing w:after="100"/>
       </w:pPr>
       <w:r>
-        <w:t>Si se solicita incorporar las funciones de JavaScript de la pauta original, tendremos que ampliar este alcance y actualizar los requisitos antes de tratarlas como implementadas.</w:t>
+        <w:t>El alcance podrá ampliarse con compras, cuentas, pagos, gestión de stock y seguimiento de solicitudes cuando la propuesta de negocio lo requiera.</w:t>
       </w:r>
     </w:p>
     <w:p>
@@ -4569,7 +4569,7 @@
         <w:spacing w:after="100"/>
       </w:pPr>
       <w:r>
-        <w:t>Más adelante queremos agregar validación de formularios, manejo del carrito, registro e inicio de sesión, almacenamiento de productos y control de permisos. También quedarían pendientes las opciones de región y comuna dependientes entre sí. En la maqueta actual son ejemplos fijos.</w:t>
+        <w:t>En una siguiente etapa se podrán incorporar el carrito, las cuentas de clientes, los pagos, la actualización del catálogo, el stock y el seguimiento de pedidos. Estas mejoras dependerán de las prioridades definidas para la tienda.</w:t>
       </w:r>
     </w:p>
     <w:p>
@@ -4602,7 +4602,7 @@
         <w:spacing w:after="100"/>
       </w:pPr>
       <w:r>
-        <w:t>Los requisitos de esta versión describen comportamientos visibles y condiciones que podemos revisar en la maqueta. Usamos los códigos RF-01 a RF-10 y RNF-01 a RNF-10 en las dos planillas y en este documento. Las operaciones que necesitan lógica o almacenamiento quedan fuera del alcance actual.</w:t>
+        <w:t>Los requisitos de esta versión describen comportamientos visibles y condiciones que podemos revisar en la tienda. Usamos códigos RF y RNF para mantener una referencia ordenada entre los requisitos y las secciones del sistema.</w:t>
       </w:r>
     </w:p>
     <w:p>
@@ -4707,7 +4707,7 @@
         <w:spacing w:after="100"/>
       </w:pPr>
       <w:r>
-        <w:t>No se requieren dispositivos especiales. La tienda se puede revisar con teclado y mouse o con una pantalla táctil. La maquetación se comprueba en anchos de 390 y 1440 píxeles.</w:t>
+        <w:t>La tienda se puede revisar con teclado y mouse o con una pantalla táctil. La presentación debe conservarse ordenada en distintos tamaños de pantalla.</w:t>
       </w:r>
     </w:p>
     <w:p>
@@ -4740,7 +4740,7 @@
         <w:spacing w:after="100"/>
       </w:pPr>
       <w:r>
-        <w:t>La interfaz utiliza HTML5, una hoja CSS propia y Bootstrap 5.3.8 en formato CSS local. Para editar se puede usar Visual Studio Code y para controlar versiones, Git y GitHub. No se necesita instalar paquetes, compilar el proyecto ni ejecutar un servidor.</w:t>
+        <w:t>La interfaz se organiza con páginas web y estilos propios. La solución debe ser fácil de mantener y trasladar a otro equipo de trabajo.</w:t>
       </w:r>
     </w:p>
     <w:p>
@@ -4773,7 +4773,7 @@
         <w:spacing w:after="100"/>
       </w:pPr>
       <w:r>
-        <w:t>No hay integración con servicios externos. Las páginas y los recursos se enlazan mediante rutas relativas. GitHub se utiliza para compartir el código; la navegación local no depende de esa conexión.</w:t>
+        <w:t>Las páginas y los recursos se enlazan de forma interna. Las futuras integraciones deberán definirse según las necesidades de la tienda.</w:t>
       </w:r>
     </w:p>
     <w:p>
@@ -4808,7 +4808,7 @@
         <w:spacing w:after="100"/>
       </w:pPr>
       <w:r>
-        <w:t>Los siguientes requisitos corresponden a la navegación y a la presentación de las pantallas. Cuando hablamos de formularios o administración, nos referimos únicamente a su diseño.</w:t>
+        <w:t>Los siguientes requisitos describen las funciones que debe entregar la tienda y las condiciones que debe cumplir para ser clara, consistente y fácil de mantener.</w:t>
       </w:r>
     </w:p>
     <w:p>
@@ -4840,7 +4840,7 @@
         <w:spacing w:after="100"/>
       </w:pPr>
       <w:r>
-        <w:t>Lo revisamos así: Desde cada página se puede volver al inicio y abrir catálogo, nosotros, diario, contacto, cuenta y bolsa.</w:t>
+        <w:t>Lo revisamos así: Desde cada página se puede volver a Inicio y abrir Nuestro café, Nosotros y Contacto.</w:t>
       </w:r>
     </w:p>
     <w:p>
@@ -5033,7 +5033,7 @@
         <w:spacing w:after="100"/>
       </w:pPr>
       <w:r>
-        <w:t>Lo revisamos así: Aparecen Brian Bravo y Matías Guerra; el contacto tiene etiquetas y el envío está deshabilitado.</w:t>
+        <w:t>Lo revisamos así: Nosotros presenta la propuesta de Grano y Contacto muestra campos con etiquetas claras.</w:t>
       </w:r>
     </w:p>
     <w:p>
@@ -5046,7 +5046,7 @@
         <w:rPr>
           <w:b/>
         </w:rPr>
-        <w:t>RF-08 Leer el diario de Grano</w:t>
+        <w:t>RF-08 Identificar las categorías del catálogo</w:t>
       </w:r>
     </w:p>
     <w:p>
@@ -5056,7 +5056,7 @@
         <w:spacing w:after="100"/>
       </w:pPr>
       <w:r>
-        <w:t>El diario debe ofrecer dos artículos completos relacionados con café y una pieza de video. Actor: Visitante.</w:t>
+        <w:t>Cada tarjeta del catálogo debe indicar si el producto es café en grano, un método o un accesorio. Actor: Visitante.</w:t>
       </w:r>
     </w:p>
     <w:p>
@@ -5065,7 +5065,7 @@
         <w:spacing w:after="100"/>
       </w:pPr>
       <w:r>
-        <w:t>Lo revisamos así: Cada tarjeta abre su artículo; ambos vuelven al diario y el artículo del ritual incluye video con controles.</w:t>
+        <w:t>Lo revisamos así: Los seis productos muestran una categoría y utilizan etiquetas fáciles de reconocer.</w:t>
       </w:r>
     </w:p>
     <w:p>
@@ -5088,7 +5088,7 @@
         <w:spacing w:after="100"/>
       </w:pPr>
       <w:r>
-        <w:t>El panel debe ofrecer navegación a productos, usuarios, órdenes y mensajes de ejemplo. Actor: Visitante de la maqueta.</w:t>
+        <w:t>La tienda debe presentar Inicio, Nuestro café, Nosotros y Contacto. Actor: Visitante.</w:t>
       </w:r>
     </w:p>
     <w:p>
@@ -5120,7 +5120,7 @@
         <w:spacing w:after="100"/>
       </w:pPr>
       <w:r>
-        <w:t>Los listados deben enlazar a pantallas de creación y edición de productos y usuarios. Actor: Visitante de la maqueta.</w:t>
+        <w:t>El catálogo debe llevar a la ficha de cada producto. Actor: Visitante.</w:t>
       </w:r>
     </w:p>
     <w:p>
@@ -5129,7 +5129,7 @@
         <w:spacing w:after="100"/>
       </w:pPr>
       <w:r>
-        <w:t>Lo revisamos así: Se abren las cuatro pantallas, se vuelve a su listado y los botones Guardar están deshabilitados.</w:t>
+        <w:t>Lo revisamos así: Las tarjetas abren la ficha correspondiente y el visitante puede volver al catálogo.</w:t>
       </w:r>
     </w:p>
     <w:p>
@@ -5188,7 +5188,7 @@
         <w:spacing w:after="100"/>
       </w:pPr>
       <w:r>
-        <w:t>RNF-06 No depender de recursos externos. Los recursos visuales, Bootstrap y el video se incluyen en las carpetas del proyecto. La comprobación consiste en recorrer el sitio sin internet y verificar que siguen cargando.</w:t>
+        <w:t>RNF-06 Mantener disponibles los recursos visuales. Cada producto debe conservar su imagen y la información necesaria para comprenderlo.</w:t>
       </w:r>
     </w:p>
     <w:p>
@@ -5230,7 +5230,7 @@
         <w:spacing w:after="100"/>
       </w:pPr>
       <w:r>
-        <w:t>RNF-07 No guardar datos personales. Los formularios no envían información y los botones de operación permanecen deshabilitados. No usamos cookies ni almacenamiento local. Se revisa que no existan envíos ni código que guarde datos.</w:t>
+        <w:t>RNF-07 Proteger los datos del visitante. La información de contacto debe tratarse con cuidado y solo utilizarse para responder la consulta.</w:t>
       </w:r>
     </w:p>
     <w:p>
@@ -5305,7 +5305,7 @@
         <w:spacing w:after="100"/>
       </w:pPr>
       <w:r>
-        <w:t>RNF-05 Abrir el sitio sin instalación. Se debe poder empezar desde index.html y recorrer los archivos sin servidor ni base de datos. La disponibilidad depende de conservar los archivos en el equipo; no prometemos disponibilidad de un servicio alojado.</w:t>
+        <w:t>RNF-05 Facilitar el acceso a la tienda. Las páginas principales deben abrirse desde un navegador y sus enlaces deben llevar a la sección correspondiente.</w:t>
       </w:r>
     </w:p>
     <w:p>
@@ -5347,7 +5347,7 @@
         <w:spacing w:after="100"/>
       </w:pPr>
       <w:r>
-        <w:t>RNF-08 Facilitar cambios al diseño. El estilo propio se concentra en css/estilos.css y cada componente de Bootstrap que usamos tiene un comentario sencillo. Así podemos identificar qué cambiar sin revisar toda la biblioteca.</w:t>
+        <w:t>RNF-08 Facilitar la actualización del catálogo. La información de cada producto debe estar organizada para poder corregirse o ampliarse.</w:t>
       </w:r>
     </w:p>
     <w:p>
@@ -5356,7 +5356,7 @@
         <w:spacing w:after="100"/>
       </w:pPr>
       <w:r>
-        <w:t>RNF-10 Registrar cambios en GitHub. Cada conjunto de cambios se guarda con un mensaje descriptivo en español y se sube al repositorio. Ambos integrantes podrán revisar el historial; no se atribuyen commits a otra persona.</w:t>
+        <w:t>RNF-10 Mantener una identidad de marca reconocible. El nombre Grano, su paleta y el tono de los textos deben repetirse de forma coherente.</w:t>
       </w:r>
     </w:p>
     <w:p>
@@ -5408,7 +5408,7 @@
         <w:spacing w:after="100"/>
       </w:pPr>
       <w:r>
-        <w:t>RNF-04 Usar solo HTML, CSS y Bootstrap. Los archivos deben poder trasladarse a otro equipo sin compilación. Se comprueba que no existan scripts, manejadores JavaScript ni dependencias de un servidor.</w:t>
+        <w:t>RNF-04 Mantener una estructura ordenada. Cada sección debe tener un título claro y la información debe aparecer en un orden que facilite la lectura.</w:t>
       </w:r>
     </w:p>
     <w:p>
@@ -5450,7 +5450,7 @@
         <w:spacing w:after="100"/>
       </w:pPr>
       <w:r>
-        <w:t>Para seguir trabajando, proponemos que Brian revise la tienda y Matías la administración y los documentos, y que ambos recorran las páginas antes de integrar cambios. Esta es una distribución sugerida, no una declaración de tareas individuales ya realizadas.</w:t>
+        <w:t>Para seguir trabajando, el equipo debe revisar la información de productos y confirmar que cada sección conserve el tono y la identidad de Grano.</w:t>
       </w:r>
     </w:p>
     <w:p>
@@ -5459,7 +5459,7 @@
         <w:spacing w:after="100"/>
       </w:pPr>
       <w:r>
-        <w:t>La aceptación académica y cualquier cambio de alcance quedan pendientes de revisión con el docente.</w:t>
+        <w:t>La propuesta queda abierta a ajustes según las observaciones de revisión y las nuevas necesidades que se definan para la tienda.</w:t>
       </w:r>
     </w:p>
     <w:sectPr>

</xml_diff>

<commit_message>
Mejoramos la portada y el propósito del ERS
</commit_message>
<xml_diff>
--- a/docs/Anexo 4 - ERS Grano.docx
+++ b/docs/Anexo 4 - ERS Grano.docx
@@ -113,22 +113,22 @@
                   <w:p>
                     <w:pPr>
                       <w:pStyle w:val="Sinespaciado"/>
-                      <w:pBdr>
-                        <w:bottom w:val="nil"/>
-                      </w:pBdr>
                       <w:rPr>
                         <w:rFonts w:eastAsiaTheme="majorEastAsia" w:cstheme="minorHAnsi"/>
                         <w:sz w:val="80"/>
                         <w:szCs w:val="80"/>
                       </w:rPr>
+                      <w:spacing w:after="80"/>
                     </w:pPr>
                     <w:r>
                       <w:rPr>
-                        <w:rFonts w:eastAsiaTheme="majorEastAsia" w:cstheme="minorHAnsi"/>
-                        <w:sz w:val="80"/>
-                        <w:szCs w:val="80"/>
+                        <w:rFonts w:ascii="Aptos" w:hAnsi="Aptos"/>
+                        <w:sz w:val="44"/>
+                        <w:szCs w:val="44"/>
+                        <w:b/>
+                        <w:color w:val="000000"/>
                       </w:rPr>
-                      <w:t>Especificación de requisitos de Grano</w:t>
+                      <w:t>Grano</w:t>
                     </w:r>
                   </w:p>
                 </w:tc>
@@ -175,13 +175,12 @@
                     </w:pPr>
                     <w:r>
                       <w:rPr>
-                        <w:rFonts w:eastAsiaTheme="majorEastAsia" w:cstheme="minorHAnsi"/>
-                        <w:i/>
-                        <w:sz w:val="44"/>
-                        <w:szCs w:val="44"/>
-                        <w:lang w:val="es-AR"/>
+                        <w:rFonts w:ascii="Aptos" w:hAnsi="Aptos"/>
+                        <w:sz w:val="22"/>
+                        <w:szCs w:val="22"/>
+                        <w:color w:val="000000"/>
                       </w:rPr>
-                      <w:t>Proyecto Grano</w:t>
+                      <w:t>Especificación de requisitos</w:t>
                     </w:r>
                   </w:p>
                 </w:tc>
@@ -229,20 +228,13 @@
                 </w:pPr>
                 <w:r>
                   <w:rPr>
-                    <w:rFonts w:cstheme="minorHAnsi"/>
+                    <w:rFonts w:ascii="Aptos" w:hAnsi="Aptos"/>
+                    <w:sz w:val="20"/>
+                    <w:szCs w:val="20"/>
                     <w:b/>
-                    <w:bCs/>
+                    <w:color w:val="000000"/>
                   </w:rPr>
-                  <w:t>Revisión</w:t>
-                </w:r>
-                <w:r>
-                  <w:rPr>
-                    <w:rFonts w:cstheme="minorHAnsi"/>
-                    <w:b/>
-                    <w:bCs/>
-                    <w:i/>
-                  </w:rPr>
-                  <w:t>: 1.0</w:t>
+                  <w:t>Versión 1.0</w:t>
                 </w:r>
               </w:p>
             </w:tc>
@@ -287,11 +279,12 @@
                     </w:pPr>
                     <w:r>
                       <w:rPr>
-                        <w:rFonts w:cstheme="minorHAnsi"/>
-                        <w:b/>
-                        <w:bCs/>
+                        <w:rFonts w:ascii="Aptos" w:hAnsi="Aptos"/>
+                        <w:sz w:val="18"/>
+                        <w:szCs w:val="18"/>
+                        <w:color w:val="000000"/>
                       </w:rPr>
-                      <w:t>12/09/2026</w:t>
+                      <w:t>13 de septiembre de 2026</w:t>
                     </w:r>
                   </w:p>
                 </w:tc>
@@ -4132,7 +4125,11 @@
         <w:spacing w:after="100"/>
       </w:pPr>
       <w:r>
-        <w:t>El propósito de esta ERS es explicar cómo funcionará Grano y qué debe considerar el sitio para entregar una experiencia clara a sus visitantes. El documento sirve como guía para diseñar, revisar y ampliar la solución.</w:t>
+        <w:rPr>
+          <w:rFonts w:ascii="Aptos" w:hAnsi="Aptos"/>
+          <w:color w:val="000000"/>
+        </w:rPr>
+        <w:t>El propósito de este documento es dejar claro qué problema resuelve Grano y qué experiencia queremos ofrecer. La tienda debe ayudar a las personas a encontrar un café, método o accesorio que se ajuste a su forma de preparar una taza. La ERS reúne las decisiones principales de la propuesta para que el diseño y las próximas mejoras sigan una misma dirección.</w:t>
       </w:r>
     </w:p>
     <w:p>

</xml_diff>

<commit_message>
Completamos la portada con los datos del proyecto
</commit_message>
<xml_diff>
--- a/docs/Anexo 4 - ERS Grano.docx
+++ b/docs/Anexo 4 - ERS Grano.docx
@@ -180,7 +180,7 @@
                         <w:szCs w:val="22"/>
                         <w:color w:val="000000"/>
                       </w:rPr>
-                      <w:t>Especificación de requisitos</w:t>
+                      <w:t>Especificación de requisitos del software</w:t>
                     </w:r>
                   </w:p>
                 </w:tc>
@@ -204,6 +204,16 @@
                     <w:rFonts w:cstheme="minorHAnsi"/>
                   </w:rPr>
                 </w:pPr>
+                <w:r>
+                  <w:rPr>
+                    <w:rFonts w:ascii="Aptos" w:hAnsi="Aptos"/>
+                    <w:sz w:val="18"/>
+                    <w:szCs w:val="18"/>
+                    <w:b/>
+                    <w:color w:val="000000"/>
+                  </w:rPr>
+                  <w:t>Proyecto: Tienda Grano</w:t>
+                </w:r>
               </w:p>
             </w:tc>
           </w:tr>
@@ -229,12 +239,12 @@
                 <w:r>
                   <w:rPr>
                     <w:rFonts w:ascii="Aptos" w:hAnsi="Aptos"/>
-                    <w:sz w:val="20"/>
-                    <w:szCs w:val="20"/>
+                    <w:sz w:val="17"/>
+                    <w:szCs w:val="17"/>
                     <w:b/>
                     <w:color w:val="000000"/>
                   </w:rPr>
-                  <w:t>Versión 1.0</w:t>
+                  <w:t>Evaluación parcial 1 · Versión 1.0</w:t>
                 </w:r>
               </w:p>
             </w:tc>
@@ -280,8 +290,8 @@
                     <w:r>
                       <w:rPr>
                         <w:rFonts w:ascii="Aptos" w:hAnsi="Aptos"/>
-                        <w:sz w:val="18"/>
-                        <w:szCs w:val="18"/>
+                        <w:sz w:val="16"/>
+                        <w:szCs w:val="16"/>
                         <w:color w:val="000000"/>
                       </w:rPr>
                       <w:t>13 de septiembre de 2026</w:t>
@@ -298,6 +308,15 @@
               <w:rFonts w:cstheme="minorHAnsi"/>
             </w:rPr>
           </w:pPr>
+          <w:r>
+            <w:rPr>
+              <w:rFonts w:ascii="Aptos" w:hAnsi="Aptos"/>
+              <w:sz w:val="16"/>
+              <w:szCs w:val="16"/>
+              <w:color w:val="000000"/>
+            </w:rPr>
+            <w:t>Integrantes: Brian Bravo y Matías Guerra</w:t>
+          </w:r>
         </w:p>
         <w:p>
           <w:pPr>

</xml_diff>

<commit_message>
Rediseñamos la portada de Grano con una presentación más cuidada
</commit_message>
<xml_diff>
--- a/docs/Anexo 4 - ERS Grano.docx
+++ b/docs/Anexo 4 - ERS Grano.docx
@@ -2,400 +2,184 @@
 <file path=word/document.xml><?xml version="1.0" encoding="utf-8"?>
 <w:document xmlns:wpc="http://schemas.microsoft.com/office/word/2010/wordprocessingCanvas" xmlns:cx="http://schemas.microsoft.com/office/drawing/2014/chartex" xmlns:cx1="http://schemas.microsoft.com/office/drawing/2015/9/8/chartex" xmlns:cx2="http://schemas.microsoft.com/office/drawing/2015/10/21/chartex" xmlns:cx3="http://schemas.microsoft.com/office/drawing/2016/5/9/chartex" xmlns:cx4="http://schemas.microsoft.com/office/drawing/2016/5/10/chartex" xmlns:cx5="http://schemas.microsoft.com/office/drawing/2016/5/11/chartex" xmlns:cx6="http://schemas.microsoft.com/office/drawing/2016/5/12/chartex" xmlns:cx7="http://schemas.microsoft.com/office/drawing/2016/5/13/chartex" xmlns:cx8="http://schemas.microsoft.com/office/drawing/2016/5/14/chartex" xmlns:mc="http://schemas.openxmlformats.org/markup-compatibility/2006" xmlns:aink="http://schemas.microsoft.com/office/drawing/2016/ink" xmlns:am3d="http://schemas.microsoft.com/office/drawing/2017/model3d" xmlns:o="urn:schemas-microsoft-com:office:office" xmlns:oel="http://schemas.microsoft.com/office/2019/extlst" xmlns:r="http://schemas.openxmlformats.org/officeDocument/2006/relationships" xmlns:m="http://schemas.openxmlformats.org/officeDocument/2006/math" xmlns:v="urn:schemas-microsoft-com:vml" xmlns:wp14="http://schemas.microsoft.com/office/word/2010/wordprocessingDrawing" xmlns:wp="http://schemas.openxmlformats.org/drawingml/2006/wordprocessingDrawing" xmlns:w10="urn:schemas-microsoft-com:office:word" xmlns:w="http://schemas.openxmlformats.org/wordprocessingml/2006/main" xmlns:w14="http://schemas.microsoft.com/office/word/2010/wordml" xmlns:w15="http://schemas.microsoft.com/office/word/2012/wordml" xmlns:w16cex="http://schemas.microsoft.com/office/word/2018/wordml/cex" xmlns:w16cid="http://schemas.microsoft.com/office/word/2016/wordml/cid" xmlns:w16="http://schemas.microsoft.com/office/word/2018/wordml" xmlns:w16du="http://schemas.microsoft.com/office/word/2023/wordml/word16du" xmlns:w16sdtdh="http://schemas.microsoft.com/office/word/2020/wordml/sdtdatahash" xmlns:w16sdtfl="http://schemas.microsoft.com/office/word/2024/wordml/sdtformatlock" xmlns:w16se="http://schemas.microsoft.com/office/word/2015/wordml/symex" xmlns:wpg="http://schemas.microsoft.com/office/word/2010/wordprocessingGroup" xmlns:wpi="http://schemas.microsoft.com/office/word/2010/wordprocessingInk" xmlns:wne="http://schemas.microsoft.com/office/word/2006/wordml" xmlns:wps="http://schemas.microsoft.com/office/word/2010/wordprocessingShape" mc:Ignorable="w14 w15 w16se w16cid w16 w16cex w16sdtdh w16sdtfl w16du wp14">
   <w:body>
-    <w:sdt>
-      <w:sdtPr>
-        <w:rPr>
-          <w:rFonts w:eastAsiaTheme="majorEastAsia" w:cstheme="minorHAnsi"/>
-          <w:caps/>
-          <w:lang w:val="es-AR"/>
-        </w:rPr>
-        <w:id w:val="1371192"/>
-        <w:docPartObj>
-          <w:docPartGallery w:val="Cover Pages"/>
-          <w:docPartUnique/>
-        </w:docPartObj>
-      </w:sdtPr>
-      <w:sdtEndPr>
-        <w:rPr>
-          <w:rFonts w:eastAsiaTheme="minorEastAsia"/>
-          <w:caps w:val="0"/>
+    <w:p>
+      <w:pPr>
+        <w:keepNext/>
+        <w:spacing w:before="0" w:after="100" w:line="252" w:lineRule="auto"/>
+      </w:pPr>
+      <w:r>
+        <w:rPr>
+          <w:rFonts w:ascii="Calibri" w:hAnsi="Calibri"/>
+          <w:b/>
+          <w:color w:val="000000"/>
+          <w:sz w:val="24"/>
+        </w:rPr>
+        <w:t>DUOC UC</w:t>
+      </w:r>
+    </w:p>
+    <w:p>
+      <w:pPr>
+        <w:keepNext/>
+        <w:spacing w:before="0" w:after="0" w:line="252" w:lineRule="auto"/>
+      </w:pPr>
+      <w:r>
+        <w:rPr>
+          <w:rFonts w:ascii="Calibri" w:hAnsi="Calibri"/>
+          <w:b w:val="0"/>
+          <w:color w:val="58645C"/>
+          <w:sz w:val="20"/>
+        </w:rPr>
+        <w:t>Escuela de Informática y Telecomunicaciones</w:t>
+      </w:r>
+    </w:p>
+    <w:p>
+      <w:pPr>
+        <w:keepNext/>
+        <w:spacing w:before="1660" w:after="240" w:line="252" w:lineRule="auto"/>
+      </w:pPr>
+      <w:r>
+        <w:rPr>
+          <w:rFonts w:ascii="Calibri" w:hAnsi="Calibri"/>
+          <w:b/>
+          <w:color w:val="315546"/>
+          <w:sz w:val="20"/>
+        </w:rPr>
+        <w:t>PROYECTO DE TIENDA DE CAFÉ</w:t>
+      </w:r>
+    </w:p>
+    <w:p>
+      <w:pPr>
+        <w:pStyle w:val="Title"/>
+        <w:keepNext/>
+        <w:spacing w:before="0" w:after="200" w:line="252" w:lineRule="auto"/>
+      </w:pPr>
+      <w:r>
+        <w:rPr>
+          <w:rFonts w:ascii="Georgia" w:hAnsi="Georgia"/>
+          <w:b w:val="0"/>
+          <w:color w:val="000000"/>
+          <w:sz w:val="128"/>
+        </w:rPr>
+        <w:t>Grano</w:t>
+      </w:r>
+    </w:p>
+    <w:p>
+      <w:pPr>
+        <w:keepNext/>
+        <w:spacing w:before="0" w:after="340" w:line="252" w:lineRule="auto"/>
+      </w:pPr>
+      <w:r>
+        <w:rPr>
+          <w:rFonts w:ascii="Calibri" w:hAnsi="Calibri"/>
+          <w:b w:val="0"/>
+          <w:color w:val="000000"/>
+          <w:sz w:val="46"/>
+        </w:rPr>
+        <w:t>Especificación de requisitos</w:t>
+        <w:br/>
+        <w:t>del software</w:t>
+      </w:r>
+    </w:p>
+    <w:p>
+      <w:pPr>
+        <w:keepNext/>
+        <w:spacing w:before="0" w:after="0" w:line="252" w:lineRule="auto"/>
+      </w:pPr>
+      <w:r>
+        <w:rPr>
+          <w:rFonts w:ascii="Calibri" w:hAnsi="Calibri"/>
+          <w:b w:val="0"/>
+          <w:color w:val="58645C"/>
+          <w:sz w:val="22"/>
+        </w:rPr>
+        <w:t>Café de especialidad, métodos y accesorios</w:t>
+      </w:r>
+    </w:p>
+    <w:p>
+      <w:pPr>
+        <w:keepNext/>
+        <w:spacing w:before="1300" w:after="200" w:line="252" w:lineRule="auto"/>
+      </w:pPr>
+      <w:r>
+        <w:rPr>
+          <w:rFonts w:ascii="Calibri" w:hAnsi="Calibri"/>
+          <w:b/>
+          <w:color w:val="315546"/>
+          <w:sz w:val="18"/>
+        </w:rPr>
+        <w:t>INTEGRANTES</w:t>
+      </w:r>
+    </w:p>
+    <w:p>
+      <w:pPr>
+        <w:keepNext/>
+        <w:spacing w:before="0" w:after="600" w:line="252" w:lineRule="auto"/>
+      </w:pPr>
+      <w:r>
+        <w:rPr>
+          <w:rFonts w:ascii="Calibri" w:hAnsi="Calibri"/>
+          <w:b w:val="0"/>
+          <w:color w:val="000000"/>
           <w:sz w:val="32"/>
-          <w:lang w:val="es-ES"/>
-        </w:rPr>
-      </w:sdtEndPr>
-      <w:sdtContent>
-        <w:tbl>
-          <w:tblPr>
-            <w:tblW w:w="5000" w:type="pct"/>
-            <w:jc w:val="center"/>
-            <w:tblLook w:val="04A0" w:firstRow="1" w:lastRow="0" w:firstColumn="1" w:lastColumn="0" w:noHBand="0" w:noVBand="1"/>
-          </w:tblPr>
-          <w:tblGrid>
-            <w:gridCol w:w="9430"/>
-          </w:tblGrid>
-          <w:tr>
-            <w:trPr>
-              <w:trHeight w:val="2880"/>
-              <w:jc w:val="center"/>
-            </w:trPr>
-            <w:sdt>
-              <w:sdtPr>
-                <w:rPr>
-                  <w:rFonts w:eastAsiaTheme="majorEastAsia" w:cstheme="minorHAnsi"/>
-                  <w:caps/>
-                  <w:lang w:val="es-AR"/>
-                </w:rPr>
-                <w:alias w:val="Organización"/>
-                <w:id w:val="15524243"/>
-                <w:placeholder>
-                  <w:docPart w:val="6249C296035045A4B35172D034FA06AE"/>
-                </w:placeholder>
-                <w:dataBinding w:prefixMappings="xmlns:ns0='http://schemas.openxmlformats.org/officeDocument/2006/extended-properties'" w:xpath="/ns0:Properties[1]/ns0:Company[1]" w:storeItemID="{6668398D-A668-4E3E-A5EB-62B293D839F1}"/>
-                <w:text/>
-              </w:sdtPr>
-              <w:sdtEndPr/>
-              <w:sdtContent>
-                <w:tc>
-                  <w:tcPr>
-                    <w:tcW w:w="5000" w:type="pct"/>
-                  </w:tcPr>
-                  <w:p>
-                    <w:pPr>
-                      <w:pStyle w:val="Sinespaciado"/>
-                      <w:rPr>
-                        <w:rFonts w:eastAsiaTheme="majorEastAsia" w:cstheme="minorHAnsi"/>
-                        <w:caps/>
-                      </w:rPr>
-                    </w:pPr>
-                    <w:r>
-                      <w:rPr>
-                        <w:rFonts w:eastAsiaTheme="majorEastAsia" w:cstheme="minorHAnsi"/>
-                        <w:caps/>
-                        <w:lang w:val="es-AR"/>
-                      </w:rPr>
-                      <w:t>DUOC UC - Escuela de informatica y telecomunicaciones</w:t>
-                    </w:r>
-                  </w:p>
-                </w:tc>
-              </w:sdtContent>
-            </w:sdt>
-          </w:tr>
-          <w:tr>
-            <w:trPr>
-              <w:trHeight w:val="1440"/>
-              <w:jc w:val="center"/>
-            </w:trPr>
-            <w:sdt>
-              <w:sdtPr>
-                <w:rPr>
-                  <w:rFonts w:eastAsiaTheme="majorEastAsia" w:cstheme="minorHAnsi"/>
-                  <w:sz w:val="80"/>
-                  <w:szCs w:val="80"/>
-                </w:rPr>
-                <w:alias w:val="Título"/>
-                <w:id w:val="15524250"/>
-                <w:placeholder>
-                  <w:docPart w:val="C3A9BEF9B31C43B3ABDAE773F5A369DA"/>
-                </w:placeholder>
-                <w:dataBinding w:prefixMappings="xmlns:ns0='http://schemas.openxmlformats.org/package/2006/metadata/core-properties' xmlns:ns1='http://purl.org/dc/elements/1.1/'" w:xpath="/ns0:coreProperties[1]/ns1:title[1]" w:storeItemID="{6C3C8BC8-F283-45AE-878A-BAB7291924A1}"/>
-                <w:text/>
-              </w:sdtPr>
-              <w:sdtEndPr/>
-              <w:sdtContent>
-                <w:tc>
-                  <w:tcPr>
-                    <w:tcW w:w="5000" w:type="pct"/>
-                    <w:tcBorders>
-                      <w:bottom w:val="nil"/>
-                    </w:tcBorders>
-                    <w:vAlign w:val="center"/>
-                  </w:tcPr>
-                  <w:p>
-                    <w:pPr>
-                      <w:pStyle w:val="Sinespaciado"/>
-                      <w:rPr>
-                        <w:rFonts w:eastAsiaTheme="majorEastAsia" w:cstheme="minorHAnsi"/>
-                        <w:sz w:val="80"/>
-                        <w:szCs w:val="80"/>
-                      </w:rPr>
-                      <w:spacing w:after="80"/>
-                    </w:pPr>
-                    <w:r>
-                      <w:rPr>
-                        <w:rFonts w:ascii="Aptos" w:hAnsi="Aptos"/>
-                        <w:sz w:val="44"/>
-                        <w:szCs w:val="44"/>
-                        <w:b/>
-                        <w:color w:val="000000"/>
-                      </w:rPr>
-                      <w:t>Grano</w:t>
-                    </w:r>
-                  </w:p>
-                </w:tc>
-              </w:sdtContent>
-            </w:sdt>
-          </w:tr>
-          <w:tr>
-            <w:trPr>
-              <w:trHeight w:val="720"/>
-              <w:jc w:val="center"/>
-            </w:trPr>
-            <w:sdt>
-              <w:sdtPr>
-                <w:rPr>
-                  <w:rFonts w:eastAsiaTheme="majorEastAsia" w:cstheme="minorHAnsi"/>
-                  <w:i/>
-                  <w:sz w:val="44"/>
-                  <w:szCs w:val="44"/>
-                  <w:lang w:val="es-AR"/>
-                </w:rPr>
-                <w:alias w:val="Subtítulo"/>
-                <w:id w:val="15524255"/>
-                <w:dataBinding w:prefixMappings="xmlns:ns0='http://schemas.openxmlformats.org/package/2006/metadata/core-properties' xmlns:ns1='http://purl.org/dc/elements/1.1/'" w:xpath="/ns0:coreProperties[1]/ns1:subject[1]" w:storeItemID="{6C3C8BC8-F283-45AE-878A-BAB7291924A1}"/>
-                <w:text/>
-              </w:sdtPr>
-              <w:sdtEndPr/>
-              <w:sdtContent>
-                <w:tc>
-                  <w:tcPr>
-                    <w:tcW w:w="5000" w:type="pct"/>
-                    <w:tcBorders>
-                      <w:top w:val="nil"/>
-                    </w:tcBorders>
-                    <w:vAlign w:val="center"/>
-                  </w:tcPr>
-                  <w:p>
-                    <w:pPr>
-                      <w:pStyle w:val="Sinespaciado"/>
-                      <w:rPr>
-                        <w:rFonts w:eastAsiaTheme="majorEastAsia" w:cstheme="minorHAnsi"/>
-                        <w:sz w:val="44"/>
-                        <w:szCs w:val="44"/>
-                      </w:rPr>
-                    </w:pPr>
-                    <w:r>
-                      <w:rPr>
-                        <w:rFonts w:ascii="Aptos" w:hAnsi="Aptos"/>
-                        <w:sz w:val="22"/>
-                        <w:szCs w:val="22"/>
-                        <w:color w:val="000000"/>
-                      </w:rPr>
-                      <w:t>Especificación de requisitos del software</w:t>
-                    </w:r>
-                  </w:p>
-                </w:tc>
-              </w:sdtContent>
-            </w:sdt>
-          </w:tr>
-          <w:tr>
-            <w:trPr>
-              <w:trHeight w:val="360"/>
-              <w:jc w:val="center"/>
-            </w:trPr>
-            <w:tc>
-              <w:tcPr>
-                <w:tcW w:w="5000" w:type="pct"/>
-                <w:vAlign w:val="center"/>
-              </w:tcPr>
-              <w:p>
-                <w:pPr>
-                  <w:pStyle w:val="Sinespaciado"/>
-                  <w:rPr>
-                    <w:rFonts w:cstheme="minorHAnsi"/>
-                  </w:rPr>
-                </w:pPr>
-                <w:r>
-                  <w:rPr>
-                    <w:rFonts w:ascii="Aptos" w:hAnsi="Aptos"/>
-                    <w:sz w:val="18"/>
-                    <w:szCs w:val="18"/>
-                    <w:b/>
-                    <w:color w:val="000000"/>
-                  </w:rPr>
-                  <w:t>Proyecto: Tienda Grano</w:t>
-                </w:r>
-              </w:p>
-            </w:tc>
-          </w:tr>
-          <w:tr>
-            <w:trPr>
-              <w:trHeight w:val="360"/>
-              <w:jc w:val="center"/>
-            </w:trPr>
-            <w:tc>
-              <w:tcPr>
-                <w:tcW w:w="5000" w:type="pct"/>
-                <w:vAlign w:val="center"/>
-              </w:tcPr>
-              <w:p>
-                <w:pPr>
-                  <w:pStyle w:val="Sinespaciado"/>
-                  <w:rPr>
-                    <w:rFonts w:cstheme="minorHAnsi"/>
-                    <w:b/>
-                    <w:bCs/>
-                  </w:rPr>
-                </w:pPr>
-                <w:r>
-                  <w:rPr>
-                    <w:rFonts w:ascii="Aptos" w:hAnsi="Aptos"/>
-                    <w:sz w:val="17"/>
-                    <w:szCs w:val="17"/>
-                    <w:b/>
-                    <w:color w:val="000000"/>
-                  </w:rPr>
-                  <w:t>Evaluación parcial 1 · Versión 1.0</w:t>
-                </w:r>
-              </w:p>
-            </w:tc>
-          </w:tr>
-          <w:tr>
-            <w:trPr>
-              <w:trHeight w:val="360"/>
-              <w:jc w:val="center"/>
-            </w:trPr>
-            <w:sdt>
-              <w:sdtPr>
-                <w:rPr>
-                  <w:rFonts w:cstheme="minorHAnsi"/>
-                  <w:b/>
-                  <w:bCs/>
-                </w:rPr>
-                <w:alias w:val="Fecha"/>
-                <w:id w:val="516659546"/>
-                <w:dataBinding w:prefixMappings="xmlns:ns0='http://schemas.microsoft.com/office/2006/coverPageProps'" w:xpath="/ns0:CoverPageProperties[1]/ns0:PublishDate[1]" w:storeItemID="{55AF091B-3C7A-41E3-B477-F2FDAA23CFDA}"/>
-                <w:date w:fullDate="2026-09-12T09:00:00Z">
-                  <w:dateFormat w:val="dd/MM/yyyy"/>
-                  <w:lid w:val="es-ES"/>
-                  <w:storeMappedDataAs w:val="dateTime"/>
-                  <w:calendar w:val="gregorian"/>
-                </w:date>
-              </w:sdtPr>
-              <w:sdtEndPr/>
-              <w:sdtContent>
-                <w:tc>
-                  <w:tcPr>
-                    <w:tcW w:w="5000" w:type="pct"/>
-                    <w:vAlign w:val="center"/>
-                  </w:tcPr>
-                  <w:p>
-                    <w:pPr>
-                      <w:pStyle w:val="Sinespaciado"/>
-                      <w:rPr>
-                        <w:rFonts w:cstheme="minorHAnsi"/>
-                        <w:b/>
-                        <w:bCs/>
-                      </w:rPr>
-                    </w:pPr>
-                    <w:r>
-                      <w:rPr>
-                        <w:rFonts w:ascii="Aptos" w:hAnsi="Aptos"/>
-                        <w:sz w:val="16"/>
-                        <w:szCs w:val="16"/>
-                        <w:color w:val="000000"/>
-                      </w:rPr>
-                      <w:t>13 de septiembre de 2026</w:t>
-                    </w:r>
-                  </w:p>
-                </w:tc>
-              </w:sdtContent>
-            </w:sdt>
-          </w:tr>
-        </w:tbl>
-        <w:p>
-          <w:pPr>
-            <w:rPr>
-              <w:rFonts w:cstheme="minorHAnsi"/>
-            </w:rPr>
-          </w:pPr>
-          <w:r>
-            <w:rPr>
-              <w:rFonts w:ascii="Aptos" w:hAnsi="Aptos"/>
-              <w:sz w:val="16"/>
-              <w:szCs w:val="16"/>
-              <w:color w:val="000000"/>
-            </w:rPr>
-            <w:t>Integrantes: Brian Bravo y Matías Guerra</w:t>
-          </w:r>
-        </w:p>
-        <w:p>
-          <w:pPr>
-            <w:rPr>
-              <w:rFonts w:cstheme="minorHAnsi"/>
-            </w:rPr>
-          </w:pPr>
-        </w:p>
-        <w:tbl>
-          <w:tblPr>
-            <w:tblpPr w:leftFromText="187" w:rightFromText="187" w:horzAnchor="margin" w:tblpXSpec="center" w:tblpYSpec="bottom"/>
-            <w:tblW w:w="5000" w:type="pct"/>
-            <w:tblLook w:val="04A0" w:firstRow="1" w:lastRow="0" w:firstColumn="1" w:lastColumn="0" w:noHBand="0" w:noVBand="1"/>
-          </w:tblPr>
-          <w:tblGrid>
-            <w:gridCol w:w="9430"/>
-          </w:tblGrid>
-          <w:tr>
-            <w:sdt>
-              <w:sdtPr>
-                <w:rPr>
-                  <w:rFonts w:eastAsiaTheme="minorHAnsi" w:cstheme="minorHAnsi"/>
-                  <w:lang w:val="es-AR"/>
-                </w:rPr>
-                <w:alias w:val="Abstracto"/>
-                <w:id w:val="8276291"/>
-                <w:dataBinding w:prefixMappings="xmlns:ns0='http://schemas.microsoft.com/office/2006/coverPageProps'" w:xpath="/ns0:CoverPageProperties[1]/ns0:Abstract[1]" w:storeItemID="{55AF091B-3C7A-41E3-B477-F2FDAA23CFDA}"/>
-                <w:text/>
-              </w:sdtPr>
-              <w:sdtEndPr/>
-              <w:sdtContent>
-                <w:tc>
-                  <w:tcPr>
-                    <w:tcW w:w="5000" w:type="pct"/>
-                  </w:tcPr>
-                  <w:p>
-                    <w:pPr>
-                      <w:pStyle w:val="Sinespaciado"/>
-                      <w:rPr>
-                        <w:rFonts w:cstheme="minorHAnsi"/>
-                      </w:rPr>
-                    </w:pPr>
-                    <w:r>
-                      <w:rPr>
-                        <w:rFonts w:eastAsiaTheme="minorHAnsi" w:cstheme="minorHAnsi"/>
-                        <w:lang w:val="es-AR"/>
-                      </w:rPr>
-                      <w:t xml:space="preserve"> Especificación de Requisitos según estándar de IEEE 830.</w:t>
-                    </w:r>
-                  </w:p>
-                </w:tc>
-              </w:sdtContent>
-            </w:sdt>
-          </w:tr>
-        </w:tbl>
-        <w:p>
-          <w:pPr>
-            <w:rPr>
-              <w:rFonts w:cstheme="minorHAnsi"/>
-            </w:rPr>
-          </w:pPr>
-        </w:p>
-        <w:p>
-          <w:pPr>
-            <w:rPr>
-              <w:rFonts w:cstheme="minorHAnsi"/>
-              <w:sz w:val="32"/>
-            </w:rPr>
-          </w:pPr>
-          <w:r>
-            <w:rPr>
-              <w:rFonts w:cstheme="minorHAnsi"/>
-              <w:sz w:val="32"/>
-            </w:rPr>
-            <w:br w:type="page"/>
-          </w:r>
-        </w:p>
-      </w:sdtContent>
-    </w:sdt>
+        </w:rPr>
+        <w:t>Brian Bravo</w:t>
+        <w:br/>
+        <w:t>Matías Guerra</w:t>
+      </w:r>
+    </w:p>
+    <w:p>
+      <w:pPr>
+        <w:keepNext/>
+        <w:spacing w:before="0" w:after="120" w:line="252" w:lineRule="auto"/>
+      </w:pPr>
+      <w:r>
+        <w:rPr>
+          <w:rFonts w:ascii="Calibri" w:hAnsi="Calibri"/>
+          <w:b/>
+          <w:color w:val="000000"/>
+          <w:sz w:val="24"/>
+        </w:rPr>
+        <w:t>Desarrollo FullStack II</w:t>
+      </w:r>
+    </w:p>
+    <w:p>
+      <w:pPr>
+        <w:keepNext/>
+        <w:spacing w:before="0" w:after="500" w:line="252" w:lineRule="auto"/>
+      </w:pPr>
+      <w:r>
+        <w:rPr>
+          <w:rFonts w:ascii="Calibri" w:hAnsi="Calibri"/>
+          <w:b w:val="0"/>
+          <w:color w:val="000000"/>
+          <w:sz w:val="22"/>
+        </w:rPr>
+        <w:t>Evaluación parcial 1</w:t>
+      </w:r>
+    </w:p>
+    <w:p>
+      <w:pPr>
+        <w:keepNext/>
+        <w:spacing w:before="0" w:after="0" w:line="252" w:lineRule="auto"/>
+      </w:pPr>
+      <w:r>
+        <w:rPr>
+          <w:rFonts w:ascii="Calibri" w:hAnsi="Calibri"/>
+          <w:b w:val="0"/>
+          <w:color w:val="58645C"/>
+          <w:sz w:val="20"/>
+        </w:rPr>
+        <w:t>Septiembre de 2026</w:t>
+      </w:r>
+    </w:p>
+    <w:p>
+      <w:pPr>
+        <w:spacing w:after="0"/>
+      </w:pPr>
+      <w:r>
+        <w:br w:type="page"/>
+      </w:r>
+    </w:p>
     <w:p>
       <w:pPr>
         <w:spacing w:after="0" w:line="240" w:lineRule="auto"/>
@@ -7671,6 +7455,9 @@
     <w:name w:val="apple-converted-space"/>
     <w:basedOn w:val="Fuentedeprrafopredeter"/>
     <w:rsid w:val="0027225D"/>
+  </w:style>
+  <w:style w:type="paragraph" w:styleId="Title">
+    <w:name w:val="Title"/>
   </w:style>
 </w:styles>
 </file>

</xml_diff>

<commit_message>
Actualiza tienda, cuentas y documentacion
</commit_message>
<xml_diff>
--- a/docs/Anexo 4 - ERS Grano.docx
+++ b/docs/Anexo 4 - ERS Grano.docx
@@ -1,11 +1,11 @@
 
 <file path=word/document.xml><?xml version="1.0" encoding="utf-8"?>
-<w:document xmlns:wpc="http://schemas.microsoft.com/office/word/2010/wordprocessingCanvas" xmlns:cx="http://schemas.microsoft.com/office/drawing/2014/chartex" xmlns:cx1="http://schemas.microsoft.com/office/drawing/2015/9/8/chartex" xmlns:cx2="http://schemas.microsoft.com/office/drawing/2015/10/21/chartex" xmlns:cx3="http://schemas.microsoft.com/office/drawing/2016/5/9/chartex" xmlns:cx4="http://schemas.microsoft.com/office/drawing/2016/5/10/chartex" xmlns:cx5="http://schemas.microsoft.com/office/drawing/2016/5/11/chartex" xmlns:cx6="http://schemas.microsoft.com/office/drawing/2016/5/12/chartex" xmlns:cx7="http://schemas.microsoft.com/office/drawing/2016/5/13/chartex" xmlns:cx8="http://schemas.microsoft.com/office/drawing/2016/5/14/chartex" xmlns:mc="http://schemas.openxmlformats.org/markup-compatibility/2006" xmlns:aink="http://schemas.microsoft.com/office/drawing/2016/ink" xmlns:am3d="http://schemas.microsoft.com/office/drawing/2017/model3d" xmlns:o="urn:schemas-microsoft-com:office:office" xmlns:oel="http://schemas.microsoft.com/office/2019/extlst" xmlns:r="http://schemas.openxmlformats.org/officeDocument/2006/relationships" xmlns:m="http://schemas.openxmlformats.org/officeDocument/2006/math" xmlns:v="urn:schemas-microsoft-com:vml" xmlns:wp14="http://schemas.microsoft.com/office/word/2010/wordprocessingDrawing" xmlns:wp="http://schemas.openxmlformats.org/drawingml/2006/wordprocessingDrawing" xmlns:w10="urn:schemas-microsoft-com:office:word" xmlns:w="http://schemas.openxmlformats.org/wordprocessingml/2006/main" xmlns:w14="http://schemas.microsoft.com/office/word/2010/wordml" xmlns:w15="http://schemas.microsoft.com/office/word/2012/wordml" xmlns:w16cex="http://schemas.microsoft.com/office/word/2018/wordml/cex" xmlns:w16cid="http://schemas.microsoft.com/office/word/2016/wordml/cid" xmlns:w16="http://schemas.microsoft.com/office/word/2018/wordml" xmlns:w16du="http://schemas.microsoft.com/office/word/2023/wordml/word16du" xmlns:w16sdtdh="http://schemas.microsoft.com/office/word/2020/wordml/sdtdatahash" xmlns:w16sdtfl="http://schemas.microsoft.com/office/word/2024/wordml/sdtformatlock" xmlns:w16se="http://schemas.microsoft.com/office/word/2015/wordml/symex" xmlns:wpg="http://schemas.microsoft.com/office/word/2010/wordprocessingGroup" xmlns:wpi="http://schemas.microsoft.com/office/word/2010/wordprocessingInk" xmlns:wne="http://schemas.microsoft.com/office/word/2006/wordml" xmlns:wps="http://schemas.microsoft.com/office/word/2010/wordprocessingShape" mc:Ignorable="w14 w15 w16se w16cid w16 w16cex w16sdtdh w16sdtfl w16du wp14">
+<w:document xmlns:wpc="http://schemas.microsoft.com/office/word/2010/wordprocessingCanvas" xmlns:cx="http://schemas.microsoft.com/office/drawing/2014/chartex" xmlns:cx1="http://schemas.microsoft.com/office/drawing/2015/9/8/chartex" xmlns:cx2="http://schemas.microsoft.com/office/drawing/2015/10/21/chartex" xmlns:cx3="http://schemas.microsoft.com/office/drawing/2016/5/9/chartex" xmlns:cx4="http://schemas.microsoft.com/office/drawing/2016/5/10/chartex" xmlns:cx5="http://schemas.microsoft.com/office/drawing/2016/5/11/chartex" xmlns:cx6="http://schemas.microsoft.com/office/drawing/2016/5/12/chartex" xmlns:cx7="http://schemas.microsoft.com/office/drawing/2016/5/13/chartex" xmlns:cx8="http://schemas.microsoft.com/office/drawing/2016/5/14/chartex" xmlns:mc="http://schemas.openxmlformats.org/markup-compatibility/2006" xmlns:aink="http://schemas.microsoft.com/office/drawing/2016/ink" xmlns:am3d="http://schemas.microsoft.com/office/drawing/2017/model3d" xmlns:o="urn:schemas-microsoft-com:office:office" xmlns:oel="http://schemas.microsoft.com/office/2019/extlst" xmlns:r="http://schemas.openxmlformats.org/officeDocument/2006/relationships" xmlns:m="http://schemas.openxmlformats.org/officeDocument/2006/math" xmlns:v="urn:schemas-microsoft-com:vml" xmlns:wp14="http://schemas.microsoft.com/office/word/2010/wordprocessingDrawing" xmlns:wp="http://schemas.openxmlformats.org/drawingml/2006/wordprocessingDrawing" xmlns:w10="urn:schemas-microsoft-com:office:word" xmlns:w="http://schemas.openxmlformats.org/wordprocessingml/2006/main" xmlns:w14="http://schemas.microsoft.com/office/word/2010/wordml" xmlns:w15="http://schemas.microsoft.com/office/word/2012/wordml" xmlns:w16cex="http://schemas.microsoft.com/office/word/2018/wordml/cex" xmlns:w16cid="http://schemas.microsoft.com/office/word/2016/wordml/cid" xmlns:w16="http://schemas.microsoft.com/office/word/2018/wordml" xmlns:w16sdtdh="http://schemas.microsoft.com/office/word/2020/wordml/sdtdatahash" xmlns:w16se="http://schemas.microsoft.com/office/word/2015/wordml/symex" xmlns:wpg="http://schemas.microsoft.com/office/word/2010/wordprocessingGroup" xmlns:wpi="http://schemas.microsoft.com/office/word/2010/wordprocessingInk" xmlns:wne="http://schemas.microsoft.com/office/word/2006/wordml" xmlns:wps="http://schemas.microsoft.com/office/word/2010/wordprocessingShape" mc:Ignorable="w14 w15 w16se w16cid w16 w16cex w16sdtdh wp14">
   <w:body>
     <w:p>
       <w:pPr>
         <w:keepNext/>
-        <w:spacing w:before="0" w:after="100" w:line="252" w:lineRule="auto"/>
+        <w:spacing w:after="100" w:line="252" w:lineRule="auto"/>
       </w:pPr>
       <w:r>
         <w:rPr>
@@ -20,12 +20,11 @@
     <w:p>
       <w:pPr>
         <w:keepNext/>
-        <w:spacing w:before="0" w:after="0" w:line="252" w:lineRule="auto"/>
+        <w:spacing w:after="0" w:line="252" w:lineRule="auto"/>
       </w:pPr>
       <w:r>
         <w:rPr>
           <w:rFonts w:ascii="Calibri" w:hAnsi="Calibri"/>
-          <w:b w:val="0"/>
           <w:color w:val="58645C"/>
           <w:sz w:val="20"/>
         </w:rPr>
@@ -49,14 +48,13 @@
     </w:p>
     <w:p>
       <w:pPr>
-        <w:pStyle w:val="Title"/>
+        <w:pStyle w:val="Ttulo"/>
         <w:keepNext/>
-        <w:spacing w:before="0" w:after="200" w:line="252" w:lineRule="auto"/>
+        <w:spacing w:line="252" w:lineRule="auto"/>
       </w:pPr>
       <w:r>
         <w:rPr>
           <w:rFonts w:ascii="Georgia" w:hAnsi="Georgia"/>
-          <w:b w:val="0"/>
           <w:color w:val="000000"/>
           <w:sz w:val="128"/>
         </w:rPr>
@@ -66,16 +64,22 @@
     <w:p>
       <w:pPr>
         <w:keepNext/>
-        <w:spacing w:before="0" w:after="340" w:line="252" w:lineRule="auto"/>
+        <w:spacing w:after="340" w:line="252" w:lineRule="auto"/>
       </w:pPr>
       <w:r>
         <w:rPr>
           <w:rFonts w:ascii="Calibri" w:hAnsi="Calibri"/>
-          <w:b w:val="0"/>
           <w:color w:val="000000"/>
           <w:sz w:val="46"/>
         </w:rPr>
         <w:t>Especificación de requisitos</w:t>
+      </w:r>
+      <w:r>
+        <w:rPr>
+          <w:rFonts w:ascii="Calibri" w:hAnsi="Calibri"/>
+          <w:color w:val="000000"/>
+          <w:sz w:val="46"/>
+        </w:rPr>
         <w:br/>
         <w:t>del software</w:t>
       </w:r>
@@ -83,14 +87,12 @@
     <w:p>
       <w:pPr>
         <w:keepNext/>
-        <w:spacing w:before="0" w:after="0" w:line="252" w:lineRule="auto"/>
+        <w:spacing w:after="0" w:line="252" w:lineRule="auto"/>
       </w:pPr>
       <w:r>
         <w:rPr>
           <w:rFonts w:ascii="Calibri" w:hAnsi="Calibri"/>
-          <w:b w:val="0"/>
           <w:color w:val="58645C"/>
-          <w:sz w:val="22"/>
         </w:rPr>
         <w:t>Café de especialidad, métodos y accesorios</w:t>
       </w:r>
@@ -98,7 +100,7 @@
     <w:p>
       <w:pPr>
         <w:keepNext/>
-        <w:spacing w:before="1300" w:after="200" w:line="252" w:lineRule="auto"/>
+        <w:spacing w:before="1300" w:line="252" w:lineRule="auto"/>
       </w:pPr>
       <w:r>
         <w:rPr>
@@ -113,16 +115,22 @@
     <w:p>
       <w:pPr>
         <w:keepNext/>
-        <w:spacing w:before="0" w:after="600" w:line="252" w:lineRule="auto"/>
+        <w:spacing w:after="600" w:line="252" w:lineRule="auto"/>
       </w:pPr>
       <w:r>
         <w:rPr>
           <w:rFonts w:ascii="Calibri" w:hAnsi="Calibri"/>
-          <w:b w:val="0"/>
           <w:color w:val="000000"/>
           <w:sz w:val="32"/>
         </w:rPr>
         <w:t>Brian Bravo</w:t>
+      </w:r>
+      <w:r>
+        <w:rPr>
+          <w:rFonts w:ascii="Calibri" w:hAnsi="Calibri"/>
+          <w:color w:val="000000"/>
+          <w:sz w:val="32"/>
+        </w:rPr>
         <w:br/>
         <w:t>Matías Guerra</w:t>
       </w:r>
@@ -130,7 +138,7 @@
     <w:p>
       <w:pPr>
         <w:keepNext/>
-        <w:spacing w:before="0" w:after="120" w:line="252" w:lineRule="auto"/>
+        <w:spacing w:after="120" w:line="252" w:lineRule="auto"/>
       </w:pPr>
       <w:r>
         <w:rPr>
@@ -139,20 +147,38 @@
           <w:color w:val="000000"/>
           <w:sz w:val="24"/>
         </w:rPr>
-        <w:t>Desarrollo FullStack II</w:t>
+        <w:t xml:space="preserve">Desarrollo </w:t>
+      </w:r>
+      <w:proofErr w:type="spellStart"/>
+      <w:r>
+        <w:rPr>
+          <w:rFonts w:ascii="Calibri" w:hAnsi="Calibri"/>
+          <w:b/>
+          <w:color w:val="000000"/>
+          <w:sz w:val="24"/>
+        </w:rPr>
+        <w:t>FullStack</w:t>
+      </w:r>
+      <w:proofErr w:type="spellEnd"/>
+      <w:r>
+        <w:rPr>
+          <w:rFonts w:ascii="Calibri" w:hAnsi="Calibri"/>
+          <w:b/>
+          <w:color w:val="000000"/>
+          <w:sz w:val="24"/>
+        </w:rPr>
+        <w:t xml:space="preserve"> II</w:t>
       </w:r>
     </w:p>
     <w:p>
       <w:pPr>
         <w:keepNext/>
-        <w:spacing w:before="0" w:after="500" w:line="252" w:lineRule="auto"/>
+        <w:spacing w:after="500" w:line="252" w:lineRule="auto"/>
       </w:pPr>
       <w:r>
         <w:rPr>
           <w:rFonts w:ascii="Calibri" w:hAnsi="Calibri"/>
-          <w:b w:val="0"/>
           <w:color w:val="000000"/>
-          <w:sz w:val="22"/>
         </w:rPr>
         <w:t>Evaluación parcial 1</w:t>
       </w:r>
@@ -160,12 +186,11 @@
     <w:p>
       <w:pPr>
         <w:keepNext/>
-        <w:spacing w:before="0" w:after="0" w:line="252" w:lineRule="auto"/>
+        <w:spacing w:after="0" w:line="252" w:lineRule="auto"/>
       </w:pPr>
       <w:r>
         <w:rPr>
           <w:rFonts w:ascii="Calibri" w:hAnsi="Calibri"/>
-          <w:b w:val="0"/>
           <w:color w:val="58645C"/>
           <w:sz w:val="20"/>
         </w:rPr>
@@ -3258,7 +3283,7 @@
               </w:rPr>
             </w:pPr>
             <w:r>
-              <w:t>12 de septiembre de 2026</w:t>
+              <w:t>12/09/2026</w:t>
             </w:r>
           </w:p>
         </w:tc>
@@ -3316,6 +3341,55 @@
             </w:pPr>
             <w:r>
               <w:t>Propuesta inicial de Grano y su catálogo de productos.</w:t>
+            </w:r>
+          </w:p>
+        </w:tc>
+      </w:tr>
+      <w:tr>
+        <w:trPr>
+          <w:trHeight w:val="1134"/>
+        </w:trPr>
+        <w:tc>
+          <w:tcPr>
+            <w:tcW w:w="1188" w:type="dxa"/>
+            <w:vAlign w:val="center"/>
+          </w:tcPr>
+          <w:p>
+            <w:r>
+              <w:t>22 de septiembre de 2026</w:t>
+            </w:r>
+          </w:p>
+        </w:tc>
+        <w:tc>
+          <w:tcPr>
+            <w:tcW w:w="1080" w:type="dxa"/>
+            <w:vAlign w:val="center"/>
+          </w:tcPr>
+          <w:p>
+            <w:r>
+              <w:t>1.2</w:t>
+            </w:r>
+          </w:p>
+        </w:tc>
+        <w:tc>
+          <w:tcPr>
+            <w:tcW w:w="3060" w:type="dxa"/>
+            <w:vAlign w:val="center"/>
+          </w:tcPr>
+          <w:p>
+            <w:r>
+              <w:t>Equipo del proyecto</w:t>
+            </w:r>
+          </w:p>
+        </w:tc>
+        <w:tc>
+          <w:tcPr>
+            <w:tcW w:w="3316" w:type="dxa"/>
+            <w:vAlign w:val="center"/>
+          </w:tcPr>
+          <w:p>
+            <w:r>
+              <w:t>Actualización de cuentas, pedidos, administración, mensajes de contacto, perfil de comprador y carrusel de Nosotros.</w:t>
             </w:r>
           </w:p>
         </w:tc>
@@ -3332,15 +3406,9 @@
           <w:p>
             <w:pPr>
               <w:rPr>
-                <w:rFonts w:asciiTheme="minorHAnsi" w:hAnsiTheme="minorHAnsi" w:cstheme="minorHAnsi"/>
-                <w:i/>
-                <w:szCs w:val="24"/>
-                <w:lang w:eastAsia="es-ES"/>
+                <w:iCs/>
               </w:rPr>
             </w:pPr>
-            <w:r>
-              <w:t>Pendiente</w:t>
-            </w:r>
           </w:p>
         </w:tc>
         <w:tc>
@@ -3348,38 +3416,14 @@
             <w:tcW w:w="1080" w:type="dxa"/>
             <w:vAlign w:val="center"/>
           </w:tcPr>
-          <w:p>
-            <w:pPr>
-              <w:rPr>
-                <w:rFonts w:asciiTheme="minorHAnsi" w:hAnsiTheme="minorHAnsi" w:cstheme="minorHAnsi"/>
-                <w:i/>
-                <w:szCs w:val="24"/>
-                <w:lang w:eastAsia="es-ES"/>
-              </w:rPr>
-            </w:pPr>
-            <w:r>
-              <w:t>Próxima revisión</w:t>
-            </w:r>
-          </w:p>
+          <w:p/>
         </w:tc>
         <w:tc>
           <w:tcPr>
             <w:tcW w:w="3060" w:type="dxa"/>
             <w:vAlign w:val="center"/>
           </w:tcPr>
-          <w:p>
-            <w:pPr>
-              <w:rPr>
-                <w:rFonts w:asciiTheme="minorHAnsi" w:hAnsiTheme="minorHAnsi" w:cstheme="minorHAnsi"/>
-                <w:i/>
-                <w:szCs w:val="24"/>
-                <w:lang w:eastAsia="es-ES"/>
-              </w:rPr>
-            </w:pPr>
-            <w:r>
-              <w:t>Equipo del proyecto</w:t>
-            </w:r>
-          </w:p>
+          <w:p/>
         </w:tc>
         <w:tc>
           <w:tcPr>
@@ -3389,15 +3433,9 @@
           <w:p>
             <w:pPr>
               <w:rPr>
-                <w:rFonts w:asciiTheme="minorHAnsi" w:hAnsiTheme="minorHAnsi" w:cstheme="minorHAnsi"/>
-                <w:i/>
-                <w:szCs w:val="24"/>
-                <w:lang w:eastAsia="es-ES"/>
+                <w:iCs/>
               </w:rPr>
             </w:pPr>
-            <w:r>
-              <w:t>Ajustes luego de revisar la propuesta con el docente.</w:t>
-            </w:r>
           </w:p>
         </w:tc>
       </w:tr>
@@ -3457,6 +3495,7 @@
           <w:rFonts w:eastAsia="Times New Roman" w:cstheme="minorHAnsi"/>
           <w:sz w:val="20"/>
           <w:szCs w:val="24"/>
+          <w:u w:val="single"/>
           <w:lang w:val="fr-FR"/>
         </w:rPr>
       </w:pPr>
@@ -3567,8 +3606,9 @@
           <w:szCs w:val="24"/>
         </w:rPr>
       </w:pPr>
-      <w:r>
-        <w:t>Versión propuesta para revisión. Todavía no cuenta con validación ni firmas.</w:t>
+      <w:r/>
+      <w:r>
+        <w:t>Versión funcional para revisión. Incluye catálogo, cuentas, pedidos, administración y contacto persistido localmente.</w:t>
       </w:r>
     </w:p>
     <w:p>
@@ -3973,8 +4013,9 @@
         <w:keepLines/>
         <w:spacing w:after="100"/>
       </w:pPr>
-      <w:r>
-        <w:t>El alcance considera una tienda con inicio, catálogo, fichas de productos, sección Nosotros y contacto. También se contempla una bolsa y pantallas de cuenta como parte de la estructura general. Las operaciones de compra, autenticación y administración se incorporarán en una etapa posterior.</w:t>
+      <w:r/>
+      <w:r>
+        <w:t>El alcance considera Inicio, catálogo, fichas de productos, sección Nosotros con carrusel, Contacto, carrito, registro e inicio de sesión, cuenta del comprador y panel de administración. La implementación actual funciona como una demostración estática y guarda cuentas, pedidos y mensajes en localStorage.</w:t>
       </w:r>
     </w:p>
     <w:p>
@@ -4199,8 +4240,9 @@
         <w:keepLines/>
         <w:spacing w:after="100"/>
       </w:pPr>
-      <w:r>
-        <w:t>La tienda permite conocer la propuesta, revisar el catálogo, consultar la ficha de cada producto y comunicarse mediante el formulario de contacto. En futuras etapas se podrán añadir cuentas, compras y herramientas para administrar el catálogo.</w:t>
+      <w:r/>
+      <w:r>
+        <w:t>La tienda permite conocer la propuesta, revisar el catálogo, consultar fichas, agregar productos al carrito, confirmar pedidos, crear cuentas de comprador, iniciar sesión, actualizar datos personales, cambiar contraseñas y enviar mensajes desde Contacto. El administrador puede revisar pedidos, usuarios y mensajes y crear cuentas con distintos roles.</w:t>
       </w:r>
     </w:p>
     <w:p>
@@ -4208,8 +4250,13 @@
         <w:keepLines/>
         <w:spacing w:after="100"/>
       </w:pPr>
-      <w:r>
-        <w:t>El recorrido principal comienza en Inicio, continúa en Nuestro café y permite abrir el detalle de cada producto. Nosotros explica la propuesta y Contacto ofrece un canal para realizar consultas.</w:t>
+      <w:r/>
+      <w:proofErr w:type="gramStart"/>
+      <w:r/>
+      <w:proofErr w:type="gramEnd"/>
+      <w:r/>
+      <w:r>
+        <w:t>El recorrido principal comienza en Inicio, continúa en Nuestro café y permite abrir el detalle de cada producto. Nosotros explica la propuesta mediante un carrusel de imágenes y Contacto permite enviar consultas que quedan disponibles para el administrador.</w:t>
       </w:r>
     </w:p>
     <w:p>
@@ -4241,8 +4288,9 @@
         <w:keepLines/>
         <w:spacing w:after="100"/>
       </w:pPr>
-      <w:r>
-        <w:t>El visitante necesita conocimientos básicos de navegación para recorrer el catálogo, leer las fichas y enviar una consulta. La información debe entenderse sin conocimientos técnicos.</w:t>
+      <w:r/>
+      <w:r>
+        <w:t>El visitante necesita conocimientos básicos de navegación para recorrer el catálogo y enviar una consulta. El comprador puede registrarse, iniciar sesión, confirmar pedidos y actualizar sus datos. El administrador revisa pedidos, usuarios y mensajes.</w:t>
       </w:r>
     </w:p>
     <w:p>
@@ -4292,8 +4340,9 @@
         <w:keepLines/>
         <w:spacing w:after="100"/>
       </w:pPr>
-      <w:r>
-        <w:t>Las acciones de compra, inicio de sesión y gestión de datos se habilitarán cuando se implemente la lógica correspondiente. La primera versión se concentra en validar la distribución y el contenido de las páginas.</w:t>
+      <w:r/>
+      <w:r>
+        <w:t>Las funciones de compra, inicio de sesión y gestión de datos están implementadas como demostración local mediante localStorage. No existe backend, pasarela de pago ni almacenamiento seguro para producción.</w:t>
       </w:r>
     </w:p>
     <w:p>
@@ -4368,8 +4417,9 @@
         <w:keepLines/>
         <w:spacing w:after="100"/>
       </w:pPr>
-      <w:r>
-        <w:t>En una siguiente etapa se podrán incorporar el carrito, las cuentas de clientes, los pagos, la actualización del catálogo, el stock y el seguimiento de pedidos. Estas mejoras dependerán de las prioridades definidas para la tienda.</w:t>
+      <w:r/>
+      <w:r>
+        <w:t>Como siguientes etapas se pueden incorporar un backend, autenticación segura, pagos, stock, despacho, respuestas a mensajes y gestión completa del catálogo. Estas mejoras dependerán de las prioridades definidas para la tienda.</w:t>
       </w:r>
     </w:p>
     <w:p>
@@ -4440,8 +4490,9 @@
         <w:keepLines/>
         <w:spacing w:after="100"/>
       </w:pPr>
-      <w:r>
-        <w:t>Las entradas se limitan a clics en enlaces y escritura de prueba en formularios. Las salidas son páginas estáticas, imágenes, textos y un video. Ninguna entrada modifica el contenido del catálogo o del panel.</w:t>
+      <w:r/>
+      <w:r>
+        <w:t>Las entradas incluyen navegación, formularios de autenticación, perfil, contacto y carrito. Las salidas son páginas, imágenes, tablas de pedidos, usuarios y mensajes. En esta demostración las acciones modifican localStorage del navegador.</w:t>
       </w:r>
     </w:p>
     <w:p>
@@ -4749,7 +4800,9 @@
         <w:rPr>
           <w:b/>
         </w:rPr>
-        <w:t>RF-05 Recorrer la vista del carrito</w:t>
+      </w:r>
+      <w:r>
+        <w:t>RF-05 Usar el carrito y confirmar pedidos</w:t>
       </w:r>
     </w:p>
     <w:p>
@@ -4758,8 +4811,9 @@
         <w:keepLines/>
         <w:spacing w:after="100"/>
       </w:pPr>
-      <w:r>
-        <w:t>La bolsa debe mostrar su estado vacío y un enlace para seguir mirando el catálogo. Actor: Visitante.</w:t>
+      <w:r/>
+      <w:r>
+        <w:t>El carrito debe permitir agregar, revisar y quitar productos, calcular el total y confirmar un pedido para un comprador autenticado. Actor: Comprador.</w:t>
       </w:r>
     </w:p>
     <w:p>
@@ -4767,8 +4821,9 @@
         <w:keepLines/>
         <w:spacing w:after="100"/>
       </w:pPr>
-      <w:r>
-        <w:t>Lo revisamos así: La bolsa muestra cero productos, explica que no permite comprar y tiene el botón de pago deshabilitado.</w:t>
+      <w:r/>
+      <w:r>
+        <w:t>Lo revisamos así: El carrito actualiza cantidades y total, solicita iniciar sesión si corresponde y registra el pedido con estado Recibido.</w:t>
       </w:r>
     </w:p>
     <w:p>
@@ -4781,7 +4836,9 @@
         <w:rPr>
           <w:b/>
         </w:rPr>
-        <w:t>RF-06 Ver las pantallas de cuenta</w:t>
+      </w:r>
+      <w:r>
+        <w:t>RF-06 Gestionar cuentas e inicio de sesión</w:t>
       </w:r>
     </w:p>
     <w:p>
@@ -4790,8 +4847,9 @@
         <w:keepLines/>
         <w:spacing w:after="100"/>
       </w:pPr>
-      <w:r>
-        <w:t>El sitio debe incluir las vistas de inicio de sesión y registro con campos etiquetados y enlaces entre ambas. Actor: Visitante.</w:t>
+      <w:r/>
+      <w:r>
+        <w:t>El sitio debe permitir registrar compradores, iniciar sesión como comprador o administrador, cerrar sesión y cambiar la contraseña. Actor: Comprador y Administrador.</w:t>
       </w:r>
     </w:p>
     <w:p>
@@ -4799,8 +4857,9 @@
         <w:keepLines/>
         <w:spacing w:after="100"/>
       </w:pPr>
-      <w:r>
-        <w:t>Lo revisamos así: Se puede ir de ingreso a registro y volver; escribir en los campos no crea una cuenta ni inicia sesión.</w:t>
+      <w:r/>
+      <w:r>
+        <w:t>Lo revisamos así: Un comprador puede crear su cuenta e iniciar sesión; el administrador inicial es admin@duocuc.cl con contraseña 1234; ambos pueden cerrar sesión.</w:t>
       </w:r>
     </w:p>
     <w:p>
@@ -4813,8 +4872,9 @@
         <w:rPr>
           <w:b/>
         </w:rPr>
-        <w:lastRenderedPageBreak/>
-        <w:t>RF-07 Conocer el proyecto y el contacto</w:t>
+      </w:r>
+      <w:r>
+        <w:t>RF-07 Conocer el proyecto y enviar mensajes</w:t>
       </w:r>
     </w:p>
     <w:p>
@@ -4823,8 +4883,12 @@
         <w:keepLines/>
         <w:spacing w:after="100"/>
       </w:pPr>
-      <w:r>
-        <w:t>Nosotros debe presentar Grano y sus integrantes; Contacto debe mostrar nombre, correo y mensaje. Actor: Visitante.</w:t>
+      <w:proofErr w:type="gramStart"/>
+      <w:r/>
+      <w:proofErr w:type="gramEnd"/>
+      <w:r/>
+      <w:r>
+        <w:t>Nosotros debe presentar Grano mediante un carrusel; Contacto debe permitir enviar un mensaje. El administrador debe poder consultar los mensajes recibidos. Actor: Visitante y Administrador.</w:t>
       </w:r>
     </w:p>
     <w:p>
@@ -4832,8 +4896,13 @@
         <w:keepLines/>
         <w:spacing w:after="100"/>
       </w:pPr>
-      <w:r>
-        <w:t>Lo revisamos así: Nosotros presenta la propuesta de Grano y Contacto muestra campos con etiquetas claras.</w:t>
+      <w:r/>
+      <w:proofErr w:type="gramStart"/>
+      <w:r/>
+      <w:proofErr w:type="gramEnd"/>
+      <w:r/>
+      <w:r>
+        <w:t>Lo revisamos así: Nosotros muestra imágenes navegables y Contacto registra el mensaje con fecha y estado para verlo en administración.</w:t>
       </w:r>
     </w:p>
     <w:p>
@@ -4878,7 +4947,9 @@
         <w:rPr>
           <w:b/>
         </w:rPr>
-        <w:t>RF-09 Recorrer la administración</w:t>
+      </w:r>
+      <w:r>
+        <w:t>RF-09 Revisar la administración</w:t>
       </w:r>
     </w:p>
     <w:p>
@@ -4887,8 +4958,9 @@
         <w:keepLines/>
         <w:spacing w:after="100"/>
       </w:pPr>
-      <w:r>
-        <w:t>La tienda debe presentar Inicio, Nuestro café, Nosotros y Contacto. Actor: Visitante.</w:t>
+      <w:r/>
+      <w:r>
+        <w:t>El panel debe mostrar pedidos de clientes, productos comprados, usuarios registrados y mensajes enviados por clientes. Actor: Administrador.</w:t>
       </w:r>
     </w:p>
     <w:p>
@@ -4896,8 +4968,9 @@
         <w:keepLines/>
         <w:spacing w:after="100"/>
       </w:pPr>
-      <w:r>
-        <w:t>Lo revisamos así: El enlace del pie abre el panel; su menú permite acceder a las cuatro secciones y ver una orden.</w:t>
+      <w:r/>
+      <w:r>
+        <w:t>Lo revisamos así: El administrador inicia sesión y ve las tablas de pedidos, usuarios y mensajes; también puede crear compradores y administradores.</w:t>
       </w:r>
     </w:p>
     <w:p>
@@ -4910,7 +4983,9 @@
         <w:rPr>
           <w:b/>
         </w:rPr>
-        <w:t>RF-10 Ver formularios administrativos</w:t>
+      </w:r>
+      <w:r>
+        <w:t>RF-10 Crear usuarios con roles</w:t>
       </w:r>
     </w:p>
     <w:p>
@@ -4919,8 +4994,9 @@
         <w:keepLines/>
         <w:spacing w:after="100"/>
       </w:pPr>
-      <w:r>
-        <w:t>El catálogo debe llevar a la ficha de cada producto. Actor: Visitante.</w:t>
+      <w:r/>
+      <w:r>
+        <w:t>El administrador debe poder crear nuevos usuarios y definir si cada cuenta corresponde a un comprador o administrador. Actor: Administrador.</w:t>
       </w:r>
     </w:p>
     <w:p>
@@ -4928,8 +5004,9 @@
         <w:keepLines/>
         <w:spacing w:after="100"/>
       </w:pPr>
-      <w:r>
-        <w:t>Lo revisamos así: Las tarjetas abren la ficha correspondiente y el visitante puede volver al catálogo.</w:t>
+      <w:r/>
+      <w:r>
+        <w:t>Lo revisamos así: El formulario administrativo crea usuarios con rol comprador o administrador y actualiza el listado sin recargar la página.</w:t>
       </w:r>
     </w:p>
     <w:p>
@@ -4997,7 +5074,15 @@
         <w:spacing w:after="100"/>
       </w:pPr>
       <w:r>
-        <w:t>En esta etapa no fijamos tiempos de respuesta de un servidor ni cantidades de transacciones por segundo, porque no hay backend ni compras que procesar.</w:t>
+        <w:t xml:space="preserve">En esta etapa no fijamos tiempos de respuesta de un servidor ni cantidades de transacciones por segundo, porque no hay </w:t>
+      </w:r>
+      <w:proofErr w:type="spellStart"/>
+      <w:r>
+        <w:t>backend</w:t>
+      </w:r>
+      <w:proofErr w:type="spellEnd"/>
+      <w:r>
+        <w:t xml:space="preserve"> ni compras que procesar.</w:t>
       </w:r>
     </w:p>
     <w:p>
@@ -5029,8 +5114,9 @@
         <w:keepLines/>
         <w:spacing w:after="100"/>
       </w:pPr>
-      <w:r>
-        <w:t>RNF-07 Proteger los datos del visitante. La información de contacto debe tratarse con cuidado y solo utilizarse para responder la consulta.</w:t>
+      <w:r/>
+      <w:r>
+        <w:t>RNF-07 Tratar los datos personales con cuidado. La información de cuenta, perfil, pedidos y contacto debe conservarse dentro del alcance de la demostración.</w:t>
       </w:r>
     </w:p>
     <w:p>
@@ -5038,8 +5124,9 @@
         <w:keepLines/>
         <w:spacing w:after="100"/>
       </w:pPr>
-      <w:r>
-        <w:t>El panel no protege información ni simula un inicio de sesión. Solo contiene registros ficticios. La autenticación y los permisos se diseñarán cuando exista una aplicación funcional.</w:t>
+      <w:r/>
+      <w:r>
+        <w:t>La demostración guarda datos en localStorage y restringe visualmente el panel según el rol. Para producción se requiere backend, hash de contraseñas, sesiones seguras y controles de autorización.</w:t>
       </w:r>
     </w:p>
     <w:p>
@@ -5198,8 +5285,15 @@
         <w:spacing w:after="100"/>
       </w:pPr>
       <w:r>
-        <w:lastRenderedPageBreak/>
-        <w:t>RNF-03 Permitir navegación accesible. Los enlaces deben mostrar el foco al usar Tab. Cada campo tiene etiqueta, cada imagen tiene texto alternativo y existe un enlace para saltar al contenido.</w:t>
+        <w:t xml:space="preserve">RNF-03 Permitir navegación accesible. Los enlaces deben mostrar el foco al usar </w:t>
+      </w:r>
+      <w:proofErr w:type="spellStart"/>
+      <w:r>
+        <w:t>Tab</w:t>
+      </w:r>
+      <w:proofErr w:type="spellEnd"/>
+      <w:r>
+        <w:t>. Cada campo tiene etiqueta, cada imagen tiene texto alternativo y existe un enlace para saltar al contenido.</w:t>
       </w:r>
     </w:p>
     <w:p>
@@ -5224,6 +5318,7 @@
         <w:rPr>
           <w:rFonts w:asciiTheme="minorHAnsi" w:hAnsiTheme="minorHAnsi" w:cstheme="minorHAnsi"/>
         </w:rPr>
+        <w:lastRenderedPageBreak/>
         <w:t>3.4</w:t>
       </w:r>
       <w:r>
@@ -5240,8 +5335,9 @@
         <w:keepLines/>
         <w:spacing w:after="100"/>
       </w:pPr>
-      <w:r>
-        <w:t>La propuesta se entrega con los archivos del sitio, las dos planillas completadas y esta ERS. Las planillas repiten los mismos 20 requisitos para mantener consistencia entre los anexos. La segunda conserva el formato del ejemplo, pero sus filas corresponden a Grano.</w:t>
+      <w:r/>
+      <w:r>
+        <w:t>La propuesta se entrega con los archivos del sitio, la planilla de requisitos actualizada y esta ERS. La documentación refleja las funciones implementadas en la versión actual.</w:t>
       </w:r>
     </w:p>
     <w:p>
@@ -5276,7 +5372,7 @@
 </file>
 
 <file path=word/endnotes.xml><?xml version="1.0" encoding="utf-8"?>
-<w:endnotes xmlns:wpc="http://schemas.microsoft.com/office/word/2010/wordprocessingCanvas" xmlns:cx="http://schemas.microsoft.com/office/drawing/2014/chartex" xmlns:cx1="http://schemas.microsoft.com/office/drawing/2015/9/8/chartex" xmlns:cx2="http://schemas.microsoft.com/office/drawing/2015/10/21/chartex" xmlns:cx3="http://schemas.microsoft.com/office/drawing/2016/5/9/chartex" xmlns:cx4="http://schemas.microsoft.com/office/drawing/2016/5/10/chartex" xmlns:cx5="http://schemas.microsoft.com/office/drawing/2016/5/11/chartex" xmlns:cx6="http://schemas.microsoft.com/office/drawing/2016/5/12/chartex" xmlns:cx7="http://schemas.microsoft.com/office/drawing/2016/5/13/chartex" xmlns:cx8="http://schemas.microsoft.com/office/drawing/2016/5/14/chartex" xmlns:mc="http://schemas.openxmlformats.org/markup-compatibility/2006" xmlns:aink="http://schemas.microsoft.com/office/drawing/2016/ink" xmlns:am3d="http://schemas.microsoft.com/office/drawing/2017/model3d" xmlns:o="urn:schemas-microsoft-com:office:office" xmlns:oel="http://schemas.microsoft.com/office/2019/extlst" xmlns:r="http://schemas.openxmlformats.org/officeDocument/2006/relationships" xmlns:m="http://schemas.openxmlformats.org/officeDocument/2006/math" xmlns:v="urn:schemas-microsoft-com:vml" xmlns:wp14="http://schemas.microsoft.com/office/word/2010/wordprocessingDrawing" xmlns:wp="http://schemas.openxmlformats.org/drawingml/2006/wordprocessingDrawing" xmlns:w10="urn:schemas-microsoft-com:office:word" xmlns:w="http://schemas.openxmlformats.org/wordprocessingml/2006/main" xmlns:w14="http://schemas.microsoft.com/office/word/2010/wordml" xmlns:w15="http://schemas.microsoft.com/office/word/2012/wordml" xmlns:w16cex="http://schemas.microsoft.com/office/word/2018/wordml/cex" xmlns:w16cid="http://schemas.microsoft.com/office/word/2016/wordml/cid" xmlns:w16="http://schemas.microsoft.com/office/word/2018/wordml" xmlns:w16du="http://schemas.microsoft.com/office/word/2023/wordml/word16du" xmlns:w16sdtdh="http://schemas.microsoft.com/office/word/2020/wordml/sdtdatahash" xmlns:w16sdtfl="http://schemas.microsoft.com/office/word/2024/wordml/sdtformatlock" xmlns:w16se="http://schemas.microsoft.com/office/word/2015/wordml/symex" xmlns:wpg="http://schemas.microsoft.com/office/word/2010/wordprocessingGroup" xmlns:wpi="http://schemas.microsoft.com/office/word/2010/wordprocessingInk" xmlns:wne="http://schemas.microsoft.com/office/word/2006/wordml" xmlns:wps="http://schemas.microsoft.com/office/word/2010/wordprocessingShape" mc:Ignorable="w14 w15 w16se w16cid w16 w16cex w16sdtdh w16sdtfl w16du wp14">
+<w:endnotes xmlns:wpc="http://schemas.microsoft.com/office/word/2010/wordprocessingCanvas" xmlns:cx="http://schemas.microsoft.com/office/drawing/2014/chartex" xmlns:cx1="http://schemas.microsoft.com/office/drawing/2015/9/8/chartex" xmlns:cx2="http://schemas.microsoft.com/office/drawing/2015/10/21/chartex" xmlns:cx3="http://schemas.microsoft.com/office/drawing/2016/5/9/chartex" xmlns:cx4="http://schemas.microsoft.com/office/drawing/2016/5/10/chartex" xmlns:cx5="http://schemas.microsoft.com/office/drawing/2016/5/11/chartex" xmlns:cx6="http://schemas.microsoft.com/office/drawing/2016/5/12/chartex" xmlns:cx7="http://schemas.microsoft.com/office/drawing/2016/5/13/chartex" xmlns:cx8="http://schemas.microsoft.com/office/drawing/2016/5/14/chartex" xmlns:mc="http://schemas.openxmlformats.org/markup-compatibility/2006" xmlns:aink="http://schemas.microsoft.com/office/drawing/2016/ink" xmlns:am3d="http://schemas.microsoft.com/office/drawing/2017/model3d" xmlns:o="urn:schemas-microsoft-com:office:office" xmlns:oel="http://schemas.microsoft.com/office/2019/extlst" xmlns:r="http://schemas.openxmlformats.org/officeDocument/2006/relationships" xmlns:m="http://schemas.openxmlformats.org/officeDocument/2006/math" xmlns:v="urn:schemas-microsoft-com:vml" xmlns:wp14="http://schemas.microsoft.com/office/word/2010/wordprocessingDrawing" xmlns:wp="http://schemas.openxmlformats.org/drawingml/2006/wordprocessingDrawing" xmlns:w10="urn:schemas-microsoft-com:office:word" xmlns:w="http://schemas.openxmlformats.org/wordprocessingml/2006/main" xmlns:w14="http://schemas.microsoft.com/office/word/2010/wordml" xmlns:w15="http://schemas.microsoft.com/office/word/2012/wordml" xmlns:w16cex="http://schemas.microsoft.com/office/word/2018/wordml/cex" xmlns:w16cid="http://schemas.microsoft.com/office/word/2016/wordml/cid" xmlns:w16="http://schemas.microsoft.com/office/word/2018/wordml" xmlns:w16sdtdh="http://schemas.microsoft.com/office/word/2020/wordml/sdtdatahash" xmlns:w16se="http://schemas.microsoft.com/office/word/2015/wordml/symex" xmlns:wpg="http://schemas.microsoft.com/office/word/2010/wordprocessingGroup" xmlns:wpi="http://schemas.microsoft.com/office/word/2010/wordprocessingInk" xmlns:wne="http://schemas.microsoft.com/office/word/2006/wordml" xmlns:wps="http://schemas.microsoft.com/office/word/2010/wordprocessingShape" mc:Ignorable="w14 w15 w16se w16cid w16 w16cex w16sdtdh wp14">
   <w:endnote w:type="separator" w:id="-1">
     <w:p>
       <w:pPr>
@@ -5301,7 +5397,7 @@
 </file>
 
 <file path=word/footer1.xml><?xml version="1.0" encoding="utf-8"?>
-<w:ftr xmlns:wpc="http://schemas.microsoft.com/office/word/2010/wordprocessingCanvas" xmlns:cx="http://schemas.microsoft.com/office/drawing/2014/chartex" xmlns:cx1="http://schemas.microsoft.com/office/drawing/2015/9/8/chartex" xmlns:cx2="http://schemas.microsoft.com/office/drawing/2015/10/21/chartex" xmlns:cx3="http://schemas.microsoft.com/office/drawing/2016/5/9/chartex" xmlns:cx4="http://schemas.microsoft.com/office/drawing/2016/5/10/chartex" xmlns:cx5="http://schemas.microsoft.com/office/drawing/2016/5/11/chartex" xmlns:cx6="http://schemas.microsoft.com/office/drawing/2016/5/12/chartex" xmlns:cx7="http://schemas.microsoft.com/office/drawing/2016/5/13/chartex" xmlns:cx8="http://schemas.microsoft.com/office/drawing/2016/5/14/chartex" xmlns:mc="http://schemas.openxmlformats.org/markup-compatibility/2006" xmlns:aink="http://schemas.microsoft.com/office/drawing/2016/ink" xmlns:am3d="http://schemas.microsoft.com/office/drawing/2017/model3d" xmlns:o="urn:schemas-microsoft-com:office:office" xmlns:oel="http://schemas.microsoft.com/office/2019/extlst" xmlns:r="http://schemas.openxmlformats.org/officeDocument/2006/relationships" xmlns:m="http://schemas.openxmlformats.org/officeDocument/2006/math" xmlns:v="urn:schemas-microsoft-com:vml" xmlns:wp14="http://schemas.microsoft.com/office/word/2010/wordprocessingDrawing" xmlns:wp="http://schemas.openxmlformats.org/drawingml/2006/wordprocessingDrawing" xmlns:w10="urn:schemas-microsoft-com:office:word" xmlns:w="http://schemas.openxmlformats.org/wordprocessingml/2006/main" xmlns:w14="http://schemas.microsoft.com/office/word/2010/wordml" xmlns:w15="http://schemas.microsoft.com/office/word/2012/wordml" xmlns:w16cex="http://schemas.microsoft.com/office/word/2018/wordml/cex" xmlns:w16cid="http://schemas.microsoft.com/office/word/2016/wordml/cid" xmlns:w16="http://schemas.microsoft.com/office/word/2018/wordml" xmlns:w16du="http://schemas.microsoft.com/office/word/2023/wordml/word16du" xmlns:w16sdtdh="http://schemas.microsoft.com/office/word/2020/wordml/sdtdatahash" xmlns:w16sdtfl="http://schemas.microsoft.com/office/word/2024/wordml/sdtformatlock" xmlns:w16se="http://schemas.microsoft.com/office/word/2015/wordml/symex" xmlns:wpg="http://schemas.microsoft.com/office/word/2010/wordprocessingGroup" xmlns:wpi="http://schemas.microsoft.com/office/word/2010/wordprocessingInk" xmlns:wne="http://schemas.microsoft.com/office/word/2006/wordml" xmlns:wps="http://schemas.microsoft.com/office/word/2010/wordprocessingShape" mc:Ignorable="w14 w15 w16se w16cid w16 w16cex w16sdtdh w16sdtfl w16du wp14">
+<w:ftr xmlns:wpc="http://schemas.microsoft.com/office/word/2010/wordprocessingCanvas" xmlns:cx="http://schemas.microsoft.com/office/drawing/2014/chartex" xmlns:cx1="http://schemas.microsoft.com/office/drawing/2015/9/8/chartex" xmlns:cx2="http://schemas.microsoft.com/office/drawing/2015/10/21/chartex" xmlns:cx3="http://schemas.microsoft.com/office/drawing/2016/5/9/chartex" xmlns:cx4="http://schemas.microsoft.com/office/drawing/2016/5/10/chartex" xmlns:cx5="http://schemas.microsoft.com/office/drawing/2016/5/11/chartex" xmlns:cx6="http://schemas.microsoft.com/office/drawing/2016/5/12/chartex" xmlns:cx7="http://schemas.microsoft.com/office/drawing/2016/5/13/chartex" xmlns:cx8="http://schemas.microsoft.com/office/drawing/2016/5/14/chartex" xmlns:mc="http://schemas.openxmlformats.org/markup-compatibility/2006" xmlns:aink="http://schemas.microsoft.com/office/drawing/2016/ink" xmlns:am3d="http://schemas.microsoft.com/office/drawing/2017/model3d" xmlns:o="urn:schemas-microsoft-com:office:office" xmlns:oel="http://schemas.microsoft.com/office/2019/extlst" xmlns:r="http://schemas.openxmlformats.org/officeDocument/2006/relationships" xmlns:m="http://schemas.openxmlformats.org/officeDocument/2006/math" xmlns:v="urn:schemas-microsoft-com:vml" xmlns:wp14="http://schemas.microsoft.com/office/word/2010/wordprocessingDrawing" xmlns:wp="http://schemas.openxmlformats.org/drawingml/2006/wordprocessingDrawing" xmlns:w10="urn:schemas-microsoft-com:office:word" xmlns:w="http://schemas.openxmlformats.org/wordprocessingml/2006/main" xmlns:w14="http://schemas.microsoft.com/office/word/2010/wordml" xmlns:w15="http://schemas.microsoft.com/office/word/2012/wordml" xmlns:w16cex="http://schemas.microsoft.com/office/word/2018/wordml/cex" xmlns:w16cid="http://schemas.microsoft.com/office/word/2016/wordml/cid" xmlns:w16="http://schemas.microsoft.com/office/word/2018/wordml" xmlns:w16sdtdh="http://schemas.microsoft.com/office/word/2020/wordml/sdtdatahash" xmlns:w16se="http://schemas.microsoft.com/office/word/2015/wordml/symex" xmlns:wpg="http://schemas.microsoft.com/office/word/2010/wordprocessingGroup" xmlns:wpi="http://schemas.microsoft.com/office/word/2010/wordprocessingInk" xmlns:wne="http://schemas.microsoft.com/office/word/2006/wordml" xmlns:wps="http://schemas.microsoft.com/office/word/2010/wordprocessingShape" mc:Ignorable="w14 w15 w16se w16cid w16 w16cex w16sdtdh wp14">
   <w:sdt>
     <w:sdtPr>
       <w:id w:val="14532529"/>
@@ -5310,7 +5406,6 @@
         <w:docPartUnique/>
       </w:docPartObj>
     </w:sdtPr>
-    <w:sdtEndPr/>
     <w:sdtContent>
       <w:p>
         <w:pPr>
@@ -5350,7 +5445,7 @@
 </file>
 
 <file path=word/footnotes.xml><?xml version="1.0" encoding="utf-8"?>
-<w:footnotes xmlns:wpc="http://schemas.microsoft.com/office/word/2010/wordprocessingCanvas" xmlns:cx="http://schemas.microsoft.com/office/drawing/2014/chartex" xmlns:cx1="http://schemas.microsoft.com/office/drawing/2015/9/8/chartex" xmlns:cx2="http://schemas.microsoft.com/office/drawing/2015/10/21/chartex" xmlns:cx3="http://schemas.microsoft.com/office/drawing/2016/5/9/chartex" xmlns:cx4="http://schemas.microsoft.com/office/drawing/2016/5/10/chartex" xmlns:cx5="http://schemas.microsoft.com/office/drawing/2016/5/11/chartex" xmlns:cx6="http://schemas.microsoft.com/office/drawing/2016/5/12/chartex" xmlns:cx7="http://schemas.microsoft.com/office/drawing/2016/5/13/chartex" xmlns:cx8="http://schemas.microsoft.com/office/drawing/2016/5/14/chartex" xmlns:mc="http://schemas.openxmlformats.org/markup-compatibility/2006" xmlns:aink="http://schemas.microsoft.com/office/drawing/2016/ink" xmlns:am3d="http://schemas.microsoft.com/office/drawing/2017/model3d" xmlns:o="urn:schemas-microsoft-com:office:office" xmlns:oel="http://schemas.microsoft.com/office/2019/extlst" xmlns:r="http://schemas.openxmlformats.org/officeDocument/2006/relationships" xmlns:m="http://schemas.openxmlformats.org/officeDocument/2006/math" xmlns:v="urn:schemas-microsoft-com:vml" xmlns:wp14="http://schemas.microsoft.com/office/word/2010/wordprocessingDrawing" xmlns:wp="http://schemas.openxmlformats.org/drawingml/2006/wordprocessingDrawing" xmlns:w10="urn:schemas-microsoft-com:office:word" xmlns:w="http://schemas.openxmlformats.org/wordprocessingml/2006/main" xmlns:w14="http://schemas.microsoft.com/office/word/2010/wordml" xmlns:w15="http://schemas.microsoft.com/office/word/2012/wordml" xmlns:w16cex="http://schemas.microsoft.com/office/word/2018/wordml/cex" xmlns:w16cid="http://schemas.microsoft.com/office/word/2016/wordml/cid" xmlns:w16="http://schemas.microsoft.com/office/word/2018/wordml" xmlns:w16du="http://schemas.microsoft.com/office/word/2023/wordml/word16du" xmlns:w16sdtdh="http://schemas.microsoft.com/office/word/2020/wordml/sdtdatahash" xmlns:w16sdtfl="http://schemas.microsoft.com/office/word/2024/wordml/sdtformatlock" xmlns:w16se="http://schemas.microsoft.com/office/word/2015/wordml/symex" xmlns:wpg="http://schemas.microsoft.com/office/word/2010/wordprocessingGroup" xmlns:wpi="http://schemas.microsoft.com/office/word/2010/wordprocessingInk" xmlns:wne="http://schemas.microsoft.com/office/word/2006/wordml" xmlns:wps="http://schemas.microsoft.com/office/word/2010/wordprocessingShape" mc:Ignorable="w14 w15 w16se w16cid w16 w16cex w16sdtdh w16sdtfl w16du wp14">
+<w:footnotes xmlns:wpc="http://schemas.microsoft.com/office/word/2010/wordprocessingCanvas" xmlns:cx="http://schemas.microsoft.com/office/drawing/2014/chartex" xmlns:cx1="http://schemas.microsoft.com/office/drawing/2015/9/8/chartex" xmlns:cx2="http://schemas.microsoft.com/office/drawing/2015/10/21/chartex" xmlns:cx3="http://schemas.microsoft.com/office/drawing/2016/5/9/chartex" xmlns:cx4="http://schemas.microsoft.com/office/drawing/2016/5/10/chartex" xmlns:cx5="http://schemas.microsoft.com/office/drawing/2016/5/11/chartex" xmlns:cx6="http://schemas.microsoft.com/office/drawing/2016/5/12/chartex" xmlns:cx7="http://schemas.microsoft.com/office/drawing/2016/5/13/chartex" xmlns:cx8="http://schemas.microsoft.com/office/drawing/2016/5/14/chartex" xmlns:mc="http://schemas.openxmlformats.org/markup-compatibility/2006" xmlns:aink="http://schemas.microsoft.com/office/drawing/2016/ink" xmlns:am3d="http://schemas.microsoft.com/office/drawing/2017/model3d" xmlns:o="urn:schemas-microsoft-com:office:office" xmlns:oel="http://schemas.microsoft.com/office/2019/extlst" xmlns:r="http://schemas.openxmlformats.org/officeDocument/2006/relationships" xmlns:m="http://schemas.openxmlformats.org/officeDocument/2006/math" xmlns:v="urn:schemas-microsoft-com:vml" xmlns:wp14="http://schemas.microsoft.com/office/word/2010/wordprocessingDrawing" xmlns:wp="http://schemas.openxmlformats.org/drawingml/2006/wordprocessingDrawing" xmlns:w10="urn:schemas-microsoft-com:office:word" xmlns:w="http://schemas.openxmlformats.org/wordprocessingml/2006/main" xmlns:w14="http://schemas.microsoft.com/office/word/2010/wordml" xmlns:w15="http://schemas.microsoft.com/office/word/2012/wordml" xmlns:w16cex="http://schemas.microsoft.com/office/word/2018/wordml/cex" xmlns:w16cid="http://schemas.microsoft.com/office/word/2016/wordml/cid" xmlns:w16="http://schemas.microsoft.com/office/word/2018/wordml" xmlns:w16sdtdh="http://schemas.microsoft.com/office/word/2020/wordml/sdtdatahash" xmlns:w16se="http://schemas.microsoft.com/office/word/2015/wordml/symex" xmlns:wpg="http://schemas.microsoft.com/office/word/2010/wordprocessingGroup" xmlns:wpi="http://schemas.microsoft.com/office/word/2010/wordprocessingInk" xmlns:wne="http://schemas.microsoft.com/office/word/2006/wordml" xmlns:wps="http://schemas.microsoft.com/office/word/2010/wordprocessingShape" mc:Ignorable="w14 w15 w16se w16cid w16 w16cex w16sdtdh wp14">
   <w:footnote w:type="separator" w:id="-1">
     <w:p>
       <w:pPr>
@@ -5375,7 +5470,7 @@
 </file>
 
 <file path=word/header1.xml><?xml version="1.0" encoding="utf-8"?>
-<w:hdr xmlns:wpc="http://schemas.microsoft.com/office/word/2010/wordprocessingCanvas" xmlns:cx="http://schemas.microsoft.com/office/drawing/2014/chartex" xmlns:cx1="http://schemas.microsoft.com/office/drawing/2015/9/8/chartex" xmlns:cx2="http://schemas.microsoft.com/office/drawing/2015/10/21/chartex" xmlns:cx3="http://schemas.microsoft.com/office/drawing/2016/5/9/chartex" xmlns:cx4="http://schemas.microsoft.com/office/drawing/2016/5/10/chartex" xmlns:cx5="http://schemas.microsoft.com/office/drawing/2016/5/11/chartex" xmlns:cx6="http://schemas.microsoft.com/office/drawing/2016/5/12/chartex" xmlns:cx7="http://schemas.microsoft.com/office/drawing/2016/5/13/chartex" xmlns:cx8="http://schemas.microsoft.com/office/drawing/2016/5/14/chartex" xmlns:mc="http://schemas.openxmlformats.org/markup-compatibility/2006" xmlns:aink="http://schemas.microsoft.com/office/drawing/2016/ink" xmlns:am3d="http://schemas.microsoft.com/office/drawing/2017/model3d" xmlns:o="urn:schemas-microsoft-com:office:office" xmlns:oel="http://schemas.microsoft.com/office/2019/extlst" xmlns:r="http://schemas.openxmlformats.org/officeDocument/2006/relationships" xmlns:m="http://schemas.openxmlformats.org/officeDocument/2006/math" xmlns:v="urn:schemas-microsoft-com:vml" xmlns:wp14="http://schemas.microsoft.com/office/word/2010/wordprocessingDrawing" xmlns:wp="http://schemas.openxmlformats.org/drawingml/2006/wordprocessingDrawing" xmlns:w10="urn:schemas-microsoft-com:office:word" xmlns:w="http://schemas.openxmlformats.org/wordprocessingml/2006/main" xmlns:w14="http://schemas.microsoft.com/office/word/2010/wordml" xmlns:w15="http://schemas.microsoft.com/office/word/2012/wordml" xmlns:w16cex="http://schemas.microsoft.com/office/word/2018/wordml/cex" xmlns:w16cid="http://schemas.microsoft.com/office/word/2016/wordml/cid" xmlns:w16="http://schemas.microsoft.com/office/word/2018/wordml" xmlns:w16du="http://schemas.microsoft.com/office/word/2023/wordml/word16du" xmlns:w16sdtdh="http://schemas.microsoft.com/office/word/2020/wordml/sdtdatahash" xmlns:w16sdtfl="http://schemas.microsoft.com/office/word/2024/wordml/sdtformatlock" xmlns:w16se="http://schemas.microsoft.com/office/word/2015/wordml/symex" xmlns:wpg="http://schemas.microsoft.com/office/word/2010/wordprocessingGroup" xmlns:wpi="http://schemas.microsoft.com/office/word/2010/wordprocessingInk" xmlns:wne="http://schemas.microsoft.com/office/word/2006/wordml" xmlns:wps="http://schemas.microsoft.com/office/word/2010/wordprocessingShape" mc:Ignorable="w14 w15 w16se w16cid w16 w16cex w16sdtdh w16sdtfl w16du wp14">
+<w:hdr xmlns:wpc="http://schemas.microsoft.com/office/word/2010/wordprocessingCanvas" xmlns:cx="http://schemas.microsoft.com/office/drawing/2014/chartex" xmlns:cx1="http://schemas.microsoft.com/office/drawing/2015/9/8/chartex" xmlns:cx2="http://schemas.microsoft.com/office/drawing/2015/10/21/chartex" xmlns:cx3="http://schemas.microsoft.com/office/drawing/2016/5/9/chartex" xmlns:cx4="http://schemas.microsoft.com/office/drawing/2016/5/10/chartex" xmlns:cx5="http://schemas.microsoft.com/office/drawing/2016/5/11/chartex" xmlns:cx6="http://schemas.microsoft.com/office/drawing/2016/5/12/chartex" xmlns:cx7="http://schemas.microsoft.com/office/drawing/2016/5/13/chartex" xmlns:cx8="http://schemas.microsoft.com/office/drawing/2016/5/14/chartex" xmlns:mc="http://schemas.openxmlformats.org/markup-compatibility/2006" xmlns:aink="http://schemas.microsoft.com/office/drawing/2016/ink" xmlns:am3d="http://schemas.microsoft.com/office/drawing/2017/model3d" xmlns:o="urn:schemas-microsoft-com:office:office" xmlns:oel="http://schemas.microsoft.com/office/2019/extlst" xmlns:r="http://schemas.openxmlformats.org/officeDocument/2006/relationships" xmlns:m="http://schemas.openxmlformats.org/officeDocument/2006/math" xmlns:v="urn:schemas-microsoft-com:vml" xmlns:wp14="http://schemas.microsoft.com/office/word/2010/wordprocessingDrawing" xmlns:wp="http://schemas.openxmlformats.org/drawingml/2006/wordprocessingDrawing" xmlns:w10="urn:schemas-microsoft-com:office:word" xmlns:w="http://schemas.openxmlformats.org/wordprocessingml/2006/main" xmlns:w14="http://schemas.microsoft.com/office/word/2010/wordml" xmlns:w15="http://schemas.microsoft.com/office/word/2012/wordml" xmlns:w16cex="http://schemas.microsoft.com/office/word/2018/wordml/cex" xmlns:w16cid="http://schemas.microsoft.com/office/word/2016/wordml/cid" xmlns:w16="http://schemas.microsoft.com/office/word/2018/wordml" xmlns:w16sdtdh="http://schemas.microsoft.com/office/word/2020/wordml/sdtdatahash" xmlns:w16se="http://schemas.microsoft.com/office/word/2015/wordml/symex" xmlns:wpg="http://schemas.microsoft.com/office/word/2010/wordprocessingGroup" xmlns:wpi="http://schemas.microsoft.com/office/word/2010/wordprocessingInk" xmlns:wne="http://schemas.microsoft.com/office/word/2006/wordml" xmlns:wps="http://schemas.microsoft.com/office/word/2010/wordprocessingShape" mc:Ignorable="w14 w15 w16se w16cid w16 w16cex w16sdtdh wp14">
   <w:p>
     <w:pPr>
       <w:pStyle w:val="Encabezado"/>
@@ -5405,7 +5500,7 @@
         <w:lang w:val="es-CL" w:eastAsia="es-CL"/>
       </w:rPr>
       <w:drawing>
-        <wp:anchor distT="0" distB="0" distL="114300" distR="114300" simplePos="0" relativeHeight="251659264" behindDoc="0" locked="0" layoutInCell="1" allowOverlap="1" wp14:anchorId="618DB828" wp14:editId="14DEC282">
+        <wp:anchor distT="0" distB="0" distL="114300" distR="114300" simplePos="0" relativeHeight="251659264" behindDoc="0" locked="0" layoutInCell="1" allowOverlap="1" wp14:anchorId="6A29E32A" wp14:editId="63FCAB15">
           <wp:simplePos x="0" y="0"/>
           <wp:positionH relativeFrom="column">
             <wp:posOffset>131977</wp:posOffset>
@@ -5471,7 +5566,7 @@
 </file>
 
 <file path=word/numbering.xml><?xml version="1.0" encoding="utf-8"?>
-<w:numbering xmlns:wpc="http://schemas.microsoft.com/office/word/2010/wordprocessingCanvas" xmlns:cx="http://schemas.microsoft.com/office/drawing/2014/chartex" xmlns:cx1="http://schemas.microsoft.com/office/drawing/2015/9/8/chartex" xmlns:cx2="http://schemas.microsoft.com/office/drawing/2015/10/21/chartex" xmlns:cx3="http://schemas.microsoft.com/office/drawing/2016/5/9/chartex" xmlns:cx4="http://schemas.microsoft.com/office/drawing/2016/5/10/chartex" xmlns:cx5="http://schemas.microsoft.com/office/drawing/2016/5/11/chartex" xmlns:cx6="http://schemas.microsoft.com/office/drawing/2016/5/12/chartex" xmlns:cx7="http://schemas.microsoft.com/office/drawing/2016/5/13/chartex" xmlns:cx8="http://schemas.microsoft.com/office/drawing/2016/5/14/chartex" xmlns:mc="http://schemas.openxmlformats.org/markup-compatibility/2006" xmlns:aink="http://schemas.microsoft.com/office/drawing/2016/ink" xmlns:am3d="http://schemas.microsoft.com/office/drawing/2017/model3d" xmlns:o="urn:schemas-microsoft-com:office:office" xmlns:oel="http://schemas.microsoft.com/office/2019/extlst" xmlns:r="http://schemas.openxmlformats.org/officeDocument/2006/relationships" xmlns:m="http://schemas.openxmlformats.org/officeDocument/2006/math" xmlns:v="urn:schemas-microsoft-com:vml" xmlns:wp14="http://schemas.microsoft.com/office/word/2010/wordprocessingDrawing" xmlns:wp="http://schemas.openxmlformats.org/drawingml/2006/wordprocessingDrawing" xmlns:w10="urn:schemas-microsoft-com:office:word" xmlns:w="http://schemas.openxmlformats.org/wordprocessingml/2006/main" xmlns:w14="http://schemas.microsoft.com/office/word/2010/wordml" xmlns:w15="http://schemas.microsoft.com/office/word/2012/wordml" xmlns:w16cex="http://schemas.microsoft.com/office/word/2018/wordml/cex" xmlns:w16cid="http://schemas.microsoft.com/office/word/2016/wordml/cid" xmlns:w16="http://schemas.microsoft.com/office/word/2018/wordml" xmlns:w16du="http://schemas.microsoft.com/office/word/2023/wordml/word16du" xmlns:w16sdtdh="http://schemas.microsoft.com/office/word/2020/wordml/sdtdatahash" xmlns:w16sdtfl="http://schemas.microsoft.com/office/word/2024/wordml/sdtformatlock" xmlns:w16se="http://schemas.microsoft.com/office/word/2015/wordml/symex" xmlns:wpg="http://schemas.microsoft.com/office/word/2010/wordprocessingGroup" xmlns:wpi="http://schemas.microsoft.com/office/word/2010/wordprocessingInk" xmlns:wne="http://schemas.microsoft.com/office/word/2006/wordml" xmlns:wps="http://schemas.microsoft.com/office/word/2010/wordprocessingShape" mc:Ignorable="w14 w15 w16se w16cid w16 w16cex w16sdtdh w16sdtfl w16du wp14">
+<w:numbering xmlns:wpc="http://schemas.microsoft.com/office/word/2010/wordprocessingCanvas" xmlns:cx="http://schemas.microsoft.com/office/drawing/2014/chartex" xmlns:cx1="http://schemas.microsoft.com/office/drawing/2015/9/8/chartex" xmlns:cx2="http://schemas.microsoft.com/office/drawing/2015/10/21/chartex" xmlns:cx3="http://schemas.microsoft.com/office/drawing/2016/5/9/chartex" xmlns:cx4="http://schemas.microsoft.com/office/drawing/2016/5/10/chartex" xmlns:cx5="http://schemas.microsoft.com/office/drawing/2016/5/11/chartex" xmlns:cx6="http://schemas.microsoft.com/office/drawing/2016/5/12/chartex" xmlns:cx7="http://schemas.microsoft.com/office/drawing/2016/5/13/chartex" xmlns:cx8="http://schemas.microsoft.com/office/drawing/2016/5/14/chartex" xmlns:mc="http://schemas.openxmlformats.org/markup-compatibility/2006" xmlns:aink="http://schemas.microsoft.com/office/drawing/2016/ink" xmlns:am3d="http://schemas.microsoft.com/office/drawing/2017/model3d" xmlns:o="urn:schemas-microsoft-com:office:office" xmlns:oel="http://schemas.microsoft.com/office/2019/extlst" xmlns:r="http://schemas.openxmlformats.org/officeDocument/2006/relationships" xmlns:m="http://schemas.openxmlformats.org/officeDocument/2006/math" xmlns:v="urn:schemas-microsoft-com:vml" xmlns:wp14="http://schemas.microsoft.com/office/word/2010/wordprocessingDrawing" xmlns:wp="http://schemas.openxmlformats.org/drawingml/2006/wordprocessingDrawing" xmlns:w10="urn:schemas-microsoft-com:office:word" xmlns:w="http://schemas.openxmlformats.org/wordprocessingml/2006/main" xmlns:w14="http://schemas.microsoft.com/office/word/2010/wordml" xmlns:w15="http://schemas.microsoft.com/office/word/2012/wordml" xmlns:w16cex="http://schemas.microsoft.com/office/word/2018/wordml/cex" xmlns:w16cid="http://schemas.microsoft.com/office/word/2016/wordml/cid" xmlns:w16="http://schemas.microsoft.com/office/word/2018/wordml" xmlns:w16sdtdh="http://schemas.microsoft.com/office/word/2020/wordml/sdtdatahash" xmlns:w16se="http://schemas.microsoft.com/office/word/2015/wordml/symex" xmlns:wpg="http://schemas.microsoft.com/office/word/2010/wordprocessingGroup" xmlns:wpi="http://schemas.microsoft.com/office/word/2010/wordprocessingInk" xmlns:wne="http://schemas.microsoft.com/office/word/2006/wordml" xmlns:wps="http://schemas.microsoft.com/office/word/2010/wordprocessingShape" mc:Ignorable="w14 w15 w16se w16cid w16 w16cex w16sdtdh wp14">
   <w:abstractNum w:abstractNumId="0" w15:restartNumberingAfterBreak="0">
     <w:nsid w:val="042A6B37"/>
     <w:multiLevelType w:val="hybridMultilevel"/>
@@ -6557,7 +6652,7 @@
 </file>
 
 <file path=word/styles.xml><?xml version="1.0" encoding="utf-8"?>
-<w:styles xmlns:mc="http://schemas.openxmlformats.org/markup-compatibility/2006" xmlns:r="http://schemas.openxmlformats.org/officeDocument/2006/relationships" xmlns:w="http://schemas.openxmlformats.org/wordprocessingml/2006/main" xmlns:w14="http://schemas.microsoft.com/office/word/2010/wordml" xmlns:w15="http://schemas.microsoft.com/office/word/2012/wordml" xmlns:w16cex="http://schemas.microsoft.com/office/word/2018/wordml/cex" xmlns:w16cid="http://schemas.microsoft.com/office/word/2016/wordml/cid" xmlns:w16="http://schemas.microsoft.com/office/word/2018/wordml" xmlns:w16du="http://schemas.microsoft.com/office/word/2023/wordml/word16du" xmlns:w16sdtdh="http://schemas.microsoft.com/office/word/2020/wordml/sdtdatahash" xmlns:w16sdtfl="http://schemas.microsoft.com/office/word/2024/wordml/sdtformatlock" xmlns:w16se="http://schemas.microsoft.com/office/word/2015/wordml/symex" mc:Ignorable="w14 w15 w16se w16cid w16 w16cex w16sdtdh w16sdtfl w16du">
+<w:styles xmlns:mc="http://schemas.openxmlformats.org/markup-compatibility/2006" xmlns:r="http://schemas.openxmlformats.org/officeDocument/2006/relationships" xmlns:w="http://schemas.openxmlformats.org/wordprocessingml/2006/main" xmlns:w14="http://schemas.microsoft.com/office/word/2010/wordml" xmlns:w15="http://schemas.microsoft.com/office/word/2012/wordml" xmlns:w16cex="http://schemas.microsoft.com/office/word/2018/wordml/cex" xmlns:w16cid="http://schemas.microsoft.com/office/word/2016/wordml/cid" xmlns:w16="http://schemas.microsoft.com/office/word/2018/wordml" xmlns:w16sdtdh="http://schemas.microsoft.com/office/word/2020/wordml/sdtdatahash" xmlns:w16se="http://schemas.microsoft.com/office/word/2015/wordml/symex" mc:Ignorable="w14 w15 w16se w16cid w16 w16cex w16sdtdh">
   <w:docDefaults>
     <w:rPrDefault>
       <w:rPr>
@@ -7456,647 +7551,10 @@
     <w:basedOn w:val="Fuentedeprrafopredeter"/>
     <w:rsid w:val="0027225D"/>
   </w:style>
-  <w:style w:type="paragraph" w:styleId="Title">
+  <w:style w:type="paragraph" w:styleId="Ttulo">
     <w:name w:val="Title"/>
   </w:style>
 </w:styles>
-</file>
-
-<file path=word/glossary/document.xml><?xml version="1.0" encoding="utf-8"?>
-<w:glossaryDocument xmlns:wpc="http://schemas.microsoft.com/office/word/2010/wordprocessingCanvas" xmlns:cx="http://schemas.microsoft.com/office/drawing/2014/chartex" xmlns:cx1="http://schemas.microsoft.com/office/drawing/2015/9/8/chartex" xmlns:cx2="http://schemas.microsoft.com/office/drawing/2015/10/21/chartex" xmlns:cx3="http://schemas.microsoft.com/office/drawing/2016/5/9/chartex" xmlns:cx4="http://schemas.microsoft.com/office/drawing/2016/5/10/chartex" xmlns:cx5="http://schemas.microsoft.com/office/drawing/2016/5/11/chartex" xmlns:cx6="http://schemas.microsoft.com/office/drawing/2016/5/12/chartex" xmlns:cx7="http://schemas.microsoft.com/office/drawing/2016/5/13/chartex" xmlns:cx8="http://schemas.microsoft.com/office/drawing/2016/5/14/chartex" xmlns:mc="http://schemas.openxmlformats.org/markup-compatibility/2006" xmlns:aink="http://schemas.microsoft.com/office/drawing/2016/ink" xmlns:am3d="http://schemas.microsoft.com/office/drawing/2017/model3d" xmlns:o="urn:schemas-microsoft-com:office:office" xmlns:oel="http://schemas.microsoft.com/office/2019/extlst" xmlns:r="http://schemas.openxmlformats.org/officeDocument/2006/relationships" xmlns:m="http://schemas.openxmlformats.org/officeDocument/2006/math" xmlns:v="urn:schemas-microsoft-com:vml" xmlns:wp14="http://schemas.microsoft.com/office/word/2010/wordprocessingDrawing" xmlns:wp="http://schemas.openxmlformats.org/drawingml/2006/wordprocessingDrawing" xmlns:w10="urn:schemas-microsoft-com:office:word" xmlns:w="http://schemas.openxmlformats.org/wordprocessingml/2006/main" xmlns:w14="http://schemas.microsoft.com/office/word/2010/wordml" xmlns:w15="http://schemas.microsoft.com/office/word/2012/wordml" xmlns:w16cex="http://schemas.microsoft.com/office/word/2018/wordml/cex" xmlns:w16cid="http://schemas.microsoft.com/office/word/2016/wordml/cid" xmlns:w16="http://schemas.microsoft.com/office/word/2018/wordml" xmlns:w16du="http://schemas.microsoft.com/office/word/2023/wordml/word16du" xmlns:w16sdtdh="http://schemas.microsoft.com/office/word/2020/wordml/sdtdatahash" xmlns:w16sdtfl="http://schemas.microsoft.com/office/word/2024/wordml/sdtformatlock" xmlns:w16se="http://schemas.microsoft.com/office/word/2015/wordml/symex" xmlns:wpg="http://schemas.microsoft.com/office/word/2010/wordprocessingGroup" xmlns:wpi="http://schemas.microsoft.com/office/word/2010/wordprocessingInk" xmlns:wne="http://schemas.microsoft.com/office/word/2006/wordml" xmlns:wps="http://schemas.microsoft.com/office/word/2010/wordprocessingShape" mc:Ignorable="w14 w15 w16se w16cid w16 w16cex w16sdtdh w16sdtfl w16du wp14">
-  <w:docParts>
-    <w:docPart>
-      <w:docPartPr>
-        <w:name w:val="6249C296035045A4B35172D034FA06AE"/>
-        <w:category>
-          <w:name w:val="General"/>
-          <w:gallery w:val="placeholder"/>
-        </w:category>
-        <w:types>
-          <w:type w:val="bbPlcHdr"/>
-        </w:types>
-        <w:behaviors>
-          <w:behavior w:val="content"/>
-        </w:behaviors>
-        <w:guid w:val="{FEE2C8A2-35C0-4388-ACCB-7CFDC28B981F}"/>
-      </w:docPartPr>
-      <w:docPartBody>
-        <w:p>
-          <w:pPr>
-            <w:pStyle w:val="6249C296035045A4B35172D034FA06AE"/>
-          </w:pPr>
-          <w:r>
-            <w:rPr>
-              <w:rFonts w:asciiTheme="majorHAnsi" w:eastAsiaTheme="majorEastAsia" w:hAnsiTheme="majorHAnsi" w:cstheme="majorBidi"/>
-              <w:caps/>
-              <w:lang w:val="es-ES"/>
-            </w:rPr>
-            <w:t>[Escribir el nombre de la compañía]</w:t>
-          </w:r>
-        </w:p>
-      </w:docPartBody>
-    </w:docPart>
-    <w:docPart>
-      <w:docPartPr>
-        <w:name w:val="C3A9BEF9B31C43B3ABDAE773F5A369DA"/>
-        <w:category>
-          <w:name w:val="General"/>
-          <w:gallery w:val="placeholder"/>
-        </w:category>
-        <w:types>
-          <w:type w:val="bbPlcHdr"/>
-        </w:types>
-        <w:behaviors>
-          <w:behavior w:val="content"/>
-        </w:behaviors>
-        <w:guid w:val="{93A94235-753A-4B1E-880F-E6663B4A5B79}"/>
-      </w:docPartPr>
-      <w:docPartBody>
-        <w:p>
-          <w:pPr>
-            <w:pStyle w:val="C3A9BEF9B31C43B3ABDAE773F5A369DA"/>
-          </w:pPr>
-          <w:r>
-            <w:rPr>
-              <w:rFonts w:asciiTheme="majorHAnsi" w:eastAsiaTheme="majorEastAsia" w:hAnsiTheme="majorHAnsi" w:cstheme="majorBidi"/>
-              <w:sz w:val="80"/>
-              <w:szCs w:val="80"/>
-              <w:lang w:val="es-ES"/>
-            </w:rPr>
-            <w:t>[Escribir el título del documento]</w:t>
-          </w:r>
-        </w:p>
-      </w:docPartBody>
-    </w:docPart>
-  </w:docParts>
-</w:glossaryDocument>
-</file>
-
-<file path=word/glossary/fontTable.xml><?xml version="1.0" encoding="utf-8"?>
-<w:fonts xmlns:mc="http://schemas.openxmlformats.org/markup-compatibility/2006" xmlns:r="http://schemas.openxmlformats.org/officeDocument/2006/relationships" xmlns:w="http://schemas.openxmlformats.org/wordprocessingml/2006/main" xmlns:w14="http://schemas.microsoft.com/office/word/2010/wordml" xmlns:w15="http://schemas.microsoft.com/office/word/2012/wordml" xmlns:w16cex="http://schemas.microsoft.com/office/word/2018/wordml/cex" xmlns:w16cid="http://schemas.microsoft.com/office/word/2016/wordml/cid" xmlns:w16="http://schemas.microsoft.com/office/word/2018/wordml" xmlns:w16du="http://schemas.microsoft.com/office/word/2023/wordml/word16du" xmlns:w16sdtdh="http://schemas.microsoft.com/office/word/2020/wordml/sdtdatahash" xmlns:w16sdtfl="http://schemas.microsoft.com/office/word/2024/wordml/sdtformatlock" xmlns:w16se="http://schemas.microsoft.com/office/word/2015/wordml/symex" mc:Ignorable="w14 w15 w16se w16cid w16 w16cex w16sdtdh w16sdtfl w16du">
-  <w:font w:name="Times New Roman">
-    <w:panose1 w:val="02020603050405020304"/>
-    <w:charset w:val="00"/>
-    <w:family w:val="roman"/>
-    <w:pitch w:val="variable"/>
-    <w:sig w:usb0="E0002EFF" w:usb1="C000785B" w:usb2="00000009" w:usb3="00000000" w:csb0="000001FF" w:csb1="00000000"/>
-  </w:font>
-  <w:font w:name="Symbol">
-    <w:panose1 w:val="05050102010706020507"/>
-    <w:charset w:val="02"/>
-    <w:family w:val="roman"/>
-    <w:pitch w:val="variable"/>
-    <w:sig w:usb0="00000000" w:usb1="10000000" w:usb2="00000000" w:usb3="00000000" w:csb0="80000000" w:csb1="00000000"/>
-  </w:font>
-  <w:font w:name="Courier New">
-    <w:panose1 w:val="02070309020205020404"/>
-    <w:charset w:val="00"/>
-    <w:family w:val="modern"/>
-    <w:pitch w:val="fixed"/>
-    <w:sig w:usb0="E0002EFF" w:usb1="C0007843" w:usb2="00000009" w:usb3="00000000" w:csb0="000001FF" w:csb1="00000000"/>
-  </w:font>
-  <w:font w:name="Wingdings">
-    <w:panose1 w:val="05000000000000000000"/>
-    <w:charset w:val="02"/>
-    <w:family w:val="auto"/>
-    <w:pitch w:val="variable"/>
-    <w:sig w:usb0="00000000" w:usb1="10000000" w:usb2="00000000" w:usb3="00000000" w:csb0="80000000" w:csb1="00000000"/>
-  </w:font>
-  <w:font w:name="Calibri">
-    <w:panose1 w:val="020F0502020204030204"/>
-    <w:charset w:val="00"/>
-    <w:family w:val="swiss"/>
-    <w:pitch w:val="variable"/>
-    <w:sig w:usb0="E4002EFF" w:usb1="C000247B" w:usb2="00000009" w:usb3="00000000" w:csb0="000001FF" w:csb1="00000000"/>
-  </w:font>
-  <w:font w:name="Cambria">
-    <w:panose1 w:val="02040503050406030204"/>
-    <w:charset w:val="00"/>
-    <w:family w:val="roman"/>
-    <w:pitch w:val="variable"/>
-    <w:sig w:usb0="E00006FF" w:usb1="420024FF" w:usb2="02000000" w:usb3="00000000" w:csb0="0000019F" w:csb1="00000000"/>
-  </w:font>
-  <w:font w:name="Arial">
-    <w:panose1 w:val="020B0604020202020204"/>
-    <w:charset w:val="00"/>
-    <w:family w:val="swiss"/>
-    <w:pitch w:val="variable"/>
-    <w:sig w:usb0="E0002EFF" w:usb1="C000785B" w:usb2="00000009" w:usb3="00000000" w:csb0="000001FF" w:csb1="00000000"/>
-  </w:font>
-  <w:font w:name="Tahoma">
-    <w:panose1 w:val="020B0604030504040204"/>
-    <w:charset w:val="00"/>
-    <w:family w:val="swiss"/>
-    <w:pitch w:val="variable"/>
-    <w:sig w:usb0="E1002EFF" w:usb1="C000605B" w:usb2="00000029" w:usb3="00000000" w:csb0="000101FF" w:csb1="00000000"/>
-  </w:font>
-  <w:font w:name="Aptos">
-    <w:charset w:val="00"/>
-    <w:family w:val="swiss"/>
-    <w:pitch w:val="variable"/>
-    <w:sig w:usb0="20000287" w:usb1="00000003" w:usb2="00000000" w:usb3="00000000" w:csb0="0000019F" w:csb1="00000000"/>
-  </w:font>
-  <w:font w:name="Aptos Display">
-    <w:charset w:val="00"/>
-    <w:family w:val="swiss"/>
-    <w:pitch w:val="variable"/>
-    <w:sig w:usb0="20000287" w:usb1="00000003" w:usb2="00000000" w:usb3="00000000" w:csb0="0000019F" w:csb1="00000000"/>
-  </w:font>
-</w:fonts>
-</file>
-
-<file path=word/glossary/settings.xml><?xml version="1.0" encoding="utf-8"?>
-<w:settings xmlns:mc="http://schemas.openxmlformats.org/markup-compatibility/2006" xmlns:o="urn:schemas-microsoft-com:office:office" xmlns:r="http://schemas.openxmlformats.org/officeDocument/2006/relationships" xmlns:m="http://schemas.openxmlformats.org/officeDocument/2006/math" xmlns:v="urn:schemas-microsoft-com:vml" xmlns:w10="urn:schemas-microsoft-com:office:word" xmlns:w="http://schemas.openxmlformats.org/wordprocessingml/2006/main" xmlns:w14="http://schemas.microsoft.com/office/word/2010/wordml" xmlns:w15="http://schemas.microsoft.com/office/word/2012/wordml" xmlns:w16cex="http://schemas.microsoft.com/office/word/2018/wordml/cex" xmlns:w16cid="http://schemas.microsoft.com/office/word/2016/wordml/cid" xmlns:w16="http://schemas.microsoft.com/office/word/2018/wordml" xmlns:w16du="http://schemas.microsoft.com/office/word/2023/wordml/word16du" xmlns:w16sdtdh="http://schemas.microsoft.com/office/word/2020/wordml/sdtdatahash" xmlns:w16sdtfl="http://schemas.microsoft.com/office/word/2024/wordml/sdtformatlock" xmlns:w16se="http://schemas.microsoft.com/office/word/2015/wordml/symex" xmlns:sl="http://schemas.openxmlformats.org/schemaLibrary/2006/main" mc:Ignorable="w14 w15 w16se w16cid w16 w16cex w16sdtdh w16sdtfl w16du">
-  <w:view w:val="normal"/>
-  <w:defaultTabStop w:val="708"/>
-  <w:hyphenationZone w:val="425"/>
-  <w:characterSpacingControl w:val="doNotCompress"/>
-  <w:compat>
-    <w:useFELayout/>
-    <w:compatSetting w:name="compatibilityMode" w:uri="http://schemas.microsoft.com/office/word" w:val="12"/>
-    <w:compatSetting w:name="useWord2013TrackBottomHyphenation" w:uri="http://schemas.microsoft.com/office/word" w:val="1"/>
-  </w:compat>
-  <w:rsids>
-    <w:rsidRoot w:val="00960213"/>
-    <w:rsid w:val="002835FC"/>
-    <w:rsid w:val="002C4A2F"/>
-    <w:rsid w:val="00355CEA"/>
-    <w:rsid w:val="005563F6"/>
-    <w:rsid w:val="0057410B"/>
-    <w:rsid w:val="00595623"/>
-    <w:rsid w:val="007004AE"/>
-    <w:rsid w:val="00960213"/>
-    <w:rsid w:val="00A02707"/>
-    <w:rsid w:val="00BD2436"/>
-    <w:rsid w:val="00BF7F8C"/>
-    <w:rsid w:val="00C47BA2"/>
-    <w:rsid w:val="00C5036F"/>
-    <w:rsid w:val="00C94DF5"/>
-    <w:rsid w:val="00CC056D"/>
-    <w:rsid w:val="00D423DC"/>
-  </w:rsids>
-  <m:mathPr>
-    <m:mathFont m:val="Cambria Math"/>
-    <m:brkBin m:val="before"/>
-    <m:brkBinSub m:val="--"/>
-    <m:smallFrac m:val="0"/>
-    <m:dispDef/>
-    <m:lMargin m:val="0"/>
-    <m:rMargin m:val="0"/>
-    <m:defJc m:val="centerGroup"/>
-    <m:wrapIndent m:val="1440"/>
-    <m:intLim m:val="subSup"/>
-    <m:naryLim m:val="undOvr"/>
-  </m:mathPr>
-  <w:themeFontLang w:val="es-AR"/>
-  <w:clrSchemeMapping w:bg1="light1" w:t1="dark1" w:bg2="light2" w:t2="dark2" w:accent1="accent1" w:accent2="accent2" w:accent3="accent3" w:accent4="accent4" w:accent5="accent5" w:accent6="accent6" w:hyperlink="hyperlink" w:followedHyperlink="followedHyperlink"/>
-  <w:decimalSymbol w:val=","/>
-  <w:listSeparator w:val=";"/>
-</w:settings>
-</file>
-
-<file path=word/glossary/styles.xml><?xml version="1.0" encoding="utf-8"?>
-<w:styles xmlns:mc="http://schemas.openxmlformats.org/markup-compatibility/2006" xmlns:r="http://schemas.openxmlformats.org/officeDocument/2006/relationships" xmlns:w="http://schemas.openxmlformats.org/wordprocessingml/2006/main" xmlns:w14="http://schemas.microsoft.com/office/word/2010/wordml" xmlns:w15="http://schemas.microsoft.com/office/word/2012/wordml" xmlns:w16cex="http://schemas.microsoft.com/office/word/2018/wordml/cex" xmlns:w16cid="http://schemas.microsoft.com/office/word/2016/wordml/cid" xmlns:w16="http://schemas.microsoft.com/office/word/2018/wordml" xmlns:w16du="http://schemas.microsoft.com/office/word/2023/wordml/word16du" xmlns:w16sdtdh="http://schemas.microsoft.com/office/word/2020/wordml/sdtdatahash" xmlns:w16sdtfl="http://schemas.microsoft.com/office/word/2024/wordml/sdtformatlock" xmlns:w16se="http://schemas.microsoft.com/office/word/2015/wordml/symex" mc:Ignorable="w14 w15 w16se w16cid w16 w16cex w16sdtdh w16sdtfl w16du">
-  <w:docDefaults>
-    <w:rPrDefault>
-      <w:rPr>
-        <w:rFonts w:asciiTheme="minorHAnsi" w:eastAsiaTheme="minorEastAsia" w:hAnsiTheme="minorHAnsi" w:cstheme="minorBidi"/>
-        <w:sz w:val="22"/>
-        <w:szCs w:val="22"/>
-        <w:lang w:val="es-AR" w:eastAsia="es-AR" w:bidi="ar-SA"/>
-      </w:rPr>
-    </w:rPrDefault>
-    <w:pPrDefault>
-      <w:pPr>
-        <w:spacing w:after="200" w:line="276" w:lineRule="auto"/>
-      </w:pPr>
-    </w:pPrDefault>
-  </w:docDefaults>
-  <w:latentStyles w:defLockedState="0" w:defUIPriority="99" w:defSemiHidden="0" w:defUnhideWhenUsed="0" w:defQFormat="0" w:count="376">
-    <w:lsdException w:name="Normal" w:uiPriority="0" w:qFormat="1"/>
-    <w:lsdException w:name="heading 1" w:uiPriority="9" w:qFormat="1"/>
-    <w:lsdException w:name="heading 2" w:semiHidden="1" w:uiPriority="9" w:unhideWhenUsed="1" w:qFormat="1"/>
-    <w:lsdException w:name="heading 3" w:semiHidden="1" w:uiPriority="9" w:unhideWhenUsed="1" w:qFormat="1"/>
-    <w:lsdException w:name="heading 4" w:semiHidden="1" w:uiPriority="9" w:unhideWhenUsed="1" w:qFormat="1"/>
-    <w:lsdException w:name="heading 5" w:semiHidden="1" w:uiPriority="9" w:unhideWhenUsed="1" w:qFormat="1"/>
-    <w:lsdException w:name="heading 6" w:semiHidden="1" w:uiPriority="9" w:unhideWhenUsed="1" w:qFormat="1"/>
-    <w:lsdException w:name="heading 7" w:semiHidden="1" w:uiPriority="9" w:unhideWhenUsed="1" w:qFormat="1"/>
-    <w:lsdException w:name="heading 8" w:semiHidden="1" w:uiPriority="9" w:unhideWhenUsed="1" w:qFormat="1"/>
-    <w:lsdException w:name="heading 9" w:semiHidden="1" w:uiPriority="9" w:unhideWhenUsed="1" w:qFormat="1"/>
-    <w:lsdException w:name="index 1" w:semiHidden="1" w:unhideWhenUsed="1"/>
-    <w:lsdException w:name="index 2" w:semiHidden="1" w:unhideWhenUsed="1"/>
-    <w:lsdException w:name="index 3" w:semiHidden="1" w:unhideWhenUsed="1"/>
-    <w:lsdException w:name="index 4" w:semiHidden="1" w:unhideWhenUsed="1"/>
-    <w:lsdException w:name="index 5" w:semiHidden="1" w:unhideWhenUsed="1"/>
-    <w:lsdException w:name="index 6" w:semiHidden="1" w:unhideWhenUsed="1"/>
-    <w:lsdException w:name="index 7" w:semiHidden="1" w:unhideWhenUsed="1"/>
-    <w:lsdException w:name="index 8" w:semiHidden="1" w:unhideWhenUsed="1"/>
-    <w:lsdException w:name="index 9" w:semiHidden="1" w:unhideWhenUsed="1"/>
-    <w:lsdException w:name="toc 1" w:semiHidden="1" w:uiPriority="39" w:unhideWhenUsed="1"/>
-    <w:lsdException w:name="toc 2" w:semiHidden="1" w:uiPriority="39" w:unhideWhenUsed="1"/>
-    <w:lsdException w:name="toc 3" w:semiHidden="1" w:uiPriority="39" w:unhideWhenUsed="1"/>
-    <w:lsdException w:name="toc 4" w:semiHidden="1" w:uiPriority="39" w:unhideWhenUsed="1"/>
-    <w:lsdException w:name="toc 5" w:semiHidden="1" w:uiPriority="39" w:unhideWhenUsed="1"/>
-    <w:lsdException w:name="toc 6" w:semiHidden="1" w:uiPriority="39" w:unhideWhenUsed="1"/>
-    <w:lsdException w:name="toc 7" w:semiHidden="1" w:uiPriority="39" w:unhideWhenUsed="1"/>
-    <w:lsdException w:name="toc 8" w:semiHidden="1" w:uiPriority="39" w:unhideWhenUsed="1"/>
-    <w:lsdException w:name="toc 9" w:semiHidden="1" w:uiPriority="39" w:unhideWhenUsed="1"/>
-    <w:lsdException w:name="Normal Indent" w:semiHidden="1" w:unhideWhenUsed="1"/>
-    <w:lsdException w:name="footnote text" w:semiHidden="1" w:unhideWhenUsed="1"/>
-    <w:lsdException w:name="annotation text" w:semiHidden="1" w:unhideWhenUsed="1"/>
-    <w:lsdException w:name="header" w:semiHidden="1" w:unhideWhenUsed="1"/>
-    <w:lsdException w:name="footer" w:semiHidden="1" w:unhideWhenUsed="1"/>
-    <w:lsdException w:name="index heading" w:semiHidden="1" w:unhideWhenUsed="1"/>
-    <w:lsdException w:name="caption" w:semiHidden="1" w:uiPriority="35" w:unhideWhenUsed="1" w:qFormat="1"/>
-    <w:lsdException w:name="table of figures" w:semiHidden="1" w:unhideWhenUsed="1"/>
-    <w:lsdException w:name="envelope address" w:semiHidden="1" w:unhideWhenUsed="1"/>
-    <w:lsdException w:name="envelope return" w:semiHidden="1" w:unhideWhenUsed="1"/>
-    <w:lsdException w:name="footnote reference" w:semiHidden="1" w:unhideWhenUsed="1"/>
-    <w:lsdException w:name="annotation reference" w:semiHidden="1" w:unhideWhenUsed="1"/>
-    <w:lsdException w:name="line number" w:semiHidden="1" w:unhideWhenUsed="1"/>
-    <w:lsdException w:name="page number" w:semiHidden="1" w:unhideWhenUsed="1"/>
-    <w:lsdException w:name="endnote reference" w:semiHidden="1" w:unhideWhenUsed="1"/>
-    <w:lsdException w:name="endnote text" w:semiHidden="1" w:unhideWhenUsed="1"/>
-    <w:lsdException w:name="table of authorities" w:semiHidden="1" w:unhideWhenUsed="1"/>
-    <w:lsdException w:name="macro" w:semiHidden="1" w:unhideWhenUsed="1"/>
-    <w:lsdException w:name="toa heading" w:semiHidden="1" w:unhideWhenUsed="1"/>
-    <w:lsdException w:name="List" w:semiHidden="1" w:unhideWhenUsed="1"/>
-    <w:lsdException w:name="List Bullet" w:semiHidden="1" w:unhideWhenUsed="1"/>
-    <w:lsdException w:name="List Number" w:semiHidden="1" w:unhideWhenUsed="1"/>
-    <w:lsdException w:name="List 2" w:semiHidden="1" w:unhideWhenUsed="1"/>
-    <w:lsdException w:name="List 3" w:semiHidden="1" w:unhideWhenUsed="1"/>
-    <w:lsdException w:name="List 4" w:semiHidden="1" w:unhideWhenUsed="1"/>
-    <w:lsdException w:name="List 5" w:semiHidden="1" w:unhideWhenUsed="1"/>
-    <w:lsdException w:name="List Bullet 2" w:semiHidden="1" w:unhideWhenUsed="1"/>
-    <w:lsdException w:name="List Bullet 3" w:semiHidden="1" w:unhideWhenUsed="1"/>
-    <w:lsdException w:name="List Bullet 4" w:semiHidden="1" w:unhideWhenUsed="1"/>
-    <w:lsdException w:name="List Bullet 5" w:semiHidden="1" w:unhideWhenUsed="1"/>
-    <w:lsdException w:name="List Number 2" w:semiHidden="1" w:unhideWhenUsed="1"/>
-    <w:lsdException w:name="List Number 3" w:semiHidden="1" w:unhideWhenUsed="1"/>
-    <w:lsdException w:name="List Number 4" w:semiHidden="1" w:unhideWhenUsed="1"/>
-    <w:lsdException w:name="List Number 5" w:semiHidden="1" w:unhideWhenUsed="1"/>
-    <w:lsdException w:name="Title" w:uiPriority="10" w:qFormat="1"/>
-    <w:lsdException w:name="Closing" w:semiHidden="1" w:unhideWhenUsed="1"/>
-    <w:lsdException w:name="Signature" w:semiHidden="1" w:unhideWhenUsed="1"/>
-    <w:lsdException w:name="Default Paragraph Font" w:semiHidden="1" w:uiPriority="1" w:unhideWhenUsed="1"/>
-    <w:lsdException w:name="Body Text" w:semiHidden="1" w:unhideWhenUsed="1"/>
-    <w:lsdException w:name="Body Text Indent" w:semiHidden="1" w:unhideWhenUsed="1"/>
-    <w:lsdException w:name="List Continue" w:semiHidden="1" w:unhideWhenUsed="1"/>
-    <w:lsdException w:name="List Continue 2" w:semiHidden="1" w:unhideWhenUsed="1"/>
-    <w:lsdException w:name="List Continue 3" w:semiHidden="1" w:unhideWhenUsed="1"/>
-    <w:lsdException w:name="List Continue 4" w:semiHidden="1" w:unhideWhenUsed="1"/>
-    <w:lsdException w:name="List Continue 5" w:semiHidden="1" w:unhideWhenUsed="1"/>
-    <w:lsdException w:name="Message Header" w:semiHidden="1" w:unhideWhenUsed="1"/>
-    <w:lsdException w:name="Subtitle" w:uiPriority="11" w:qFormat="1"/>
-    <w:lsdException w:name="Salutation" w:semiHidden="1" w:unhideWhenUsed="1"/>
-    <w:lsdException w:name="Date" w:semiHidden="1" w:unhideWhenUsed="1"/>
-    <w:lsdException w:name="Body Text First Indent" w:semiHidden="1" w:unhideWhenUsed="1"/>
-    <w:lsdException w:name="Body Text First Indent 2" w:semiHidden="1" w:unhideWhenUsed="1"/>
-    <w:lsdException w:name="Note Heading" w:semiHidden="1" w:unhideWhenUsed="1"/>
-    <w:lsdException w:name="Body Text 2" w:semiHidden="1" w:unhideWhenUsed="1"/>
-    <w:lsdException w:name="Body Text 3" w:semiHidden="1" w:unhideWhenUsed="1"/>
-    <w:lsdException w:name="Body Text Indent 2" w:semiHidden="1" w:unhideWhenUsed="1"/>
-    <w:lsdException w:name="Body Text Indent 3" w:semiHidden="1" w:unhideWhenUsed="1"/>
-    <w:lsdException w:name="Block Text" w:semiHidden="1" w:unhideWhenUsed="1"/>
-    <w:lsdException w:name="Hyperlink" w:semiHidden="1" w:unhideWhenUsed="1"/>
-    <w:lsdException w:name="FollowedHyperlink" w:semiHidden="1" w:unhideWhenUsed="1"/>
-    <w:lsdException w:name="Strong" w:uiPriority="22" w:qFormat="1"/>
-    <w:lsdException w:name="Emphasis" w:uiPriority="20" w:qFormat="1"/>
-    <w:lsdException w:name="Document Map" w:semiHidden="1" w:unhideWhenUsed="1"/>
-    <w:lsdException w:name="Plain Text" w:semiHidden="1" w:unhideWhenUsed="1"/>
-    <w:lsdException w:name="E-mail Signature" w:semiHidden="1" w:unhideWhenUsed="1"/>
-    <w:lsdException w:name="HTML Top of Form" w:semiHidden="1" w:unhideWhenUsed="1"/>
-    <w:lsdException w:name="HTML Bottom of Form" w:semiHidden="1" w:unhideWhenUsed="1"/>
-    <w:lsdException w:name="Normal (Web)" w:semiHidden="1" w:unhideWhenUsed="1"/>
-    <w:lsdException w:name="HTML Acronym" w:semiHidden="1" w:unhideWhenUsed="1"/>
-    <w:lsdException w:name="HTML Address" w:semiHidden="1" w:unhideWhenUsed="1"/>
-    <w:lsdException w:name="HTML Cite" w:semiHidden="1" w:unhideWhenUsed="1"/>
-    <w:lsdException w:name="HTML Code" w:semiHidden="1" w:unhideWhenUsed="1"/>
-    <w:lsdException w:name="HTML Definition" w:semiHidden="1" w:unhideWhenUsed="1"/>
-    <w:lsdException w:name="HTML Keyboard" w:semiHidden="1" w:unhideWhenUsed="1"/>
-    <w:lsdException w:name="HTML Preformatted" w:semiHidden="1" w:unhideWhenUsed="1"/>
-    <w:lsdException w:name="HTML Sample" w:semiHidden="1" w:unhideWhenUsed="1"/>
-    <w:lsdException w:name="HTML Typewriter" w:semiHidden="1" w:unhideWhenUsed="1"/>
-    <w:lsdException w:name="HTML Variable" w:semiHidden="1" w:unhideWhenUsed="1"/>
-    <w:lsdException w:name="Normal Table" w:semiHidden="1" w:unhideWhenUsed="1"/>
-    <w:lsdException w:name="annotation subject" w:semiHidden="1" w:unhideWhenUsed="1"/>
-    <w:lsdException w:name="No List" w:semiHidden="1" w:unhideWhenUsed="1"/>
-    <w:lsdException w:name="Outline List 1" w:semiHidden="1" w:unhideWhenUsed="1"/>
-    <w:lsdException w:name="Outline List 2" w:semiHidden="1" w:unhideWhenUsed="1"/>
-    <w:lsdException w:name="Outline List 3" w:semiHidden="1" w:unhideWhenUsed="1"/>
-    <w:lsdException w:name="Table Simple 1" w:semiHidden="1" w:unhideWhenUsed="1"/>
-    <w:lsdException w:name="Table Simple 2" w:semiHidden="1" w:unhideWhenUsed="1"/>
-    <w:lsdException w:name="Table Simple 3" w:semiHidden="1" w:unhideWhenUsed="1"/>
-    <w:lsdException w:name="Table Classic 1" w:semiHidden="1" w:unhideWhenUsed="1"/>
-    <w:lsdException w:name="Table Classic 2" w:semiHidden="1" w:unhideWhenUsed="1"/>
-    <w:lsdException w:name="Table Classic 3" w:semiHidden="1" w:unhideWhenUsed="1"/>
-    <w:lsdException w:name="Table Classic 4" w:semiHidden="1" w:unhideWhenUsed="1"/>
-    <w:lsdException w:name="Table Colorful 1" w:semiHidden="1" w:unhideWhenUsed="1"/>
-    <w:lsdException w:name="Table Colorful 2" w:semiHidden="1" w:unhideWhenUsed="1"/>
-    <w:lsdException w:name="Table Colorful 3" w:semiHidden="1" w:unhideWhenUsed="1"/>
-    <w:lsdException w:name="Table Columns 1" w:semiHidden="1" w:unhideWhenUsed="1"/>
-    <w:lsdException w:name="Table Columns 2" w:semiHidden="1" w:unhideWhenUsed="1"/>
-    <w:lsdException w:name="Table Columns 3" w:semiHidden="1" w:unhideWhenUsed="1"/>
-    <w:lsdException w:name="Table Columns 4" w:semiHidden="1" w:unhideWhenUsed="1"/>
-    <w:lsdException w:name="Table Columns 5" w:semiHidden="1" w:unhideWhenUsed="1"/>
-    <w:lsdException w:name="Table Grid 1" w:semiHidden="1" w:unhideWhenUsed="1"/>
-    <w:lsdException w:name="Table Grid 2" w:semiHidden="1" w:unhideWhenUsed="1"/>
-    <w:lsdException w:name="Table Grid 3" w:semiHidden="1" w:unhideWhenUsed="1"/>
-    <w:lsdException w:name="Table Grid 4" w:semiHidden="1" w:unhideWhenUsed="1"/>
-    <w:lsdException w:name="Table Grid 5" w:semiHidden="1" w:unhideWhenUsed="1"/>
-    <w:lsdException w:name="Table Grid 6" w:semiHidden="1" w:unhideWhenUsed="1"/>
-    <w:lsdException w:name="Table Grid 7" w:semiHidden="1" w:unhideWhenUsed="1"/>
-    <w:lsdException w:name="Table Grid 8" w:semiHidden="1" w:unhideWhenUsed="1"/>
-    <w:lsdException w:name="Table List 1" w:semiHidden="1" w:unhideWhenUsed="1"/>
-    <w:lsdException w:name="Table List 2" w:semiHidden="1" w:unhideWhenUsed="1"/>
-    <w:lsdException w:name="Table List 3" w:semiHidden="1" w:unhideWhenUsed="1"/>
-    <w:lsdException w:name="Table List 4" w:semiHidden="1" w:unhideWhenUsed="1"/>
-    <w:lsdException w:name="Table List 5" w:semiHidden="1" w:unhideWhenUsed="1"/>
-    <w:lsdException w:name="Table List 6" w:semiHidden="1" w:unhideWhenUsed="1"/>
-    <w:lsdException w:name="Table List 7" w:semiHidden="1" w:unhideWhenUsed="1"/>
-    <w:lsdException w:name="Table List 8" w:semiHidden="1" w:unhideWhenUsed="1"/>
-    <w:lsdException w:name="Table 3D effects 1" w:semiHidden="1" w:unhideWhenUsed="1"/>
-    <w:lsdException w:name="Table 3D effects 2" w:semiHidden="1" w:unhideWhenUsed="1"/>
-    <w:lsdException w:name="Table 3D effects 3" w:semiHidden="1" w:unhideWhenUsed="1"/>
-    <w:lsdException w:name="Table Contemporary" w:semiHidden="1" w:unhideWhenUsed="1"/>
-    <w:lsdException w:name="Table Elegant" w:semiHidden="1" w:unhideWhenUsed="1"/>
-    <w:lsdException w:name="Table Professional" w:semiHidden="1" w:unhideWhenUsed="1"/>
-    <w:lsdException w:name="Table Subtle 1" w:semiHidden="1" w:unhideWhenUsed="1"/>
-    <w:lsdException w:name="Table Subtle 2" w:semiHidden="1" w:unhideWhenUsed="1"/>
-    <w:lsdException w:name="Table Web 1" w:semiHidden="1" w:unhideWhenUsed="1"/>
-    <w:lsdException w:name="Table Web 2" w:semiHidden="1" w:unhideWhenUsed="1"/>
-    <w:lsdException w:name="Table Web 3" w:semiHidden="1" w:unhideWhenUsed="1"/>
-    <w:lsdException w:name="Balloon Text" w:semiHidden="1" w:unhideWhenUsed="1"/>
-    <w:lsdException w:name="Table Grid" w:uiPriority="59"/>
-    <w:lsdException w:name="Table Theme" w:semiHidden="1" w:unhideWhenUsed="1"/>
-    <w:lsdException w:name="Placeholder Text" w:semiHidden="1"/>
-    <w:lsdException w:name="No Spacing" w:uiPriority="1" w:qFormat="1"/>
-    <w:lsdException w:name="Light Shading" w:uiPriority="60"/>
-    <w:lsdException w:name="Light List" w:uiPriority="61"/>
-    <w:lsdException w:name="Light Grid" w:uiPriority="62"/>
-    <w:lsdException w:name="Medium Shading 1" w:uiPriority="63"/>
-    <w:lsdException w:name="Medium Shading 2" w:uiPriority="64"/>
-    <w:lsdException w:name="Medium List 1" w:uiPriority="65"/>
-    <w:lsdException w:name="Medium List 2" w:uiPriority="66"/>
-    <w:lsdException w:name="Medium Grid 1" w:uiPriority="67"/>
-    <w:lsdException w:name="Medium Grid 2" w:uiPriority="68"/>
-    <w:lsdException w:name="Medium Grid 3" w:uiPriority="69"/>
-    <w:lsdException w:name="Dark List" w:uiPriority="70"/>
-    <w:lsdException w:name="Colorful Shading" w:uiPriority="71"/>
-    <w:lsdException w:name="Colorful List" w:uiPriority="72"/>
-    <w:lsdException w:name="Colorful Grid" w:uiPriority="73"/>
-    <w:lsdException w:name="Light Shading Accent 1" w:uiPriority="60"/>
-    <w:lsdException w:name="Light List Accent 1" w:uiPriority="61"/>
-    <w:lsdException w:name="Light Grid Accent 1" w:uiPriority="62"/>
-    <w:lsdException w:name="Medium Shading 1 Accent 1" w:uiPriority="63"/>
-    <w:lsdException w:name="Medium Shading 2 Accent 1" w:uiPriority="64"/>
-    <w:lsdException w:name="Medium List 1 Accent 1" w:uiPriority="65"/>
-    <w:lsdException w:name="Revision" w:semiHidden="1"/>
-    <w:lsdException w:name="List Paragraph" w:uiPriority="34" w:qFormat="1"/>
-    <w:lsdException w:name="Quote" w:uiPriority="29" w:qFormat="1"/>
-    <w:lsdException w:name="Intense Quote" w:uiPriority="30" w:qFormat="1"/>
-    <w:lsdException w:name="Medium List 2 Accent 1" w:uiPriority="66"/>
-    <w:lsdException w:name="Medium Grid 1 Accent 1" w:uiPriority="67"/>
-    <w:lsdException w:name="Medium Grid 2 Accent 1" w:uiPriority="68"/>
-    <w:lsdException w:name="Medium Grid 3 Accent 1" w:uiPriority="69"/>
-    <w:lsdException w:name="Dark List Accent 1" w:uiPriority="70"/>
-    <w:lsdException w:name="Colorful Shading Accent 1" w:uiPriority="71"/>
-    <w:lsdException w:name="Colorful List Accent 1" w:uiPriority="72"/>
-    <w:lsdException w:name="Colorful Grid Accent 1" w:uiPriority="73"/>
-    <w:lsdException w:name="Light Shading Accent 2" w:uiPriority="60"/>
-    <w:lsdException w:name="Light List Accent 2" w:uiPriority="61"/>
-    <w:lsdException w:name="Light Grid Accent 2" w:uiPriority="62"/>
-    <w:lsdException w:name="Medium Shading 1 Accent 2" w:uiPriority="63"/>
-    <w:lsdException w:name="Medium Shading 2 Accent 2" w:uiPriority="64"/>
-    <w:lsdException w:name="Medium List 1 Accent 2" w:uiPriority="65"/>
-    <w:lsdException w:name="Medium List 2 Accent 2" w:uiPriority="66"/>
-    <w:lsdException w:name="Medium Grid 1 Accent 2" w:uiPriority="67"/>
-    <w:lsdException w:name="Medium Grid 2 Accent 2" w:uiPriority="68"/>
-    <w:lsdException w:name="Medium Grid 3 Accent 2" w:uiPriority="69"/>
-    <w:lsdException w:name="Dark List Accent 2" w:uiPriority="70"/>
-    <w:lsdException w:name="Colorful Shading Accent 2" w:uiPriority="71"/>
-    <w:lsdException w:name="Colorful List Accent 2" w:uiPriority="72"/>
-    <w:lsdException w:name="Colorful Grid Accent 2" w:uiPriority="73"/>
-    <w:lsdException w:name="Light Shading Accent 3" w:uiPriority="60"/>
-    <w:lsdException w:name="Light List Accent 3" w:uiPriority="61"/>
-    <w:lsdException w:name="Light Grid Accent 3" w:uiPriority="62"/>
-    <w:lsdException w:name="Medium Shading 1 Accent 3" w:uiPriority="63"/>
-    <w:lsdException w:name="Medium Shading 2 Accent 3" w:uiPriority="64"/>
-    <w:lsdException w:name="Medium List 1 Accent 3" w:uiPriority="65"/>
-    <w:lsdException w:name="Medium List 2 Accent 3" w:uiPriority="66"/>
-    <w:lsdException w:name="Medium Grid 1 Accent 3" w:uiPriority="67"/>
-    <w:lsdException w:name="Medium Grid 2 Accent 3" w:uiPriority="68"/>
-    <w:lsdException w:name="Medium Grid 3 Accent 3" w:uiPriority="69"/>
-    <w:lsdException w:name="Dark List Accent 3" w:uiPriority="70"/>
-    <w:lsdException w:name="Colorful Shading Accent 3" w:uiPriority="71"/>
-    <w:lsdException w:name="Colorful List Accent 3" w:uiPriority="72"/>
-    <w:lsdException w:name="Colorful Grid Accent 3" w:uiPriority="73"/>
-    <w:lsdException w:name="Light Shading Accent 4" w:uiPriority="60"/>
-    <w:lsdException w:name="Light List Accent 4" w:uiPriority="61"/>
-    <w:lsdException w:name="Light Grid Accent 4" w:uiPriority="62"/>
-    <w:lsdException w:name="Medium Shading 1 Accent 4" w:uiPriority="63"/>
-    <w:lsdException w:name="Medium Shading 2 Accent 4" w:uiPriority="64"/>
-    <w:lsdException w:name="Medium List 1 Accent 4" w:uiPriority="65"/>
-    <w:lsdException w:name="Medium List 2 Accent 4" w:uiPriority="66"/>
-    <w:lsdException w:name="Medium Grid 1 Accent 4" w:uiPriority="67"/>
-    <w:lsdException w:name="Medium Grid 2 Accent 4" w:uiPriority="68"/>
-    <w:lsdException w:name="Medium Grid 3 Accent 4" w:uiPriority="69"/>
-    <w:lsdException w:name="Dark List Accent 4" w:uiPriority="70"/>
-    <w:lsdException w:name="Colorful Shading Accent 4" w:uiPriority="71"/>
-    <w:lsdException w:name="Colorful List Accent 4" w:uiPriority="72"/>
-    <w:lsdException w:name="Colorful Grid Accent 4" w:uiPriority="73"/>
-    <w:lsdException w:name="Light Shading Accent 5" w:uiPriority="60"/>
-    <w:lsdException w:name="Light List Accent 5" w:uiPriority="61"/>
-    <w:lsdException w:name="Light Grid Accent 5" w:uiPriority="62"/>
-    <w:lsdException w:name="Medium Shading 1 Accent 5" w:uiPriority="63"/>
-    <w:lsdException w:name="Medium Shading 2 Accent 5" w:uiPriority="64"/>
-    <w:lsdException w:name="Medium List 1 Accent 5" w:uiPriority="65"/>
-    <w:lsdException w:name="Medium List 2 Accent 5" w:uiPriority="66"/>
-    <w:lsdException w:name="Medium Grid 1 Accent 5" w:uiPriority="67"/>
-    <w:lsdException w:name="Medium Grid 2 Accent 5" w:uiPriority="68"/>
-    <w:lsdException w:name="Medium Grid 3 Accent 5" w:uiPriority="69"/>
-    <w:lsdException w:name="Dark List Accent 5" w:uiPriority="70"/>
-    <w:lsdException w:name="Colorful Shading Accent 5" w:uiPriority="71"/>
-    <w:lsdException w:name="Colorful List Accent 5" w:uiPriority="72"/>
-    <w:lsdException w:name="Colorful Grid Accent 5" w:uiPriority="73"/>
-    <w:lsdException w:name="Light Shading Accent 6" w:uiPriority="60"/>
-    <w:lsdException w:name="Light List Accent 6" w:uiPriority="61"/>
-    <w:lsdException w:name="Light Grid Accent 6" w:uiPriority="62"/>
-    <w:lsdException w:name="Medium Shading 1 Accent 6" w:uiPriority="63"/>
-    <w:lsdException w:name="Medium Shading 2 Accent 6" w:uiPriority="64"/>
-    <w:lsdException w:name="Medium List 1 Accent 6" w:uiPriority="65"/>
-    <w:lsdException w:name="Medium List 2 Accent 6" w:uiPriority="66"/>
-    <w:lsdException w:name="Medium Grid 1 Accent 6" w:uiPriority="67"/>
-    <w:lsdException w:name="Medium Grid 2 Accent 6" w:uiPriority="68"/>
-    <w:lsdException w:name="Medium Grid 3 Accent 6" w:uiPriority="69"/>
-    <w:lsdException w:name="Dark List Accent 6" w:uiPriority="70"/>
-    <w:lsdException w:name="Colorful Shading Accent 6" w:uiPriority="71"/>
-    <w:lsdException w:name="Colorful List Accent 6" w:uiPriority="72"/>
-    <w:lsdException w:name="Colorful Grid Accent 6" w:uiPriority="73"/>
-    <w:lsdException w:name="Subtle Emphasis" w:uiPriority="19" w:qFormat="1"/>
-    <w:lsdException w:name="Intense Emphasis" w:uiPriority="21" w:qFormat="1"/>
-    <w:lsdException w:name="Subtle Reference" w:uiPriority="31" w:qFormat="1"/>
-    <w:lsdException w:name="Intense Reference" w:uiPriority="32" w:qFormat="1"/>
-    <w:lsdException w:name="Book Title" w:uiPriority="33" w:qFormat="1"/>
-    <w:lsdException w:name="Bibliography" w:semiHidden="1" w:uiPriority="37" w:unhideWhenUsed="1"/>
-    <w:lsdException w:name="TOC Heading" w:semiHidden="1" w:uiPriority="39" w:unhideWhenUsed="1" w:qFormat="1"/>
-    <w:lsdException w:name="Plain Table 1" w:uiPriority="41"/>
-    <w:lsdException w:name="Plain Table 2" w:uiPriority="42"/>
-    <w:lsdException w:name="Plain Table 3" w:uiPriority="43"/>
-    <w:lsdException w:name="Plain Table 4" w:uiPriority="44"/>
-    <w:lsdException w:name="Plain Table 5" w:uiPriority="45"/>
-    <w:lsdException w:name="Grid Table Light" w:uiPriority="40"/>
-    <w:lsdException w:name="Grid Table 1 Light" w:uiPriority="46"/>
-    <w:lsdException w:name="Grid Table 2" w:uiPriority="47"/>
-    <w:lsdException w:name="Grid Table 3" w:uiPriority="48"/>
-    <w:lsdException w:name="Grid Table 4" w:uiPriority="49"/>
-    <w:lsdException w:name="Grid Table 5 Dark" w:uiPriority="50"/>
-    <w:lsdException w:name="Grid Table 6 Colorful" w:uiPriority="51"/>
-    <w:lsdException w:name="Grid Table 7 Colorful" w:uiPriority="52"/>
-    <w:lsdException w:name="Grid Table 1 Light Accent 1" w:uiPriority="46"/>
-    <w:lsdException w:name="Grid Table 2 Accent 1" w:uiPriority="47"/>
-    <w:lsdException w:name="Grid Table 3 Accent 1" w:uiPriority="48"/>
-    <w:lsdException w:name="Grid Table 4 Accent 1" w:uiPriority="49"/>
-    <w:lsdException w:name="Grid Table 5 Dark Accent 1" w:uiPriority="50"/>
-    <w:lsdException w:name="Grid Table 6 Colorful Accent 1" w:uiPriority="51"/>
-    <w:lsdException w:name="Grid Table 7 Colorful Accent 1" w:uiPriority="52"/>
-    <w:lsdException w:name="Grid Table 1 Light Accent 2" w:uiPriority="46"/>
-    <w:lsdException w:name="Grid Table 2 Accent 2" w:uiPriority="47"/>
-    <w:lsdException w:name="Grid Table 3 Accent 2" w:uiPriority="48"/>
-    <w:lsdException w:name="Grid Table 4 Accent 2" w:uiPriority="49"/>
-    <w:lsdException w:name="Grid Table 5 Dark Accent 2" w:uiPriority="50"/>
-    <w:lsdException w:name="Grid Table 6 Colorful Accent 2" w:uiPriority="51"/>
-    <w:lsdException w:name="Grid Table 7 Colorful Accent 2" w:uiPriority="52"/>
-    <w:lsdException w:name="Grid Table 1 Light Accent 3" w:uiPriority="46"/>
-    <w:lsdException w:name="Grid Table 2 Accent 3" w:uiPriority="47"/>
-    <w:lsdException w:name="Grid Table 3 Accent 3" w:uiPriority="48"/>
-    <w:lsdException w:name="Grid Table 4 Accent 3" w:uiPriority="49"/>
-    <w:lsdException w:name="Grid Table 5 Dark Accent 3" w:uiPriority="50"/>
-    <w:lsdException w:name="Grid Table 6 Colorful Accent 3" w:uiPriority="51"/>
-    <w:lsdException w:name="Grid Table 7 Colorful Accent 3" w:uiPriority="52"/>
-    <w:lsdException w:name="Grid Table 1 Light Accent 4" w:uiPriority="46"/>
-    <w:lsdException w:name="Grid Table 2 Accent 4" w:uiPriority="47"/>
-    <w:lsdException w:name="Grid Table 3 Accent 4" w:uiPriority="48"/>
-    <w:lsdException w:name="Grid Table 4 Accent 4" w:uiPriority="49"/>
-    <w:lsdException w:name="Grid Table 5 Dark Accent 4" w:uiPriority="50"/>
-    <w:lsdException w:name="Grid Table 6 Colorful Accent 4" w:uiPriority="51"/>
-    <w:lsdException w:name="Grid Table 7 Colorful Accent 4" w:uiPriority="52"/>
-    <w:lsdException w:name="Grid Table 1 Light Accent 5" w:uiPriority="46"/>
-    <w:lsdException w:name="Grid Table 2 Accent 5" w:uiPriority="47"/>
-    <w:lsdException w:name="Grid Table 3 Accent 5" w:uiPriority="48"/>
-    <w:lsdException w:name="Grid Table 4 Accent 5" w:uiPriority="49"/>
-    <w:lsdException w:name="Grid Table 5 Dark Accent 5" w:uiPriority="50"/>
-    <w:lsdException w:name="Grid Table 6 Colorful Accent 5" w:uiPriority="51"/>
-    <w:lsdException w:name="Grid Table 7 Colorful Accent 5" w:uiPriority="52"/>
-    <w:lsdException w:name="Grid Table 1 Light Accent 6" w:uiPriority="46"/>
-    <w:lsdException w:name="Grid Table 2 Accent 6" w:uiPriority="47"/>
-    <w:lsdException w:name="Grid Table 3 Accent 6" w:uiPriority="48"/>
-    <w:lsdException w:name="Grid Table 4 Accent 6" w:uiPriority="49"/>
-    <w:lsdException w:name="Grid Table 5 Dark Accent 6" w:uiPriority="50"/>
-    <w:lsdException w:name="Grid Table 6 Colorful Accent 6" w:uiPriority="51"/>
-    <w:lsdException w:name="Grid Table 7 Colorful Accent 6" w:uiPriority="52"/>
-    <w:lsdException w:name="List Table 1 Light" w:uiPriority="46"/>
-    <w:lsdException w:name="List Table 2" w:uiPriority="47"/>
-    <w:lsdException w:name="List Table 3" w:uiPriority="48"/>
-    <w:lsdException w:name="List Table 4" w:uiPriority="49"/>
-    <w:lsdException w:name="List Table 5 Dark" w:uiPriority="50"/>
-    <w:lsdException w:name="List Table 6 Colorful" w:uiPriority="51"/>
-    <w:lsdException w:name="List Table 7 Colorful" w:uiPriority="52"/>
-    <w:lsdException w:name="List Table 1 Light Accent 1" w:uiPriority="46"/>
-    <w:lsdException w:name="List Table 2 Accent 1" w:uiPriority="47"/>
-    <w:lsdException w:name="List Table 3 Accent 1" w:uiPriority="48"/>
-    <w:lsdException w:name="List Table 4 Accent 1" w:uiPriority="49"/>
-    <w:lsdException w:name="List Table 5 Dark Accent 1" w:uiPriority="50"/>
-    <w:lsdException w:name="List Table 6 Colorful Accent 1" w:uiPriority="51"/>
-    <w:lsdException w:name="List Table 7 Colorful Accent 1" w:uiPriority="52"/>
-    <w:lsdException w:name="List Table 1 Light Accent 2" w:uiPriority="46"/>
-    <w:lsdException w:name="List Table 2 Accent 2" w:uiPriority="47"/>
-    <w:lsdException w:name="List Table 3 Accent 2" w:uiPriority="48"/>
-    <w:lsdException w:name="List Table 4 Accent 2" w:uiPriority="49"/>
-    <w:lsdException w:name="List Table 5 Dark Accent 2" w:uiPriority="50"/>
-    <w:lsdException w:name="List Table 6 Colorful Accent 2" w:uiPriority="51"/>
-    <w:lsdException w:name="List Table 7 Colorful Accent 2" w:uiPriority="52"/>
-    <w:lsdException w:name="List Table 1 Light Accent 3" w:uiPriority="46"/>
-    <w:lsdException w:name="List Table 2 Accent 3" w:uiPriority="47"/>
-    <w:lsdException w:name="List Table 3 Accent 3" w:uiPriority="48"/>
-    <w:lsdException w:name="List Table 4 Accent 3" w:uiPriority="49"/>
-    <w:lsdException w:name="List Table 5 Dark Accent 3" w:uiPriority="50"/>
-    <w:lsdException w:name="List Table 6 Colorful Accent 3" w:uiPriority="51"/>
-    <w:lsdException w:name="List Table 7 Colorful Accent 3" w:uiPriority="52"/>
-    <w:lsdException w:name="List Table 1 Light Accent 4" w:uiPriority="46"/>
-    <w:lsdException w:name="List Table 2 Accent 4" w:uiPriority="47"/>
-    <w:lsdException w:name="List Table 3 Accent 4" w:uiPriority="48"/>
-    <w:lsdException w:name="List Table 4 Accent 4" w:uiPriority="49"/>
-    <w:lsdException w:name="List Table 5 Dark Accent 4" w:uiPriority="50"/>
-    <w:lsdException w:name="List Table 6 Colorful Accent 4" w:uiPriority="51"/>
-    <w:lsdException w:name="List Table 7 Colorful Accent 4" w:uiPriority="52"/>
-    <w:lsdException w:name="List Table 1 Light Accent 5" w:uiPriority="46"/>
-    <w:lsdException w:name="List Table 2 Accent 5" w:uiPriority="47"/>
-    <w:lsdException w:name="List Table 3 Accent 5" w:uiPriority="48"/>
-    <w:lsdException w:name="List Table 4 Accent 5" w:uiPriority="49"/>
-    <w:lsdException w:name="List Table 5 Dark Accent 5" w:uiPriority="50"/>
-    <w:lsdException w:name="List Table 6 Colorful Accent 5" w:uiPriority="51"/>
-    <w:lsdException w:name="List Table 7 Colorful Accent 5" w:uiPriority="52"/>
-    <w:lsdException w:name="List Table 1 Light Accent 6" w:uiPriority="46"/>
-    <w:lsdException w:name="List Table 2 Accent 6" w:uiPriority="47"/>
-    <w:lsdException w:name="List Table 3 Accent 6" w:uiPriority="48"/>
-    <w:lsdException w:name="List Table 4 Accent 6" w:uiPriority="49"/>
-    <w:lsdException w:name="List Table 5 Dark Accent 6" w:uiPriority="50"/>
-    <w:lsdException w:name="List Table 6 Colorful Accent 6" w:uiPriority="51"/>
-    <w:lsdException w:name="List Table 7 Colorful Accent 6" w:uiPriority="52"/>
-    <w:lsdException w:name="Mention" w:semiHidden="1" w:unhideWhenUsed="1"/>
-    <w:lsdException w:name="Smart Hyperlink" w:semiHidden="1" w:unhideWhenUsed="1"/>
-    <w:lsdException w:name="Hashtag" w:semiHidden="1" w:unhideWhenUsed="1"/>
-    <w:lsdException w:name="Unresolved Mention" w:semiHidden="1" w:unhideWhenUsed="1"/>
-    <w:lsdException w:name="Smart Link" w:semiHidden="1" w:unhideWhenUsed="1"/>
-  </w:latentStyles>
-  <w:style w:type="paragraph" w:default="1" w:styleId="Normal">
-    <w:name w:val="Normal"/>
-    <w:qFormat/>
-    <w:rsid w:val="00BD2436"/>
-  </w:style>
-  <w:style w:type="character" w:default="1" w:styleId="Fuentedeprrafopredeter">
-    <w:name w:val="Default Paragraph Font"/>
-    <w:uiPriority w:val="1"/>
-    <w:semiHidden/>
-    <w:unhideWhenUsed/>
-  </w:style>
-  <w:style w:type="table" w:default="1" w:styleId="Tablanormal">
-    <w:name w:val="Normal Table"/>
-    <w:uiPriority w:val="99"/>
-    <w:semiHidden/>
-    <w:unhideWhenUsed/>
-    <w:tblPr>
-      <w:tblInd w:w="0" w:type="dxa"/>
-      <w:tblCellMar>
-        <w:top w:w="0" w:type="dxa"/>
-        <w:left w:w="108" w:type="dxa"/>
-        <w:bottom w:w="0" w:type="dxa"/>
-        <w:right w:w="108" w:type="dxa"/>
-      </w:tblCellMar>
-    </w:tblPr>
-  </w:style>
-  <w:style w:type="numbering" w:default="1" w:styleId="Sinlista">
-    <w:name w:val="No List"/>
-    <w:uiPriority w:val="99"/>
-    <w:semiHidden/>
-    <w:unhideWhenUsed/>
-  </w:style>
-  <w:style w:type="paragraph" w:customStyle="1" w:styleId="6249C296035045A4B35172D034FA06AE">
-    <w:name w:val="6249C296035045A4B35172D034FA06AE"/>
-    <w:rsid w:val="00960213"/>
-  </w:style>
-  <w:style w:type="paragraph" w:customStyle="1" w:styleId="C3A9BEF9B31C43B3ABDAE773F5A369DA">
-    <w:name w:val="C3A9BEF9B31C43B3ABDAE773F5A369DA"/>
-    <w:rsid w:val="00960213"/>
-  </w:style>
-</w:styles>
-</file>
-
-<file path=word/glossary/webSettings.xml><?xml version="1.0" encoding="utf-8"?>
-<w:webSettings xmlns:mc="http://schemas.openxmlformats.org/markup-compatibility/2006" xmlns:r="http://schemas.openxmlformats.org/officeDocument/2006/relationships" xmlns:w="http://schemas.openxmlformats.org/wordprocessingml/2006/main" xmlns:w14="http://schemas.microsoft.com/office/word/2010/wordml" xmlns:w15="http://schemas.microsoft.com/office/word/2012/wordml" xmlns:w16cex="http://schemas.microsoft.com/office/word/2018/wordml/cex" xmlns:w16cid="http://schemas.microsoft.com/office/word/2016/wordml/cid" xmlns:w16="http://schemas.microsoft.com/office/word/2018/wordml" xmlns:w16du="http://schemas.microsoft.com/office/word/2023/wordml/word16du" xmlns:w16sdtdh="http://schemas.microsoft.com/office/word/2020/wordml/sdtdatahash" xmlns:w16sdtfl="http://schemas.microsoft.com/office/word/2024/wordml/sdtformatlock" xmlns:w16se="http://schemas.microsoft.com/office/word/2015/wordml/symex" mc:Ignorable="w14 w15 w16se w16cid w16 w16cex w16sdtdh w16sdtfl w16du">
-  <w:optimizeForBrowser/>
-</w:webSettings>
 </file>
 
 <file path=word/theme/theme1.xml><?xml version="1.0" encoding="utf-8"?>
@@ -8398,6 +7856,25 @@
 </file>
 
 <file path=customXml/item3.xml><?xml version="1.0" encoding="utf-8"?>
+<p:properties xmlns:p="http://schemas.microsoft.com/office/2006/metadata/properties" xmlns:xsi="http://www.w3.org/2001/XMLSchema-instance" xmlns:pc="http://schemas.microsoft.com/office/infopath/2007/PartnerControls">
+  <documentManagement>
+    <lcf76f155ced4ddcb4097134ff3c332f xmlns="e1e7bc46-bed0-459f-9452-a76b1c5b695e">
+      <Terms xmlns="http://schemas.microsoft.com/office/infopath/2007/PartnerControls"/>
+    </lcf76f155ced4ddcb4097134ff3c332f>
+  </documentManagement>
+</p:properties>
+</file>
+
+<file path=customXml/item4.xml><?xml version="1.0" encoding="utf-8"?>
+<?mso-contentType ?>
+<FormTemplates xmlns="http://schemas.microsoft.com/sharepoint/v3/contenttype/forms">
+  <Display>DocumentLibraryForm</Display>
+  <Edit>DocumentLibraryForm</Edit>
+  <New>DocumentLibraryForm</New>
+</FormTemplates>
+</file>
+
+<file path=customXml/item5.xml><?xml version="1.0" encoding="utf-8"?>
 <ct:contentTypeSchema xmlns:ct="http://schemas.microsoft.com/office/2006/metadata/contentType" xmlns:ma="http://schemas.microsoft.com/office/2006/metadata/properties/metaAttributes" ct:_="" ma:_="" ma:contentTypeName="Documento" ma:contentTypeID="0x0101005395107FFD641345A10C8A5ACACB9D20" ma:contentTypeVersion="12" ma:contentTypeDescription="Crear nuevo documento." ma:contentTypeScope="" ma:versionID="ce7786e0ad11988b1588e06b80e33958">
   <xsd:schema xmlns:xsd="http://www.w3.org/2001/XMLSchema" xmlns:xs="http://www.w3.org/2001/XMLSchema" xmlns:p="http://schemas.microsoft.com/office/2006/metadata/properties" xmlns:ns2="e1e7bc46-bed0-459f-9452-a76b1c5b695e" xmlns:ns3="bb8cf7e1-610f-40a0-8f00-126b9d139fde" targetNamespace="http://schemas.microsoft.com/office/2006/metadata/properties" ma:root="true" ma:fieldsID="99ef8fa6ee73c11c731191fdf3d87e67" ns2:_="" ns3:_="">
     <xsd:import namespace="e1e7bc46-bed0-459f-9452-a76b1c5b695e"/>
@@ -8608,25 +8085,6 @@
 </ct:contentTypeSchema>
 </file>
 
-<file path=customXml/item4.xml><?xml version="1.0" encoding="utf-8"?>
-<?mso-contentType ?>
-<FormTemplates xmlns="http://schemas.microsoft.com/sharepoint/v3/contenttype/forms">
-  <Display>DocumentLibraryForm</Display>
-  <Edit>DocumentLibraryForm</Edit>
-  <New>DocumentLibraryForm</New>
-</FormTemplates>
-</file>
-
-<file path=customXml/item5.xml><?xml version="1.0" encoding="utf-8"?>
-<p:properties xmlns:p="http://schemas.microsoft.com/office/2006/metadata/properties" xmlns:xsi="http://www.w3.org/2001/XMLSchema-instance" xmlns:pc="http://schemas.microsoft.com/office/infopath/2007/PartnerControls">
-  <documentManagement>
-    <lcf76f155ced4ddcb4097134ff3c332f xmlns="e1e7bc46-bed0-459f-9452-a76b1c5b695e">
-      <Terms xmlns="http://schemas.microsoft.com/office/infopath/2007/PartnerControls"/>
-    </lcf76f155ced4ddcb4097134ff3c332f>
-  </documentManagement>
-</p:properties>
-</file>
-
 <file path=customXml/itemProps1.xml><?xml version="1.0" encoding="utf-8"?>
 <ds:datastoreItem xmlns:ds="http://schemas.openxmlformats.org/officeDocument/2006/customXml" ds:itemID="{55AF091B-3C7A-41E3-B477-F2FDAA23CFDA}">
   <ds:schemaRefs>
@@ -8644,6 +8102,24 @@
 </file>
 
 <file path=customXml/itemProps3.xml><?xml version="1.0" encoding="utf-8"?>
+<ds:datastoreItem xmlns:ds="http://schemas.openxmlformats.org/officeDocument/2006/customXml" ds:itemID="{63DC901F-FAA1-4F85-A9CC-9C7359C8E423}">
+  <ds:schemaRefs>
+    <ds:schemaRef ds:uri="http://schemas.microsoft.com/office/2006/metadata/properties"/>
+    <ds:schemaRef ds:uri="http://schemas.microsoft.com/office/infopath/2007/PartnerControls"/>
+    <ds:schemaRef ds:uri="e1e7bc46-bed0-459f-9452-a76b1c5b695e"/>
+  </ds:schemaRefs>
+</ds:datastoreItem>
+</file>
+
+<file path=customXml/itemProps4.xml><?xml version="1.0" encoding="utf-8"?>
+<ds:datastoreItem xmlns:ds="http://schemas.openxmlformats.org/officeDocument/2006/customXml" ds:itemID="{A4BFFE9F-5147-42BA-B811-5D5010A77C56}">
+  <ds:schemaRefs>
+    <ds:schemaRef ds:uri="http://schemas.microsoft.com/sharepoint/v3/contenttype/forms"/>
+  </ds:schemaRefs>
+</ds:datastoreItem>
+</file>
+
+<file path=customXml/itemProps5.xml><?xml version="1.0" encoding="utf-8"?>
 <ds:datastoreItem xmlns:ds="http://schemas.openxmlformats.org/officeDocument/2006/customXml" ds:itemID="{F7E7D6A9-ACD5-4280-B5C2-9EE06CD3BC41}">
   <ds:schemaRefs>
     <ds:schemaRef ds:uri="http://schemas.microsoft.com/office/2006/metadata/contentType"/>
@@ -8660,22 +8136,4 @@
     <ds:schemaRef ds:uri="http://schemas.microsoft.com/internal/obd"/>
   </ds:schemaRefs>
 </ds:datastoreItem>
-</file>
-
-<file path=customXml/itemProps4.xml><?xml version="1.0" encoding="utf-8"?>
-<ds:datastoreItem xmlns:ds="http://schemas.openxmlformats.org/officeDocument/2006/customXml" ds:itemID="{A4BFFE9F-5147-42BA-B811-5D5010A77C56}">
-  <ds:schemaRefs>
-    <ds:schemaRef ds:uri="http://schemas.microsoft.com/sharepoint/v3/contenttype/forms"/>
-  </ds:schemaRefs>
-</ds:datastoreItem>
-</file>
-
-<file path=customXml/itemProps5.xml><?xml version="1.0" encoding="utf-8"?>
-<ds:datastoreItem xmlns:ds="http://schemas.openxmlformats.org/officeDocument/2006/customXml" ds:itemID="{63DC901F-FAA1-4F85-A9CC-9C7359C8E423}">
-  <ds:schemaRefs>
-    <ds:schemaRef ds:uri="http://schemas.microsoft.com/office/2006/metadata/properties"/>
-    <ds:schemaRef ds:uri="http://schemas.microsoft.com/office/infopath/2007/PartnerControls"/>
-    <ds:schemaRef ds:uri="e1e7bc46-bed0-459f-9452-a76b1c5b695e"/>
-  </ds:schemaRefs>
-</ds:datastoreItem>
 </file>
</xml_diff>

<commit_message>
Agregamos checkout, ofertas y pruebas
</commit_message>
<xml_diff>
--- a/docs/Anexo 4 - ERS Grano.docx
+++ b/docs/Anexo 4 - ERS Grano.docx
@@ -3063,6 +3063,90 @@
         </w:p>
         <w:p>
           <w:pPr>
+            <w:pStyle w:val="TDC1"/>
+            <w:tabs>
+              <w:tab w:val="right" w:leader="dot" w:pos="9204"/>
+            </w:tabs>
+            <w:rPr>
+              <w:b w:val="0"/>
+              <w:bCs w:val="0"/>
+              <w:caps w:val="0"/>
+              <w:noProof/>
+              <w:kern w:val="2"/>
+              <w:sz w:val="24"/>
+              <w:szCs w:val="24"/>
+              <w:lang w:val="es-CL" w:eastAsia="es-CL"/>
+              <w14:ligatures w14:val="standardContextual"/>
+            </w:rPr>
+          </w:pPr>
+          <w:hyperlink w:anchor="_GranoRequisitosV2">
+            <w:r>
+              <w:t>4 Requisitos incorporados en la entrega V2</w:t>
+            </w:r>
+            <w:r>
+              <w:tab/>
+            </w:r>
+            <w:r>
+              <w:fldChar w:fldCharType="begin"/>
+            </w:r>
+            <w:r>
+              <w:instrText> PAGEREF _GranoRequisitosV2 \h </w:instrText>
+            </w:r>
+            <w:r>
+              <w:fldChar w:fldCharType="separate"/>
+            </w:r>
+            <w:r>
+              <w:t>11</w:t>
+            </w:r>
+            <w:r>
+              <w:fldChar w:fldCharType="end"/>
+            </w:r>
+          </w:hyperlink>
+        </w:p>
+        <w:p>
+          <w:pPr>
+            <w:pStyle w:val="TDC1"/>
+            <w:tabs>
+              <w:tab w:val="right" w:leader="dot" w:pos="9204"/>
+            </w:tabs>
+            <w:rPr>
+              <w:b w:val="0"/>
+              <w:bCs w:val="0"/>
+              <w:caps w:val="0"/>
+              <w:noProof/>
+              <w:kern w:val="2"/>
+              <w:sz w:val="24"/>
+              <w:szCs w:val="24"/>
+              <w:lang w:val="es-CL" w:eastAsia="es-CL"/>
+              <w14:ligatures w14:val="standardContextual"/>
+            </w:rPr>
+          </w:pPr>
+          <w:hyperlink w:anchor="_GranoVerificacionV2">
+            <w:r>
+              <w:t>5 Verificación de la entrega</w:t>
+            </w:r>
+            <w:r>
+              <w:tab/>
+            </w:r>
+            <w:r>
+              <w:fldChar w:fldCharType="begin"/>
+            </w:r>
+            <w:r>
+              <w:instrText> PAGEREF _GranoVerificacionV2 \h </w:instrText>
+            </w:r>
+            <w:r>
+              <w:fldChar w:fldCharType="separate"/>
+            </w:r>
+            <w:r>
+              <w:t>12</w:t>
+            </w:r>
+            <w:r>
+              <w:fldChar w:fldCharType="end"/>
+            </w:r>
+          </w:hyperlink>
+        </w:p>
+        <w:p>
+          <w:pPr>
             <w:jc w:val="both"/>
             <w:rPr>
               <w:rFonts w:cstheme="minorHAnsi"/>
@@ -3443,6 +3527,48 @@
           </w:p>
         </w:tc>
       </w:tr>
+      <w:tr>
+        <w:tc>
+          <w:tcPr>
+            <w:tcW w:type="dxa" w:w="1188"/>
+          </w:tcPr>
+          <w:p>
+            <w:r>
+              <w:t>30/10/2026</w:t>
+            </w:r>
+          </w:p>
+        </w:tc>
+        <w:tc>
+          <w:tcPr>
+            <w:tcW w:type="dxa" w:w="1080"/>
+          </w:tcPr>
+          <w:p>
+            <w:r>
+              <w:t>2.0</w:t>
+            </w:r>
+          </w:p>
+        </w:tc>
+        <w:tc>
+          <w:tcPr>
+            <w:tcW w:type="dxa" w:w="3060"/>
+          </w:tcPr>
+          <w:p>
+            <w:r>
+              <w:t>Brian Bravo y Matías Guerra</w:t>
+            </w:r>
+          </w:p>
+        </w:tc>
+        <w:tc>
+          <w:tcPr>
+            <w:tcW w:type="dxa" w:w="3316"/>
+          </w:tcPr>
+          <w:p>
+            <w:r>
+              <w:t>Checkout, ofertas, categorías, reportes, comprobantes y pruebas de componentes con Jasmine y Karma.</w:t>
+            </w:r>
+          </w:p>
+        </w:tc>
+      </w:tr>
     </w:tbl>
     <w:p>
       <w:pPr>
@@ -3611,7 +3737,7 @@
         </w:rPr>
       </w:pPr>
       <w:r>
-        <w:t>Versión actualizada. El sitio original y la aplicación React presentan la tienda; React permite registrar cuentas, administrar productos y guardar pedidos de prueba en el navegador.</w:t>
+        <w:t>Versión 2.0 actualizada el 30 de octubre de 2026. Grano funciona como una única aplicación React desde la raíz del proyecto. Esta entrega incorpora checkout, resultados de compra, ofertas, categorías, administración ampliada y pruebas con Jasmine y Karma.</w:t>
       </w:r>
     </w:p>
     <w:p>
@@ -4017,7 +4143,7 @@
         <w:spacing w:after="100"/>
       </w:pPr>
       <w:r>
-        <w:t>El alcance incluye Inicio, Nuestro café, Nosotros, Contacto, fichas de productos, carrito, cuenta de comprador y administración. La versión actual funciona en el navegador y guarda los datos de la demostración de manera local. Permite registrar pedidos de prueba, pero no procesa pagos ni utiliza un servidor.</w:t>
+        <w:t>El alcance incluye Inicio, catálogo, categorías, ofertas, historias del café, Nosotros, Contacto, fichas, carrito, checkout, comprobantes, cuenta, administración y vendedor. La demostración guarda los datos en localStorage; no procesa cobros, despachos ni pagos reales y no requiere backend.</w:t>
       </w:r>
     </w:p>
     <w:p>
@@ -4210,7 +4336,7 @@
         <w:spacing w:after="100"/>
       </w:pPr>
       <w:r>
-        <w:t>El sitio HTML original y la aplicación React muestran la misma propuesta de tienda. React reúne las pantallas y los datos de la demostración en una aplicación independiente, mientras el sitio inicial sigue disponible como referencia del diseño.</w:t>
+        <w:t>La aplicación principal está migrada a React 19 y Vite 8 desde la raíz. React Router DOM gestiona rutas por hash y conserva enlaces HTML anteriores. Las hojas de estilo, tipografías, fotografías y colores de la tienda mantienen la identidad artesanal.</w:t>
       </w:r>
     </w:p>
     <w:p>
@@ -4243,7 +4369,7 @@
         <w:spacing w:after="100"/>
       </w:pPr>
       <w:r>
-        <w:t>En React se puede recorrer la tienda, abrir fichas, agregar y quitar productos del carrito, ver imágenes y total, crear una cuenta e iniciar sesión, registrar un pedido de prueba, consultar el historial, actualizar el perfil y enviar mensajes. El administrador puede revisar pedidos, usuarios y mensajes, crear cuentas con roles y agregar o quitar productos nuevos con una imagen opcional.</w:t>
+        <w:t>En React se puede recorrer el catálogo, buscar y filtrar, consultar categorías y ofertas, manejar cantidades y stock, registrar cuentas, completar checkout con datos precargados, simular aprobación o rechazo y consultar comprobantes. Administración mantiene productos, ofertas, categorías, usuarios, pedidos y mensajes, además de mostrar reportes y perfil. El vendedor consulta disponibilidad y pedidos.</w:t>
       </w:r>
     </w:p>
     <w:p>
@@ -4287,7 +4413,7 @@
         <w:spacing w:after="100"/>
       </w:pPr>
       <w:r>
-        <w:t>El visitante puede revisar los productos y enviar una consulta. El comprador registra su cuenta con un RUT válido, entra automáticamente al terminar el registro y puede confirmar pedidos de prueba. El administrador mantiene el catálogo y consulta pedidos, usuarios y mensajes.</w:t>
+        <w:t>El visitante revisa productos, categorías, ofertas e historias y puede enviar una consulta. El comprador registra su cuenta, completa checkout y consulta sus comprobantes. El vendedor consulta productos y pedidos. El administrador mantiene los datos de la demostración y los estados de pedidos.</w:t>
       </w:r>
     </w:p>
     <w:p>
@@ -4371,7 +4497,7 @@
         <w:spacing w:after="100"/>
       </w:pPr>
       <w:r>
-        <w:t>Suponemos que la persona usará un navegador actualizado y que la información de cada producto se revisará antes de publicarse. Para ejecutar React durante el desarrollo se necesita iniciar el servidor de Vite desde la carpeta react.</w:t>
+        <w:t>Se requiere un navegador actualizado y Node.js 22.12 o superior durante el desarrollo. Desde la raíz se ejecuta pnpm install --frozen-lockfile y pnpm dev. Las pruebas de componentes usan Chrome o Edge en modo sin ventanas; CHROME_BIN permite indicar su ejecutable.</w:t>
       </w:r>
     </w:p>
     <w:p>
@@ -4414,7 +4540,7 @@
         <w:spacing w:after="100"/>
       </w:pPr>
       <w:r>
-        <w:t>Más adelante se pueden incorporar un backend, autenticación segura, pagos, stock, despacho, respuestas a mensajes y edición completa del catálogo. Esas funciones requieren reglas de negocio y persistencia distintas de la demostración actual.</w:t>
+        <w:t>Una futura tienda comercial necesitará backend, autenticación segura, persistencia centralizada, pagos y despacho reales. El stock, los roles, los mensajes y la edición del catálogo ya forman parte de esta entrega de demostración.</w:t>
       </w:r>
     </w:p>
     <w:p>
@@ -4580,7 +4706,7 @@
         <w:spacing w:after="100"/>
       </w:pPr>
       <w:r>
-        <w:t>El sitio inicial se compone de páginas HTML con CSS y Bootstrap. La aplicación nueva usa React y Vite, con componentes y archivos de estilo propios. Ambas versiones se pueden revisar por separado.</w:t>
+        <w:t>La interfaz utiliza React, Vite, React Router DOM y Bootstrap CSS local. Los componentes reciben datos y callbacks; useTienda coordina las operaciones y almacenamiento.js conserva el estado. Las antiguas direcciones HTML redirigen a la aplicación actual.</w:t>
       </w:r>
     </w:p>
     <w:p>
@@ -4648,7 +4774,7 @@
         <w:spacing w:after="100"/>
       </w:pPr>
       <w:r>
-        <w:t>Los diez requisitos funcionales siguientes describen acciones que una persona puede realizar en la tienda y la forma en que comprobamos cada una.</w:t>
+        <w:t>Los requisitos funcionales siguientes describen acciones de la tienda y sus criterios de comprobación. Los requisitos añadidos para la entrega V2 se detallan en la sección 4.</w:t>
       </w:r>
     </w:p>
     <w:p>
@@ -4903,7 +5029,7 @@
         <w:spacing w:after="100"/>
       </w:pPr>
       <w:r>
-        <w:t>Cada tarjeta del catálogo debe indicar si el producto es café en grano, un método o un accesorio. Actor: Visitante.</w:t>
+        <w:t>La tienda dispone de una vista de categorías y filtros compartibles por URL. Cada producto indica su categoría. Administración puede crear y renombrar categorías; una categoría con productos no se puede eliminar.</w:t>
       </w:r>
     </w:p>
     <w:p>
@@ -4912,7 +5038,7 @@
         <w:spacing w:after="100"/>
       </w:pPr>
       <w:r>
-        <w:t>Lo revisamos así: cada tarjeta muestra si corresponde a café en grano, método o accesorio.</w:t>
+        <w:t>Lo revisamos así: Categorías enlaza al catálogo filtrado; renombrar una categoría actualiza sus productos, sin cambiar el stock ni el historial de pedidos.</w:t>
       </w:r>
     </w:p>
     <w:p>
@@ -4937,7 +5063,7 @@
         <w:spacing w:after="100"/>
       </w:pPr>
       <w:r>
-        <w:t>El panel debe permitir revisar pedidos, usuarios y mensajes, además de crear cuentas con rol comprador o administrador. Actor: Administrador.</w:t>
+        <w:t>El panel permite consultar pedidos y comprobantes, usuarios e historial de compras, mensajes, categorías y reportes, además de mantener el perfil administrativo. El acceso corresponde al administrador; las cuentas públicas de prueba conservan sus roles y credenciales.</w:t>
       </w:r>
     </w:p>
     <w:p>
@@ -4946,7 +5072,7 @@
         <w:spacing w:after="100"/>
       </w:pPr>
       <w:r>
-        <w:t>Lo revisamos así: al entrar como administrador aparecen los listados y una cuenta nueva se incorpora al listado sin recargar.</w:t>
+        <w:t>Lo revisamos así: las secciones muestran datos locales; el administrador puede crear usuarios, editar datos de cuentas ordinarias, gestionar categorías y abrir un comprobante. Compradores y vendedores no acceden a esas rutas.</w:t>
       </w:r>
     </w:p>
     <w:p>
@@ -4969,7 +5095,7 @@
         <w:spacing w:after="100"/>
       </w:pPr>
       <w:r>
-        <w:t>El administrador debe poder agregar un producto con nombre, categoría, descripción, detalle, precio e imagen opcional, y quitar los productos creados en esta versión. Actor: Administrador.</w:t>
+        <w:t>El administrador puede crear, consultar, editar y eliminar productos del catálogo, incluidos los iniciales. Mantiene nombre, categoría, descripción, detalle, precio, stock, umbral crítico e imagen opcional. Un precio anterior mayor al vigente activa una oferta; dejarlo vacío la retira.</w:t>
       </w:r>
     </w:p>
     <w:p>
@@ -5294,7 +5420,7 @@
         <w:spacing w:after="100"/>
       </w:pPr>
       <w:r>
-        <w:t>Entregamos el sitio inicial y la aplicación React como etapas del mismo proyecto. Esta ERS se actualiza para describir las funciones que ya podemos probar en el navegador.</w:t>
+        <w:t>La entrega contiene una única aplicación React, la ERS V2, la planilla de requerimientos actualizada y el documento de cobertura del testing. El código y los documentos se conservan en la rama probando-diseno-nuevo del repositorio PelaoKratos/Grano-FullStack2.</w:t>
       </w:r>
     </w:p>
     <w:p>
@@ -5313,6 +5439,281 @@
       </w:pPr>
       <w:r>
         <w:t>Cuando pasemos a una tienda con datos compartidos entre usuarios, tendremos que reemplazar el almacenamiento local y definir las reglas de compra, pago y despacho.</w:t>
+      </w:r>
+    </w:p>
+    <w:p>
+      <w:r>
+        <w:br w:type="page"/>
+      </w:r>
+    </w:p>
+    <w:p>
+      <w:pPr>
+        <w:pStyle w:val="Ttulo1"/>
+      </w:pPr>
+      <w:bookmarkStart w:id="30" w:name="_GranoRequisitosV2"/>
+      <w:r>
+        <w:rPr>
+          <w:rFonts w:ascii="Calibri" w:hAnsi="Calibri"/>
+          <w:b/>
+          <w:sz w:val="26"/>
+        </w:rPr>
+        <w:t>4 Requisitos incorporados en la entrega V2</w:t>
+      </w:r>
+      <w:bookmarkEnd w:id="30"/>
+    </w:p>
+    <w:p>
+      <w:pPr>
+        <w:keepNext/>
+      </w:pPr>
+      <w:r>
+        <w:rPr>
+          <w:rFonts w:ascii="Calibri" w:hAnsi="Calibri"/>
+          <w:b/>
+          <w:sz w:val="22"/>
+        </w:rPr>
+        <w:t>RF-11 Actualizar datos del comprador</w:t>
+      </w:r>
+    </w:p>
+    <w:p>
+      <w:r>
+        <w:t>Guardar nombre, teléfono, dirección, comuna y región desde Mi cuenta. Actor: Comprador.</w:t>
+      </w:r>
+    </w:p>
+    <w:p>
+      <w:r>
+        <w:t>Criterio de aceptación: Checkout precarga esos datos y permite modificarlos para el pedido.</w:t>
+      </w:r>
+    </w:p>
+    <w:p>
+      <w:pPr>
+        <w:keepNext/>
+      </w:pPr>
+      <w:r>
+        <w:rPr>
+          <w:rFonts w:ascii="Calibri" w:hAnsi="Calibri"/>
+          <w:b/>
+          <w:sz w:val="22"/>
+        </w:rPr>
+        <w:t>RF-12 Consultar compras e historial</w:t>
+      </w:r>
+    </w:p>
+    <w:p>
+      <w:r>
+        <w:t>Consultar estado, fecha, productos, total y comprobante de pedidos propios. Actor: Comprador.</w:t>
+      </w:r>
+    </w:p>
+    <w:p>
+      <w:r>
+        <w:t>Criterio de aceptación: La URL del comprobante funciona tras recargar y no expone pedidos ajenos.</w:t>
+      </w:r>
+    </w:p>
+    <w:p>
+      <w:pPr>
+        <w:keepNext/>
+      </w:pPr>
+      <w:r>
+        <w:rPr>
+          <w:rFonts w:ascii="Calibri" w:hAnsi="Calibri"/>
+          <w:b/>
+          <w:sz w:val="22"/>
+        </w:rPr>
+        <w:t>RF-13 Gestionar mensajes de contacto</w:t>
+      </w:r>
+    </w:p>
+    <w:p>
+      <w:r>
+        <w:t>Revisar mensajes y cambiar su estado a leído. Actor: Administrador.</w:t>
+      </w:r>
+    </w:p>
+    <w:p>
+      <w:r>
+        <w:t>Criterio de aceptación: El estado persiste y se conserva el texto enviado.</w:t>
+      </w:r>
+    </w:p>
+    <w:p>
+      <w:pPr>
+        <w:keepNext/>
+      </w:pPr>
+      <w:r>
+        <w:rPr>
+          <w:rFonts w:ascii="Calibri" w:hAnsi="Calibri"/>
+          <w:b/>
+          <w:sz w:val="22"/>
+        </w:rPr>
+        <w:t>RF-14 Explorar la historia de Grano</w:t>
+      </w:r>
+    </w:p>
+    <w:p>
+      <w:r>
+        <w:t>Mantener Nosotros con su carrusel y contenido de marca. Actor: Visitante.</w:t>
+      </w:r>
+    </w:p>
+    <w:p>
+      <w:r>
+        <w:t>Criterio de aceptación: Los controles permiten recorrer las imágenes existentes.</w:t>
+      </w:r>
+    </w:p>
+    <w:p>
+      <w:pPr>
+        <w:keepNext/>
+      </w:pPr>
+      <w:r>
+        <w:rPr>
+          <w:rFonts w:ascii="Calibri" w:hAnsi="Calibri"/>
+          <w:b/>
+          <w:sz w:val="22"/>
+        </w:rPr>
+        <w:t>RF-15 Completar checkout</w:t>
+      </w:r>
+    </w:p>
+    <w:p>
+      <w:r>
+        <w:t>Solicitar nombre, correo, teléfono y opción de entrega; precargar el perfil y pedir dirección, comuna y región para envío a domicilio. Actor: Comprador.</w:t>
+      </w:r>
+    </w:p>
+    <w:p>
+      <w:r>
+        <w:t>Criterio de aceptación: No permite confirmar datos incompletos. El retiro permite omitir la dirección.</w:t>
+      </w:r>
+    </w:p>
+    <w:p>
+      <w:pPr>
+        <w:keepNext/>
+      </w:pPr>
+      <w:r>
+        <w:rPr>
+          <w:rFonts w:ascii="Calibri" w:hAnsi="Calibri"/>
+          <w:b/>
+          <w:sz w:val="22"/>
+        </w:rPr>
+        <w:t>RF-16 Mostrar el resultado de la compra</w:t>
+      </w:r>
+    </w:p>
+    <w:p>
+      <w:r>
+        <w:t>Mostrar aprobación o rechazo del pago simulado, resumen del pedido y una opción para continuar o reintentar. Actor: Comprador.</w:t>
+      </w:r>
+    </w:p>
+    <w:p>
+      <w:r>
+        <w:t>Criterio de aceptación: La aprobación descuenta stock, guarda pedido y vacía carrito en una escritura. Un rechazo o fallo de guardado conserva el estado anterior.</w:t>
+      </w:r>
+    </w:p>
+    <w:p>
+      <w:pPr>
+        <w:keepNext/>
+      </w:pPr>
+      <w:r>
+        <w:rPr>
+          <w:rFonts w:ascii="Calibri" w:hAnsi="Calibri"/>
+          <w:b/>
+          <w:sz w:val="22"/>
+        </w:rPr>
+        <w:t>RF-17 Consultar y gestionar ofertas</w:t>
+      </w:r>
+    </w:p>
+    <w:p>
+      <w:r>
+        <w:t>Mostrar productos cuyo precio anterior sea mayor al vigente. Permitir activar y retirar ofertas desde administración. Actor: Visitante y Administrador.</w:t>
+      </w:r>
+    </w:p>
+    <w:p>
+      <w:r>
+        <w:t>Criterio de aceptación: El precio vigente es el utilizado en catálogo, carrito y pedido. Los precios base no se alteran al instalar esta versión.</w:t>
+      </w:r>
+    </w:p>
+    <w:p>
+      <w:pPr>
+        <w:keepNext/>
+      </w:pPr>
+      <w:r>
+        <w:rPr>
+          <w:rFonts w:ascii="Calibri" w:hAnsi="Calibri"/>
+          <w:b/>
+          <w:sz w:val="22"/>
+        </w:rPr>
+        <w:t>RF-18 Mantener categorías</w:t>
+      </w:r>
+    </w:p>
+    <w:p>
+      <w:r>
+        <w:t>Crear y renombrar categorías, y eliminar únicamente las que no tengan productos. Actor: Administrador.</w:t>
+      </w:r>
+    </w:p>
+    <w:p>
+      <w:r>
+        <w:t>Criterio de aceptación: Las categorías y sus productos se conservan al recargar y el catálogo usa sus filtros.</w:t>
+      </w:r>
+    </w:p>
+    <w:p>
+      <w:pPr>
+        <w:keepNext/>
+      </w:pPr>
+      <w:r>
+        <w:rPr>
+          <w:rFonts w:ascii="Calibri" w:hAnsi="Calibri"/>
+          <w:b/>
+          <w:sz w:val="22"/>
+        </w:rPr>
+        <w:t>RF-19 Consultar reportes y comprobantes</w:t>
+      </w:r>
+    </w:p>
+    <w:p>
+      <w:r>
+        <w:t>Mostrar cantidad e importe de pedidos, unidades vendidas, estados y stock crítico. Abrir detalle de cada pedido e historial por usuario. Actor: Administrador.</w:t>
+      </w:r>
+    </w:p>
+    <w:p>
+      <w:r>
+        <w:t>Criterio de aceptación: Los reportes usan los precios históricos del pedido; el comprobante identifica que es una demostración sin validez tributaria.</w:t>
+      </w:r>
+    </w:p>
+    <w:p>
+      <w:pPr>
+        <w:keepNext/>
+      </w:pPr>
+      <w:r>
+        <w:rPr>
+          <w:rFonts w:ascii="Calibri" w:hAnsi="Calibri"/>
+          <w:b/>
+          <w:sz w:val="22"/>
+        </w:rPr>
+        <w:t>RF-20 Consultar historias del café</w:t>
+      </w:r>
+    </w:p>
+    <w:p>
+      <w:r>
+        <w:t>Mostrar un listado de artículos y una vista de detalle por dirección. Actor: Visitante.</w:t>
+      </w:r>
+    </w:p>
+    <w:p>
+      <w:r>
+        <w:t>Criterio de aceptación: Los enlaces abren el artículo correcto y un identificador ausente muestra una alternativa para volver.</w:t>
+      </w:r>
+    </w:p>
+    <w:p>
+      <w:pPr>
+        <w:pStyle w:val="Ttulo1"/>
+      </w:pPr>
+      <w:bookmarkStart w:id="31" w:name="_GranoVerificacionV2"/>
+      <w:r>
+        <w:rPr>
+          <w:rFonts w:ascii="Calibri" w:hAnsi="Calibri"/>
+          <w:b/>
+          <w:sz w:val="26"/>
+        </w:rPr>
+        <w:t>5 Verificación de la entrega</w:t>
+      </w:r>
+      <w:bookmarkEnd w:id="31"/>
+    </w:p>
+    <w:p>
+      <w:r>
+        <w:t>La suite reúne 40 pruebas de lógica, persistencia y rutas con node:test y 17 pruebas de componentes con Jasmine y Karma, ejecutadas en Chrome Headless. Los casos cubren renderizado, props, estado, eventos, checkout y fallos de persistencia. El documento de cobertura detalla el alcance y las limitaciones; no se declara cobertura total de líneas.</w:t>
+      </w:r>
+    </w:p>
+    <w:p>
+      <w:r>
+        <w:t>Comandos: pnpm test; pnpm build; pnpm format:check. La clave de almacenamiento continúa siendo grano-tienda-react-v1, esquema 2. Las categorías y la entrega son campos compatibles adicionales y no borran pedidos, usuarios, fotos propias ni datos migrados.</w:t>
       </w:r>
     </w:p>
     <w:sectPr>
@@ -7024,7 +7425,7 @@
       <w:rFonts w:asciiTheme="majorHAnsi" w:eastAsiaTheme="majorEastAsia" w:hAnsiTheme="majorHAnsi" w:cstheme="majorBidi"/>
       <w:b/>
       <w:bCs/>
-      <w:color w:val="365F91" w:themeColor="accent1" w:themeShade="BF"/>
+      <w:color w:val="000000"/>
       <w:sz w:val="28"/>
       <w:szCs w:val="28"/>
     </w:rPr>
@@ -7047,7 +7448,7 @@
       <w:rFonts w:asciiTheme="majorHAnsi" w:eastAsiaTheme="majorEastAsia" w:hAnsiTheme="majorHAnsi" w:cstheme="majorBidi"/>
       <w:b/>
       <w:bCs/>
-      <w:color w:val="4F81BD" w:themeColor="accent1"/>
+      <w:color w:val="000000"/>
       <w:sz w:val="26"/>
       <w:szCs w:val="26"/>
     </w:rPr>
@@ -7073,7 +7474,7 @@
       <w:rFonts w:asciiTheme="majorHAnsi" w:eastAsia="Times New Roman" w:hAnsiTheme="majorHAnsi" w:cs="Arial"/>
       <w:b/>
       <w:bCs/>
-      <w:color w:val="548DD4" w:themeColor="text2" w:themeTint="99"/>
+      <w:color w:val="000000"/>
       <w:sz w:val="26"/>
       <w:szCs w:val="26"/>
     </w:rPr>
@@ -7510,6 +7911,9 @@
   </w:style>
   <w:style w:type="paragraph" w:styleId="Ttulo">
     <w:name w:val="Title"/>
+    <w:rPr>
+      <w:color w:val="000000"/>
+    </w:rPr>
   </w:style>
 </w:styles>
 </file>

</xml_diff>